<commit_message>
Deploying to gh-pages from @ Morrison-Lab/wai@792735de4f6127fd93faaa6478f9edee66ca4202 🚀
</commit_message>
<xml_diff>
--- a/chapters/agent-customization.docx
+++ b/chapters/agent-customization.docx
@@ -15,7 +15,7 @@
         <w:pStyle w:val="Date"/>
       </w:pPr>
       <w:r>
-        <w:t xml:space="preserve">Last modified: 2026-10-03 11:30:33 (PDT)</w:t>
+        <w:t xml:space="preserve">Last modified: 2026-10-03 15:28:00 (PDT)</w:t>
       </w:r>
     </w:p>
     <w:p>
@@ -29609,7 +29609,7 @@
         <w:t xml:space="preserve"> </w:t>
       </w:r>
       <w:r>
-        <w:t xml:space="preserve">(Anthropic 2026d)</w:t>
+        <w:t xml:space="preserve">(Anthropic 2026e)</w:t>
       </w:r>
       <w:r>
         <w:t xml:space="preserve">:</w:t>
@@ -30527,7 +30527,7 @@
         <w:t xml:space="preserve"> </w:t>
       </w:r>
       <w:r>
-        <w:t xml:space="preserve">(Anthropic 2026d)</w:t>
+        <w:t xml:space="preserve">(Anthropic 2026e)</w:t>
       </w:r>
       <w:r>
         <w:t xml:space="preserve">.</w:t>
@@ -31781,7 +31781,7 @@
         <w:t xml:space="preserve"> </w:t>
       </w:r>
       <w:r>
-        <w:t xml:space="preserve">(Anthropic 2026d)</w:t>
+        <w:t xml:space="preserve">(Anthropic 2026e)</w:t>
       </w:r>
       <w:r>
         <w:t xml:space="preserve">.</w:t>
@@ -33243,7 +33243,7 @@
         <w:t xml:space="preserve"> </w:t>
       </w:r>
       <w:r>
-        <w:t xml:space="preserve">(Anthropic 2026e; Huntley 2025)</w:t>
+        <w:t xml:space="preserve">(Anthropic 2026f; Huntley 2025)</w:t>
       </w:r>
       <w:r>
         <w:t xml:space="preserve">.</w:t>
@@ -33519,7 +33519,7 @@
         <w:t xml:space="preserve"> </w:t>
       </w:r>
       <w:r>
-        <w:t xml:space="preserve">(Anthropic 2026e)</w:t>
+        <w:t xml:space="preserve">(Anthropic 2026f)</w:t>
       </w:r>
       <w:r>
         <w:t xml:space="preserve">.</w:t>
@@ -42137,7 +42137,7 @@
     </w:p>
     <w:bookmarkEnd w:id="250"/>
     <w:bookmarkEnd w:id="251"/>
-    <w:bookmarkStart w:id="258" w:name="sec-ai-claude-cloud-env"/>
+    <w:bookmarkStart w:id="263" w:name="sec-ai-claude-cloud-env"/>
     <w:p>
       <w:pPr>
         <w:pStyle w:val="Heading1"/>
@@ -42377,7 +42377,7 @@
         <w:t xml:space="preserve">for example to install dependencies.</w:t>
       </w:r>
     </w:p>
-    <w:bookmarkStart w:id="257" w:name="X99b85cd9c84d17a9c31061ff898ea0b26b46932"/>
+    <w:bookmarkStart w:id="253" w:name="X99b85cd9c84d17a9c31061ff898ea0b26b46932"/>
     <w:p>
       <w:pPr>
         <w:pStyle w:val="Heading4"/>
@@ -42590,6 +42590,871 @@
       </w:r>
       <w:r>
         <w:t xml:space="preserve">terminal session.</w:t>
+      </w:r>
+    </w:p>
+    <w:bookmarkEnd w:id="253"/>
+    <w:bookmarkStart w:id="262" w:name="sec-claude-network-access"/>
+    <w:p>
+      <w:pPr>
+        <w:pStyle w:val="Heading4"/>
+      </w:pPr>
+      <w:r>
+        <w:t xml:space="preserve">Configuring network access for Claude cloud sessions</w:t>
+      </w:r>
+    </w:p>
+    <w:p>
+      <w:pPr>
+        <w:pStyle w:val="FirstParagraph"/>
+      </w:pPr>
+      <w:r>
+        <w:t xml:space="preserve">To let a cloud session reach hosts outside the default</w:t>
+      </w:r>
+      <w:r>
+        <w:t xml:space="preserve"> </w:t>
+      </w:r>
+      <w:r>
+        <w:rPr>
+          <w:b/>
+          <w:bCs/>
+        </w:rPr>
+        <w:t xml:space="preserve">Trusted</w:t>
+      </w:r>
+      <w:r>
+        <w:t xml:space="preserve"> </w:t>
+      </w:r>
+      <w:r>
+        <w:t xml:space="preserve">list,</w:t>
+      </w:r>
+      <w:r>
+        <w:t xml:space="preserve"> </w:t>
+      </w:r>
+      <w:r>
+        <w:t xml:space="preserve">edit its environment</w:t>
+      </w:r>
+      <w:r>
+        <w:t xml:space="preserve"> </w:t>
+      </w:r>
+      <w:r>
+        <w:t xml:space="preserve">(Anthropic 2026d)</w:t>
+      </w:r>
+      <w:r>
+        <w:t xml:space="preserve">:</w:t>
+      </w:r>
+    </w:p>
+    <w:p>
+      <w:pPr>
+        <w:pStyle w:val="Compact"/>
+        <w:numPr>
+          <w:ilvl w:val="0"/>
+          <w:numId w:val="1097"/>
+        </w:numPr>
+      </w:pPr>
+      <w:r>
+        <w:t xml:space="preserve">Open the environment selector,</w:t>
+      </w:r>
+      <w:r>
+        <w:t xml:space="preserve"> </w:t>
+      </w:r>
+      <w:r>
+        <w:t xml:space="preserve">at</w:t>
+      </w:r>
+      <w:r>
+        <w:t xml:space="preserve"> </w:t>
+      </w:r>
+      <w:hyperlink r:id="rId252">
+        <w:r>
+          <w:rPr>
+            <w:rStyle w:val="Hyperlink"/>
+          </w:rPr>
+          <w:t xml:space="preserve">claude.ai/code</w:t>
+        </w:r>
+      </w:hyperlink>
+      <w:r>
+        <w:t xml:space="preserve"> </w:t>
+      </w:r>
+      <w:r>
+        <w:t xml:space="preserve">or from the prompt box in the Desktop app,</w:t>
+      </w:r>
+      <w:r>
+        <w:t xml:space="preserve"> </w:t>
+      </w:r>
+      <w:r>
+        <w:t xml:space="preserve">and select</w:t>
+      </w:r>
+      <w:r>
+        <w:t xml:space="preserve"> </w:t>
+      </w:r>
+      <w:r>
+        <w:rPr>
+          <w:b/>
+          <w:bCs/>
+        </w:rPr>
+        <w:t xml:space="preserve">Cloud</w:t>
+      </w:r>
+      <w:r>
+        <w:t xml:space="preserve">.</w:t>
+      </w:r>
+    </w:p>
+    <w:p>
+      <w:pPr>
+        <w:pStyle w:val="Compact"/>
+        <w:numPr>
+          <w:ilvl w:val="0"/>
+          <w:numId w:val="1097"/>
+        </w:numPr>
+      </w:pPr>
+      <w:r>
+        <w:t xml:space="preserve">Hover over the environment</w:t>
+      </w:r>
+      <w:r>
+        <w:t xml:space="preserve"> </w:t>
+      </w:r>
+      <w:r>
+        <w:t xml:space="preserve">and select the settings icon on the right.</w:t>
+      </w:r>
+    </w:p>
+    <w:p>
+      <w:pPr>
+        <w:pStyle w:val="Compact"/>
+        <w:numPr>
+          <w:ilvl w:val="0"/>
+          <w:numId w:val="1097"/>
+        </w:numPr>
+      </w:pPr>
+      <w:r>
+        <w:t xml:space="preserve">Set</w:t>
+      </w:r>
+      <w:r>
+        <w:t xml:space="preserve"> </w:t>
+      </w:r>
+      <w:r>
+        <w:rPr>
+          <w:b/>
+          <w:bCs/>
+        </w:rPr>
+        <w:t xml:space="preserve">Network access</w:t>
+      </w:r>
+      <w:r>
+        <w:t xml:space="preserve"> </w:t>
+      </w:r>
+      <w:r>
+        <w:t xml:space="preserve">to</w:t>
+      </w:r>
+      <w:r>
+        <w:t xml:space="preserve"> </w:t>
+      </w:r>
+      <w:r>
+        <w:rPr>
+          <w:b/>
+          <w:bCs/>
+        </w:rPr>
+        <w:t xml:space="preserve">Custom</w:t>
+      </w:r>
+      <w:r>
+        <w:t xml:space="preserve">.</w:t>
+      </w:r>
+    </w:p>
+    <w:p>
+      <w:pPr>
+        <w:pStyle w:val="Compact"/>
+        <w:numPr>
+          <w:ilvl w:val="0"/>
+          <w:numId w:val="1097"/>
+        </w:numPr>
+      </w:pPr>
+      <w:r>
+        <w:t xml:space="preserve">Paste the hosts into</w:t>
+      </w:r>
+      <w:r>
+        <w:t xml:space="preserve"> </w:t>
+      </w:r>
+      <w:r>
+        <w:rPr>
+          <w:b/>
+          <w:bCs/>
+        </w:rPr>
+        <w:t xml:space="preserve">Allowed domains</w:t>
+      </w:r>
+      <w:r>
+        <w:t xml:space="preserve">,</w:t>
+      </w:r>
+      <w:r>
+        <w:t xml:space="preserve"> </w:t>
+      </w:r>
+      <w:r>
+        <w:t xml:space="preserve">one per line.</w:t>
+      </w:r>
+    </w:p>
+    <w:p>
+      <w:pPr>
+        <w:pStyle w:val="Compact"/>
+        <w:numPr>
+          <w:ilvl w:val="0"/>
+          <w:numId w:val="1097"/>
+        </w:numPr>
+      </w:pPr>
+      <w:r>
+        <w:t xml:space="preserve">Check</w:t>
+      </w:r>
+      <w:r>
+        <w:t xml:space="preserve"> </w:t>
+      </w:r>
+      <w:r>
+        <w:rPr>
+          <w:b/>
+          <w:bCs/>
+        </w:rPr>
+        <w:t xml:space="preserve">Also include default list of common package managers</w:t>
+      </w:r>
+      <w:r>
+        <w:t xml:space="preserve">,</w:t>
+      </w:r>
+      <w:r>
+        <w:t xml:space="preserve"> </w:t>
+      </w:r>
+      <w:r>
+        <w:t xml:space="preserve">to keep Anthropic’s default registries, such as PyPI.</w:t>
+      </w:r>
+      <w:r>
+        <w:t xml:space="preserve"> </w:t>
+      </w:r>
+      <w:r>
+        <w:t xml:space="preserve">R repositories such as CRAN come from the lab’s list itself.</w:t>
+      </w:r>
+    </w:p>
+    <w:p>
+      <w:pPr>
+        <w:pStyle w:val="FirstParagraph"/>
+      </w:pPr>
+      <w:r>
+        <w:t xml:space="preserve">Sessions already running in the environment</w:t>
+      </w:r>
+      <w:r>
+        <w:t xml:space="preserve"> </w:t>
+      </w:r>
+      <w:r>
+        <w:t xml:space="preserve">pick up the new list within about a minute.</w:t>
+      </w:r>
+      <w:r>
+        <w:t xml:space="preserve"> </w:t>
+      </w:r>
+      <w:r>
+        <w:t xml:space="preserve">Git operations and GitHub API requests</w:t>
+      </w:r>
+      <w:r>
+        <w:t xml:space="preserve"> </w:t>
+      </w:r>
+      <w:r>
+        <w:t xml:space="preserve">go through a separate GitHub proxy</w:t>
+      </w:r>
+      <w:r>
+        <w:t xml:space="preserve"> </w:t>
+      </w:r>
+      <w:r>
+        <w:t xml:space="preserve">and do not depend on this list,</w:t>
+      </w:r>
+      <w:r>
+        <w:t xml:space="preserve"> </w:t>
+      </w:r>
+      <w:r>
+        <w:t xml:space="preserve">but committed files fetched from</w:t>
+      </w:r>
+      <w:r>
+        <w:t xml:space="preserve"> </w:t>
+      </w:r>
+      <w:r>
+        <w:rPr>
+          <w:rStyle w:val="VerbatimChar"/>
+        </w:rPr>
+        <w:t xml:space="preserve">raw.githubusercontent.com</w:t>
+      </w:r>
+      <w:r>
+        <w:t xml:space="preserve"> </w:t>
+      </w:r>
+      <w:r>
+        <w:t xml:space="preserve">do depend on it</w:t>
+      </w:r>
+      <w:r>
+        <w:t xml:space="preserve"> </w:t>
+      </w:r>
+      <w:r>
+        <w:t xml:space="preserve">(Anthropic 2026d)</w:t>
+      </w:r>
+      <w:r>
+        <w:t xml:space="preserve">.</w:t>
+      </w:r>
+    </w:p>
+    <w:p>
+      <w:pPr>
+        <w:pStyle w:val="BodyText"/>
+      </w:pPr>
+      <w:r>
+        <w:t xml:space="preserve">These steps apply to environments you created yourself.</w:t>
+      </w:r>
+      <w:r>
+        <w:t xml:space="preserve"> </w:t>
+      </w:r>
+      <w:r>
+        <w:t xml:space="preserve">An organization-shared environment opens read-only in the selector;</w:t>
+      </w:r>
+      <w:r>
+        <w:t xml:space="preserve"> </w:t>
+      </w:r>
+      <w:r>
+        <w:t xml:space="preserve">only an organization Owner can change its network access,</w:t>
+      </w:r>
+      <w:r>
+        <w:t xml:space="preserve"> </w:t>
+      </w:r>
+      <w:r>
+        <w:t xml:space="preserve">from the</w:t>
+      </w:r>
+      <w:r>
+        <w:t xml:space="preserve"> </w:t>
+      </w:r>
+      <w:r>
+        <w:rPr>
+          <w:b/>
+          <w:bCs/>
+        </w:rPr>
+        <w:t xml:space="preserve">Cloud environments</w:t>
+      </w:r>
+      <w:r>
+        <w:t xml:space="preserve"> </w:t>
+      </w:r>
+      <w:r>
+        <w:t xml:space="preserve">page in admin settings.</w:t>
+      </w:r>
+      <w:r>
+        <w:t xml:space="preserve"> </w:t>
+      </w:r>
+      <w:r>
+        <w:t xml:space="preserve">Each environment keeps its own list,</w:t>
+      </w:r>
+      <w:r>
+        <w:t xml:space="preserve"> </w:t>
+      </w:r>
+      <w:r>
+        <w:t xml:space="preserve">so to give the whole lab one standard list,</w:t>
+      </w:r>
+      <w:r>
+        <w:t xml:space="preserve"> </w:t>
+      </w:r>
+      <w:r>
+        <w:t xml:space="preserve">an Owner can create a shared environment</w:t>
+      </w:r>
+      <w:r>
+        <w:t xml:space="preserve"> </w:t>
+      </w:r>
+      <w:r>
+        <w:t xml:space="preserve">with</w:t>
+      </w:r>
+      <w:r>
+        <w:t xml:space="preserve"> </w:t>
+      </w:r>
+      <w:r>
+        <w:rPr>
+          <w:b/>
+          <w:bCs/>
+        </w:rPr>
+        <w:t xml:space="preserve">Custom</w:t>
+      </w:r>
+      <w:r>
+        <w:t xml:space="preserve"> </w:t>
+      </w:r>
+      <w:r>
+        <w:t xml:space="preserve">access and that list</w:t>
+      </w:r>
+      <w:r>
+        <w:t xml:space="preserve"> </w:t>
+      </w:r>
+      <w:r>
+        <w:t xml:space="preserve">(Anthropic 2026d)</w:t>
+      </w:r>
+      <w:r>
+        <w:t xml:space="preserve">.</w:t>
+      </w:r>
+    </w:p>
+    <w:p>
+      <w:pPr>
+        <w:pStyle w:val="BodyText"/>
+      </w:pPr>
+      <w:r>
+        <w:t xml:space="preserve">The lab’s list lives in</w:t>
+      </w:r>
+      <w:r>
+        <w:t xml:space="preserve"> </w:t>
+      </w:r>
+      <w:hyperlink r:id="rId254">
+        <w:r>
+          <w:rPr>
+            <w:rStyle w:val="VerbatimChar"/>
+          </w:rPr>
+          <w:t xml:space="preserve">claude-allowlist.txt</w:t>
+        </w:r>
+      </w:hyperlink>
+      <w:r>
+        <w:t xml:space="preserve"> </w:t>
+      </w:r>
+      <w:r>
+        <w:t xml:space="preserve">in</w:t>
+      </w:r>
+      <w:r>
+        <w:t xml:space="preserve"> </w:t>
+      </w:r>
+      <w:hyperlink r:id="rId255">
+        <w:r>
+          <w:rPr>
+            <w:rStyle w:val="Hyperlink"/>
+          </w:rPr>
+          <w:t xml:space="preserve">Morrison-Lab/stats-allowlist</w:t>
+        </w:r>
+      </w:hyperlink>
+      <w:r>
+        <w:t xml:space="preserve"> </w:t>
+      </w:r>
+      <w:r>
+        <w:t xml:space="preserve">(Morrison Lab 2026d)</w:t>
+      </w:r>
+      <w:r>
+        <w:t xml:space="preserve">.</w:t>
+      </w:r>
+      <w:r>
+        <w:t xml:space="preserve"> </w:t>
+      </w:r>
+      <w:r>
+        <w:t xml:space="preserve">Editing that file does not change any environment by itself:</w:t>
+      </w:r>
+      <w:r>
+        <w:t xml:space="preserve"> </w:t>
+      </w:r>
+      <w:r>
+        <w:t xml:space="preserve">after the file changes,</w:t>
+      </w:r>
+      <w:r>
+        <w:t xml:space="preserve"> </w:t>
+      </w:r>
+      <w:r>
+        <w:t xml:space="preserve">paste the updated list into each environment that uses it.</w:t>
+      </w:r>
+    </w:p>
+    <w:p>
+      <w:pPr>
+        <w:pStyle w:val="BodyText"/>
+      </w:pPr>
+      <w:r>
+        <w:t xml:space="preserve">A leading</w:t>
+      </w:r>
+      <w:r>
+        <w:t xml:space="preserve"> </w:t>
+      </w:r>
+      <w:r>
+        <w:rPr>
+          <w:rStyle w:val="VerbatimChar"/>
+        </w:rPr>
+        <w:t xml:space="preserve">*.</w:t>
+      </w:r>
+      <w:r>
+        <w:t xml:space="preserve"> </w:t>
+      </w:r>
+      <w:r>
+        <w:t xml:space="preserve">matches subdomains only:</w:t>
+      </w:r>
+    </w:p>
+    <w:p>
+      <w:pPr>
+        <w:pStyle w:val="Compact"/>
+        <w:numPr>
+          <w:ilvl w:val="0"/>
+          <w:numId w:val="1098"/>
+        </w:numPr>
+      </w:pPr>
+      <w:r>
+        <w:rPr>
+          <w:rStyle w:val="VerbatimChar"/>
+        </w:rPr>
+        <w:t xml:space="preserve">*.example.org</w:t>
+      </w:r>
+      <w:r>
+        <w:t xml:space="preserve"> </w:t>
+      </w:r>
+      <w:r>
+        <w:t xml:space="preserve">matches</w:t>
+      </w:r>
+      <w:r>
+        <w:t xml:space="preserve"> </w:t>
+      </w:r>
+      <w:r>
+        <w:rPr>
+          <w:rStyle w:val="VerbatimChar"/>
+        </w:rPr>
+        <w:t xml:space="preserve">docs.example.org</w:t>
+      </w:r>
+      <w:r>
+        <w:t xml:space="preserve"> </w:t>
+      </w:r>
+      <w:r>
+        <w:t xml:space="preserve">but not</w:t>
+      </w:r>
+      <w:r>
+        <w:t xml:space="preserve"> </w:t>
+      </w:r>
+      <w:r>
+        <w:rPr>
+          <w:rStyle w:val="VerbatimChar"/>
+        </w:rPr>
+        <w:t xml:space="preserve">example.org</w:t>
+      </w:r>
+      <w:r>
+        <w:t xml:space="preserve">,</w:t>
+      </w:r>
+      <w:r>
+        <w:t xml:space="preserve"> </w:t>
+      </w:r>
+      <w:r>
+        <w:t xml:space="preserve">so a site often needs both entries</w:t>
+      </w:r>
+      <w:r>
+        <w:t xml:space="preserve"> </w:t>
+      </w:r>
+      <w:r>
+        <w:t xml:space="preserve">(Morrison Lab 2026d)</w:t>
+      </w:r>
+      <w:r>
+        <w:t xml:space="preserve">.</w:t>
+      </w:r>
+    </w:p>
+    <w:p>
+      <w:pPr>
+        <w:pStyle w:val="Compact"/>
+        <w:numPr>
+          <w:ilvl w:val="0"/>
+          <w:numId w:val="1098"/>
+        </w:numPr>
+      </w:pPr>
+      <w:r>
+        <w:t xml:space="preserve">A host already matched by a wildcard,</w:t>
+      </w:r>
+      <w:r>
+        <w:t xml:space="preserve"> </w:t>
+      </w:r>
+      <w:r>
+        <w:t xml:space="preserve">such as</w:t>
+      </w:r>
+      <w:r>
+        <w:t xml:space="preserve"> </w:t>
+      </w:r>
+      <w:r>
+        <w:rPr>
+          <w:rStyle w:val="VerbatimChar"/>
+        </w:rPr>
+        <w:t xml:space="preserve">cloud.r-project.org</w:t>
+      </w:r>
+      <w:r>
+        <w:t xml:space="preserve"> </w:t>
+      </w:r>
+      <w:r>
+        <w:t xml:space="preserve">under</w:t>
+      </w:r>
+      <w:r>
+        <w:t xml:space="preserve"> </w:t>
+      </w:r>
+      <w:r>
+        <w:rPr>
+          <w:rStyle w:val="VerbatimChar"/>
+        </w:rPr>
+        <w:t xml:space="preserve">*.r-project.org</w:t>
+      </w:r>
+      <w:r>
+        <w:t xml:space="preserve">,</w:t>
+      </w:r>
+      <w:r>
+        <w:t xml:space="preserve"> </w:t>
+      </w:r>
+      <w:r>
+        <w:t xml:space="preserve">needs no line of its own.</w:t>
+      </w:r>
+    </w:p>
+    <w:tbl>
+      <w:tblPr>
+        <w:tblStyle w:val="Table"/>
+        <w:tblLook w:firstRow="0" w:lastRow="0" w:firstColumn="0" w:lastColumn="0" w:noHBand="0" w:noVBand="0" w:val="0000"/>
+        <w:tblBorders>
+          <w:top w:val="single" w:sz="4" w:space="0" w:color="EB9113"/>
+          <w:left w:val="single" w:sz="24" w:space="0" w:color="EB9113"/>
+          <w:bottom w:val="single" w:sz="4" w:space="0" w:color="EB9113"/>
+          <w:right w:val="single" w:sz="4" w:space="0" w:color="EB9113"/>
+        </w:tblBorders>
+        <w:tblCellMar>
+          <w:left w:w="144" w:type="dxa"/>
+          <w:right w:w="144" w:type="dxa"/>
+        </w:tblCellMar>
+        <w:tblLook w:firstRow="0" w:lastRow="0" w:firstColumn="0" w:lastColumn="0" w:noHBand="0" w:noVBand="0" w:val="0000"/>
+      </w:tblPr>
+      <w:tr>
+        <w:trPr>
+          <w:cantSplit/>
+        </w:trPr>
+        <w:tc>
+          <w:tcPr>
+            <w:shd w:color="auto" w:fill="fcefdc" w:val="clear"/>
+            <w:tcMar>
+              <w:top w:w="92" w:type="dxa"/>
+              <w:bottom w:w="92" w:type="dxa"/>
+            </w:tcMar>
+          </w:tcPr>
+          <w:p>
+            <w:pPr>
+              <w:pStyle w:val="FirstParagraph"/>
+            </w:pPr>
+            <w:pPr>
+              <w:spacing w:before="0" w:after="0"/>
+              <w:textAlignment w:val="center"/>
+            </w:pPr>
+            <w:r>
+              <w:drawing>
+                <wp:inline>
+                  <wp:extent cx="152400" cy="152400"/>
+                  <wp:effectExtent b="0" l="0" r="0" t="0"/>
+                  <wp:docPr descr="" title="" id="256" name="Picture"/>
+                  <a:graphic>
+                    <a:graphicData uri="http://schemas.openxmlformats.org/drawingml/2006/picture">
+                      <pic:pic>
+                        <pic:nvPicPr>
+                          <pic:cNvPr descr="/opt/quarto/share/formats/docx/warning.png" id="257" name="Picture"/>
+                          <pic:cNvPicPr>
+                            <a:picLocks noChangeArrowheads="1" noChangeAspect="1"/>
+                          </pic:cNvPicPr>
+                        </pic:nvPicPr>
+                        <pic:blipFill>
+                          <a:blip r:embed="rId78"/>
+                          <a:stretch>
+                            <a:fillRect/>
+                          </a:stretch>
+                        </pic:blipFill>
+                        <pic:spPr bwMode="auto">
+                          <a:xfrm>
+                            <a:off x="0" y="0"/>
+                            <a:ext cx="152400" cy="152400"/>
+                          </a:xfrm>
+                          <a:prstGeom prst="rect">
+                            <a:avLst/>
+                          </a:prstGeom>
+                          <a:noFill/>
+                          <a:ln w="9525">
+                            <a:noFill/>
+                            <a:headEnd/>
+                            <a:tailEnd/>
+                          </a:ln>
+                        </pic:spPr>
+                      </pic:pic>
+                    </a:graphicData>
+                  </a:graphic>
+                </wp:inline>
+              </w:drawing>
+            </w:r>
+            <w:r>
+              <w:t xml:space="preserve"> </w:t>
+            </w:r>
+            <w:r>
+              <w:t xml:space="preserve"> </w:t>
+            </w:r>
+            <w:r>
+              <w:t xml:space="preserve">Choosing hosts to allow</w:t>
+            </w:r>
+          </w:p>
+        </w:tc>
+      </w:tr>
+      <w:tr>
+        <w:trPr>
+          <w:cantSplit/>
+        </w:trPr>
+        <w:tc>
+          <w:tcPr>
+            <w:tcMar>
+              <w:top w:w="108" w:type="dxa"/>
+              <w:bottom w:w="108" w:type="dxa"/>
+            </w:tcMar>
+          </w:tcPr>
+          <w:p>
+            <w:pPr>
+              <w:pStyle w:val="BodyText"/>
+            </w:pPr>
+            <w:pPr>
+              <w:spacing w:before="16"/>
+            </w:pPr>
+            <w:r>
+              <w:t xml:space="preserve">Every allowed host is a place the agent can send data to,</w:t>
+            </w:r>
+            <w:r>
+              <w:t xml:space="preserve"> </w:t>
+            </w:r>
+            <w:r>
+              <w:t xml:space="preserve">or read instructions from</w:t>
+            </w:r>
+            <w:r>
+              <w:t xml:space="preserve"> </w:t>
+            </w:r>
+            <w:r>
+              <w:t xml:space="preserve">(Morrison Lab 2026c)</w:t>
+            </w:r>
+            <w:r>
+              <w:t xml:space="preserve">.</w:t>
+            </w:r>
+            <w:r>
+              <w:t xml:space="preserve"> </w:t>
+            </w:r>
+            <w:r>
+              <w:t xml:space="preserve">Prefer documentation, package registries, and publishers.</w:t>
+            </w:r>
+            <w:r>
+              <w:t xml:space="preserve"> </w:t>
+            </w:r>
+            <w:r>
+              <w:t xml:space="preserve">Leave out:</w:t>
+            </w:r>
+          </w:p>
+          <w:p>
+            <w:pPr>
+              <w:pStyle w:val="Compact"/>
+              <w:numPr>
+                <w:ilvl w:val="0"/>
+                <w:numId w:val="1099"/>
+              </w:numPr>
+            </w:pPr>
+            <w:r>
+              <w:t xml:space="preserve">Sites that accept anonymous writes,</w:t>
+            </w:r>
+            <w:r>
+              <w:t xml:space="preserve"> </w:t>
+            </w:r>
+            <w:r>
+              <w:t xml:space="preserve">such as Google Forms (</w:t>
+            </w:r>
+            <w:r>
+              <w:rPr>
+                <w:rStyle w:val="VerbatimChar"/>
+              </w:rPr>
+              <w:t xml:space="preserve">docs.google.com</w:t>
+            </w:r>
+            <w:r>
+              <w:t xml:space="preserve">,</w:t>
+            </w:r>
+            <w:r>
+              <w:t xml:space="preserve"> </w:t>
+            </w:r>
+            <w:r>
+              <w:rPr>
+                <w:rStyle w:val="VerbatimChar"/>
+              </w:rPr>
+              <w:t xml:space="preserve">forms.gle</w:t>
+            </w:r>
+            <w:r>
+              <w:t xml:space="preserve">),</w:t>
+            </w:r>
+            <w:r>
+              <w:t xml:space="preserve"> </w:t>
+            </w:r>
+            <w:r>
+              <w:t xml:space="preserve">which an agent could be steered into using to send repository contents out.</w:t>
+            </w:r>
+          </w:p>
+          <w:p>
+            <w:pPr>
+              <w:pStyle w:val="Compact"/>
+              <w:numPr>
+                <w:ilvl w:val="0"/>
+                <w:numId w:val="1099"/>
+              </w:numPr>
+            </w:pPr>
+            <w:r>
+              <w:t xml:space="preserve">Sites dominated by user posts,</w:t>
+            </w:r>
+            <w:r>
+              <w:t xml:space="preserve"> </w:t>
+            </w:r>
+            <w:r>
+              <w:t xml:space="preserve">such as Reddit,</w:t>
+            </w:r>
+            <w:r>
+              <w:t xml:space="preserve"> </w:t>
+            </w:r>
+            <w:r>
+              <w:t xml:space="preserve">which are a common source of planted instructions</w:t>
+            </w:r>
+            <w:r>
+              <w:t xml:space="preserve"> </w:t>
+            </w:r>
+            <w:r>
+              <w:t xml:space="preserve">and add little for statistics work.</w:t>
+            </w:r>
+          </w:p>
+          <w:p>
+            <w:pPr>
+              <w:pStyle w:val="FirstParagraph"/>
+            </w:pPr>
+            <w:pPr>
+              <w:spacing w:after="16"/>
+            </w:pPr>
+            <w:r>
+              <w:t xml:space="preserve">Hosts where anyone can publish,</w:t>
+            </w:r>
+            <w:r>
+              <w:t xml:space="preserve"> </w:t>
+            </w:r>
+            <w:r>
+              <w:t xml:space="preserve">such as</w:t>
+            </w:r>
+            <w:r>
+              <w:t xml:space="preserve"> </w:t>
+            </w:r>
+            <w:r>
+              <w:rPr>
+                <w:rStyle w:val="VerbatimChar"/>
+              </w:rPr>
+              <w:t xml:space="preserve">*.github.io</w:t>
+            </w:r>
+            <w:r>
+              <w:t xml:space="preserve"> </w:t>
+            </w:r>
+            <w:r>
+              <w:t xml:space="preserve">and</w:t>
+            </w:r>
+            <w:r>
+              <w:t xml:space="preserve"> </w:t>
+            </w:r>
+            <w:r>
+              <w:rPr>
+                <w:rStyle w:val="VerbatimChar"/>
+              </w:rPr>
+              <w:t xml:space="preserve">*.githubusercontent.com</w:t>
+            </w:r>
+            <w:r>
+              <w:t xml:space="preserve">,</w:t>
+            </w:r>
+            <w:r>
+              <w:t xml:space="preserve"> </w:t>
+            </w:r>
+            <w:r>
+              <w:t xml:space="preserve">are often needed for package installs and documentation;</w:t>
+            </w:r>
+            <w:r>
+              <w:t xml:space="preserve"> </w:t>
+            </w:r>
+            <w:r>
+              <w:t xml:space="preserve">allow them knowingly.</w:t>
+            </w:r>
+          </w:p>
+          <w:p/>
+        </w:tc>
+      </w:tr>
+    </w:tbl>
+    <w:p>
+      <w:pPr>
+        <w:pStyle w:val="BodyText"/>
+      </w:pPr>
+      <w:r>
+        <w:t xml:space="preserve"> </w:t>
       </w:r>
     </w:p>
     <w:tbl>
@@ -42633,12 +43498,12 @@
                 <wp:inline>
                   <wp:extent cx="152400" cy="152400"/>
                   <wp:effectExtent b="0" l="0" r="0" t="0"/>
-                  <wp:docPr descr="" title="" id="253" name="Picture"/>
+                  <wp:docPr descr="" title="" id="258" name="Picture"/>
                   <a:graphic>
                     <a:graphicData uri="http://schemas.openxmlformats.org/drawingml/2006/picture">
                       <pic:pic>
                         <pic:nvPicPr>
-                          <pic:cNvPr descr="/opt/quarto/share/formats/docx/note.png" id="254" name="Picture"/>
+                          <pic:cNvPr descr="/opt/quarto/share/formats/docx/note.png" id="259" name="Picture"/>
                           <pic:cNvPicPr>
                             <a:picLocks noChangeArrowheads="1" noChangeAspect="1"/>
                           </pic:cNvPicPr>
@@ -42754,7 +43619,7 @@
       <w:r>
         <w:t xml:space="preserve"> </w:t>
       </w:r>
-      <w:hyperlink r:id="rId255">
+      <w:hyperlink r:id="rId260">
         <w:r>
           <w:rPr>
             <w:rStyle w:val="Hyperlink"/>
@@ -42771,7 +43636,7 @@
       <w:r>
         <w:t xml:space="preserve"> </w:t>
       </w:r>
-      <w:hyperlink r:id="rId256">
+      <w:hyperlink r:id="rId261">
         <w:r>
           <w:rPr>
             <w:rStyle w:val="Hyperlink"/>
@@ -42783,9 +43648,9 @@
         <w:t xml:space="preserve">.</w:t>
       </w:r>
     </w:p>
-    <w:bookmarkEnd w:id="257"/>
-    <w:bookmarkEnd w:id="258"/>
-    <w:bookmarkStart w:id="341" w:name="references"/>
+    <w:bookmarkEnd w:id="262"/>
+    <w:bookmarkEnd w:id="263"/>
+    <w:bookmarkStart w:id="351" w:name="references"/>
     <w:p>
       <w:pPr>
         <w:pStyle w:val="Heading1"/>
@@ -42794,8 +43659,8 @@
         <w:t xml:space="preserve">References</w:t>
       </w:r>
     </w:p>
-    <w:bookmarkStart w:id="340" w:name="refs"/>
-    <w:bookmarkStart w:id="259" w:name="ref-claude_code_demo_plugins"/>
+    <w:bookmarkStart w:id="350" w:name="refs"/>
+    <w:bookmarkStart w:id="264" w:name="ref-claude_code_demo_plugins"/>
     <w:p>
       <w:pPr>
         <w:pStyle w:val="Bibliography"/>
@@ -42831,8 +43696,8 @@
         <w:t xml:space="preserve">.</w:t>
       </w:r>
     </w:p>
-    <w:bookmarkEnd w:id="259"/>
-    <w:bookmarkStart w:id="260" w:name="ref-claude_plugins_official"/>
+    <w:bookmarkEnd w:id="264"/>
+    <w:bookmarkStart w:id="265" w:name="ref-claude_plugins_official"/>
     <w:p>
       <w:pPr>
         <w:pStyle w:val="Bibliography"/>
@@ -42868,8 +43733,8 @@
         <w:t xml:space="preserve">.</w:t>
       </w:r>
     </w:p>
-    <w:bookmarkEnd w:id="260"/>
-    <w:bookmarkStart w:id="261" w:name="ref-claude_plugins_community"/>
+    <w:bookmarkEnd w:id="265"/>
+    <w:bookmarkStart w:id="266" w:name="ref-claude_plugins_community"/>
     <w:p>
       <w:pPr>
         <w:pStyle w:val="Bibliography"/>
@@ -42905,8 +43770,8 @@
         <w:t xml:space="preserve">.</w:t>
       </w:r>
     </w:p>
-    <w:bookmarkEnd w:id="261"/>
-    <w:bookmarkStart w:id="263" w:name="ref-claude_code_discover_plugins"/>
+    <w:bookmarkEnd w:id="266"/>
+    <w:bookmarkStart w:id="268" w:name="ref-claude_code_cloud_environments"/>
     <w:p>
       <w:pPr>
         <w:pStyle w:val="Bibliography"/>
@@ -42922,6 +43787,43 @@
           <w:i/>
           <w:iCs/>
         </w:rPr>
+        <w:t xml:space="preserve">Configure Cloud Environments</w:t>
+      </w:r>
+      <w:r>
+        <w:t xml:space="preserve">. Documentation.</w:t>
+      </w:r>
+      <w:r>
+        <w:t xml:space="preserve"> </w:t>
+      </w:r>
+      <w:hyperlink r:id="rId267">
+        <w:r>
+          <w:rPr>
+            <w:rStyle w:val="Hyperlink"/>
+          </w:rPr>
+          <w:t xml:space="preserve">https://code.claude.com/docs/en/cloud-environments</w:t>
+        </w:r>
+      </w:hyperlink>
+      <w:r>
+        <w:t xml:space="preserve">.</w:t>
+      </w:r>
+    </w:p>
+    <w:bookmarkEnd w:id="268"/>
+    <w:bookmarkStart w:id="270" w:name="ref-claude_code_discover_plugins"/>
+    <w:p>
+      <w:pPr>
+        <w:pStyle w:val="Bibliography"/>
+      </w:pPr>
+      <w:r>
+        <w:t xml:space="preserve">Anthropic. 2026e.</w:t>
+      </w:r>
+      <w:r>
+        <w:t xml:space="preserve"> </w:t>
+      </w:r>
+      <w:r>
+        <w:rPr>
+          <w:i/>
+          <w:iCs/>
+        </w:rPr>
         <w:t xml:space="preserve">Discover and Install Prebuilt Plugins Through Marketplaces</w:t>
       </w:r>
       <w:r>
@@ -42930,7 +43832,7 @@
       <w:r>
         <w:t xml:space="preserve"> </w:t>
       </w:r>
-      <w:hyperlink r:id="rId262">
+      <w:hyperlink r:id="rId269">
         <w:r>
           <w:rPr>
             <w:rStyle w:val="Hyperlink"/>
@@ -42942,14 +43844,14 @@
         <w:t xml:space="preserve">.</w:t>
       </w:r>
     </w:p>
-    <w:bookmarkEnd w:id="263"/>
-    <w:bookmarkStart w:id="265" w:name="ref-ralph_loop_plugin"/>
+    <w:bookmarkEnd w:id="270"/>
+    <w:bookmarkStart w:id="272" w:name="ref-ralph_loop_plugin"/>
     <w:p>
       <w:pPr>
         <w:pStyle w:val="Bibliography"/>
       </w:pPr>
       <w:r>
-        <w:t xml:space="preserve">Anthropic. 2026e.</w:t>
+        <w:t xml:space="preserve">Anthropic. 2026f.</w:t>
       </w:r>
       <w:r>
         <w:t xml:space="preserve"> </w:t>
@@ -42967,7 +43869,7 @@
       <w:r>
         <w:t xml:space="preserve"> </w:t>
       </w:r>
-      <w:hyperlink r:id="rId264">
+      <w:hyperlink r:id="rId271">
         <w:r>
           <w:rPr>
             <w:rStyle w:val="Hyperlink"/>
@@ -42979,8 +43881,8 @@
         <w:t xml:space="preserve">.</w:t>
       </w:r>
     </w:p>
-    <w:bookmarkEnd w:id="265"/>
-    <w:bookmarkStart w:id="267" w:name="ref-coles_herdr"/>
+    <w:bookmarkEnd w:id="272"/>
+    <w:bookmarkStart w:id="274" w:name="ref-coles_herdr"/>
     <w:p>
       <w:pPr>
         <w:pStyle w:val="Bibliography"/>
@@ -43004,7 +43906,7 @@
       <w:r>
         <w:t xml:space="preserve"> </w:t>
       </w:r>
-      <w:hyperlink r:id="rId266">
+      <w:hyperlink r:id="rId273">
         <w:r>
           <w:rPr>
             <w:rStyle w:val="Hyperlink"/>
@@ -43016,8 +43918,8 @@
         <w:t xml:space="preserve">.</w:t>
       </w:r>
     </w:p>
-    <w:bookmarkEnd w:id="267"/>
-    <w:bookmarkStart w:id="269" w:name="ref-flaviocopes_herdr"/>
+    <w:bookmarkEnd w:id="274"/>
+    <w:bookmarkStart w:id="276" w:name="ref-flaviocopes_herdr"/>
     <w:p>
       <w:pPr>
         <w:pStyle w:val="Bibliography"/>
@@ -43041,7 +43943,7 @@
       <w:r>
         <w:t xml:space="preserve"> </w:t>
       </w:r>
-      <w:hyperlink r:id="rId268">
+      <w:hyperlink r:id="rId275">
         <w:r>
           <w:rPr>
             <w:rStyle w:val="Hyperlink"/>
@@ -43053,8 +43955,8 @@
         <w:t xml:space="preserve">.</w:t>
       </w:r>
     </w:p>
-    <w:bookmarkEnd w:id="269"/>
-    <w:bookmarkStart w:id="270" w:name="ref-databricks_fmapi_limits"/>
+    <w:bookmarkEnd w:id="276"/>
+    <w:bookmarkStart w:id="277" w:name="ref-databricks_fmapi_limits"/>
     <w:p>
       <w:pPr>
         <w:pStyle w:val="Bibliography"/>
@@ -43090,8 +43992,8 @@
         <w:t xml:space="preserve">.</w:t>
       </w:r>
     </w:p>
-    <w:bookmarkEnd w:id="270"/>
-    <w:bookmarkStart w:id="271" w:name="ref-databricks_supported_models"/>
+    <w:bookmarkEnd w:id="277"/>
+    <w:bookmarkStart w:id="278" w:name="ref-databricks_supported_models"/>
     <w:p>
       <w:pPr>
         <w:pStyle w:val="Bibliography"/>
@@ -43127,8 +44029,8 @@
         <w:t xml:space="preserve">.</w:t>
       </w:r>
     </w:p>
-    <w:bookmarkEnd w:id="271"/>
-    <w:bookmarkStart w:id="273" w:name="ref-herdr_hn"/>
+    <w:bookmarkEnd w:id="278"/>
+    <w:bookmarkStart w:id="280" w:name="ref-herdr_hn"/>
     <w:p>
       <w:pPr>
         <w:pStyle w:val="Bibliography"/>
@@ -43152,7 +44054,7 @@
       <w:r>
         <w:t xml:space="preserve"> </w:t>
       </w:r>
-      <w:hyperlink r:id="rId272">
+      <w:hyperlink r:id="rId279">
         <w:r>
           <w:rPr>
             <w:rStyle w:val="Hyperlink"/>
@@ -43164,8 +44066,8 @@
         <w:t xml:space="preserve">.</w:t>
       </w:r>
     </w:p>
-    <w:bookmarkEnd w:id="273"/>
-    <w:bookmarkStart w:id="275" w:name="ref-herdr_agents"/>
+    <w:bookmarkEnd w:id="280"/>
+    <w:bookmarkStart w:id="282" w:name="ref-herdr_agents"/>
     <w:p>
       <w:pPr>
         <w:pStyle w:val="Bibliography"/>
@@ -43192,7 +44094,7 @@
       <w:r>
         <w:t xml:space="preserve"> </w:t>
       </w:r>
-      <w:hyperlink r:id="rId274">
+      <w:hyperlink r:id="rId281">
         <w:r>
           <w:rPr>
             <w:rStyle w:val="Hyperlink"/>
@@ -43204,8 +44106,8 @@
         <w:t xml:space="preserve">.</w:t>
       </w:r>
     </w:p>
-    <w:bookmarkEnd w:id="275"/>
-    <w:bookmarkStart w:id="277" w:name="ref-herdr_concepts"/>
+    <w:bookmarkEnd w:id="282"/>
+    <w:bookmarkStart w:id="284" w:name="ref-herdr_concepts"/>
     <w:p>
       <w:pPr>
         <w:pStyle w:val="Bibliography"/>
@@ -43232,7 +44134,7 @@
       <w:r>
         <w:t xml:space="preserve"> </w:t>
       </w:r>
-      <w:hyperlink r:id="rId276">
+      <w:hyperlink r:id="rId283">
         <w:r>
           <w:rPr>
             <w:rStyle w:val="Hyperlink"/>
@@ -43244,8 +44146,8 @@
         <w:t xml:space="preserve">.</w:t>
       </w:r>
     </w:p>
-    <w:bookmarkEnd w:id="277"/>
-    <w:bookmarkStart w:id="279" w:name="ref-herdr_machines"/>
+    <w:bookmarkEnd w:id="284"/>
+    <w:bookmarkStart w:id="286" w:name="ref-herdr_machines"/>
     <w:p>
       <w:pPr>
         <w:pStyle w:val="Bibliography"/>
@@ -43272,7 +44174,7 @@
       <w:r>
         <w:t xml:space="preserve"> </w:t>
       </w:r>
-      <w:hyperlink r:id="rId278">
+      <w:hyperlink r:id="rId285">
         <w:r>
           <w:rPr>
             <w:rStyle w:val="Hyperlink"/>
@@ -43284,8 +44186,8 @@
         <w:t xml:space="preserve">.</w:t>
       </w:r>
     </w:p>
-    <w:bookmarkEnd w:id="279"/>
-    <w:bookmarkStart w:id="280" w:name="ref-herdr_agent_guide"/>
+    <w:bookmarkEnd w:id="286"/>
+    <w:bookmarkStart w:id="287" w:name="ref-herdr_agent_guide"/>
     <w:p>
       <w:pPr>
         <w:pStyle w:val="Bibliography"/>
@@ -43324,8 +44226,8 @@
         <w:t xml:space="preserve">.</w:t>
       </w:r>
     </w:p>
-    <w:bookmarkEnd w:id="280"/>
-    <w:bookmarkStart w:id="281" w:name="ref-herdr"/>
+    <w:bookmarkEnd w:id="287"/>
+    <w:bookmarkStart w:id="288" w:name="ref-herdr"/>
     <w:p>
       <w:pPr>
         <w:pStyle w:val="Bibliography"/>
@@ -43364,8 +44266,8 @@
         <w:t xml:space="preserve">.</w:t>
       </w:r>
     </w:p>
-    <w:bookmarkEnd w:id="281"/>
-    <w:bookmarkStart w:id="282" w:name="ref-herdr_github"/>
+    <w:bookmarkEnd w:id="288"/>
+    <w:bookmarkStart w:id="289" w:name="ref-herdr_github"/>
     <w:p>
       <w:pPr>
         <w:pStyle w:val="Bibliography"/>
@@ -43404,8 +44306,8 @@
         <w:t xml:space="preserve">.</w:t>
       </w:r>
     </w:p>
-    <w:bookmarkEnd w:id="282"/>
-    <w:bookmarkStart w:id="284" w:name="ref-herdr_install"/>
+    <w:bookmarkEnd w:id="289"/>
+    <w:bookmarkStart w:id="291" w:name="ref-herdr_install"/>
     <w:p>
       <w:pPr>
         <w:pStyle w:val="Bibliography"/>
@@ -43432,7 +44334,7 @@
       <w:r>
         <w:t xml:space="preserve"> </w:t>
       </w:r>
-      <w:hyperlink r:id="rId283">
+      <w:hyperlink r:id="rId290">
         <w:r>
           <w:rPr>
             <w:rStyle w:val="Hyperlink"/>
@@ -43444,8 +44346,8 @@
         <w:t xml:space="preserve">.</w:t>
       </w:r>
     </w:p>
-    <w:bookmarkEnd w:id="284"/>
-    <w:bookmarkStart w:id="286" w:name="ref-herdr_session_state"/>
+    <w:bookmarkEnd w:id="291"/>
+    <w:bookmarkStart w:id="293" w:name="ref-herdr_session_state"/>
     <w:p>
       <w:pPr>
         <w:pStyle w:val="Bibliography"/>
@@ -43472,7 +44374,7 @@
       <w:r>
         <w:t xml:space="preserve"> </w:t>
       </w:r>
-      <w:hyperlink r:id="rId285">
+      <w:hyperlink r:id="rId292">
         <w:r>
           <w:rPr>
             <w:rStyle w:val="Hyperlink"/>
@@ -43484,8 +44386,8 @@
         <w:t xml:space="preserve">.</w:t>
       </w:r>
     </w:p>
-    <w:bookmarkEnd w:id="286"/>
-    <w:bookmarkStart w:id="288" w:name="ref-herdr_socket_api"/>
+    <w:bookmarkEnd w:id="293"/>
+    <w:bookmarkStart w:id="295" w:name="ref-herdr_socket_api"/>
     <w:p>
       <w:pPr>
         <w:pStyle w:val="Bibliography"/>
@@ -43512,7 +44414,7 @@
       <w:r>
         <w:t xml:space="preserve"> </w:t>
       </w:r>
-      <w:hyperlink r:id="rId287">
+      <w:hyperlink r:id="rId294">
         <w:r>
           <w:rPr>
             <w:rStyle w:val="Hyperlink"/>
@@ -43524,8 +44426,8 @@
         <w:t xml:space="preserve">.</w:t>
       </w:r>
     </w:p>
-    <w:bookmarkEnd w:id="288"/>
-    <w:bookmarkStart w:id="290" w:name="ref-ghuntley_ralph"/>
+    <w:bookmarkEnd w:id="295"/>
+    <w:bookmarkStart w:id="297" w:name="ref-ghuntley_ralph"/>
     <w:p>
       <w:pPr>
         <w:pStyle w:val="Bibliography"/>
@@ -43549,7 +44451,7 @@
       <w:r>
         <w:t xml:space="preserve"> </w:t>
       </w:r>
-      <w:hyperlink r:id="rId289">
+      <w:hyperlink r:id="rId296">
         <w:r>
           <w:rPr>
             <w:rStyle w:val="Hyperlink"/>
@@ -43561,8 +44463,8 @@
         <w:t xml:space="preserve">.</w:t>
       </w:r>
     </w:p>
-    <w:bookmarkEnd w:id="290"/>
-    <w:bookmarkStart w:id="292" w:name="ref-awesome_herdr"/>
+    <w:bookmarkEnd w:id="297"/>
+    <w:bookmarkStart w:id="299" w:name="ref-awesome_herdr"/>
     <w:p>
       <w:pPr>
         <w:pStyle w:val="Bibliography"/>
@@ -43586,7 +44488,7 @@
       <w:r>
         <w:t xml:space="preserve"> </w:t>
       </w:r>
-      <w:hyperlink r:id="rId291">
+      <w:hyperlink r:id="rId298">
         <w:r>
           <w:rPr>
             <w:rStyle w:val="Hyperlink"/>
@@ -43598,8 +44500,8 @@
         <w:t xml:space="preserve">.</w:t>
       </w:r>
     </w:p>
-    <w:bookmarkEnd w:id="292"/>
-    <w:bookmarkStart w:id="293" w:name="ref-ai_config_readme"/>
+    <w:bookmarkEnd w:id="299"/>
+    <w:bookmarkStart w:id="300" w:name="ref-ai_config_readme"/>
     <w:p>
       <w:pPr>
         <w:pStyle w:val="Bibliography"/>
@@ -43635,8 +44537,8 @@
         <w:t xml:space="preserve">.</w:t>
       </w:r>
     </w:p>
-    <w:bookmarkEnd w:id="293"/>
-    <w:bookmarkStart w:id="295" w:name="ref-ai_config_delegate_to_codex"/>
+    <w:bookmarkEnd w:id="300"/>
+    <w:bookmarkStart w:id="302" w:name="ref-ai_config_delegate_to_codex"/>
     <w:p>
       <w:pPr>
         <w:pStyle w:val="Bibliography"/>
@@ -43674,7 +44576,7 @@
       <w:r>
         <w:t xml:space="preserve"> </w:t>
       </w:r>
-      <w:hyperlink r:id="rId294">
+      <w:hyperlink r:id="rId301">
         <w:r>
           <w:rPr>
             <w:rStyle w:val="Hyperlink"/>
@@ -43686,8 +44588,82 @@
         <w:t xml:space="preserve">.</w:t>
       </w:r>
     </w:p>
-    <w:bookmarkEnd w:id="295"/>
-    <w:bookmarkStart w:id="296" w:name="ref-codex_plugin_cc"/>
+    <w:bookmarkEnd w:id="302"/>
+    <w:bookmarkStart w:id="304" w:name="ref-stats_allowlist_pr6"/>
+    <w:p>
+      <w:pPr>
+        <w:pStyle w:val="Bibliography"/>
+      </w:pPr>
+      <w:r>
+        <w:t xml:space="preserve">Morrison Lab. 2026c.</w:t>
+      </w:r>
+      <w:r>
+        <w:t xml:space="preserve"> </w:t>
+      </w:r>
+      <w:r>
+        <w:rPr>
+          <w:i/>
+          <w:iCs/>
+        </w:rPr>
+        <w:t xml:space="preserve">Merge Additional Hosts into Claude Allowlist; Prune Redundant and Risky Entries</w:t>
+      </w:r>
+      <w:r>
+        <w:t xml:space="preserve">. GitHub pull request.</w:t>
+      </w:r>
+      <w:r>
+        <w:t xml:space="preserve"> </w:t>
+      </w:r>
+      <w:hyperlink r:id="rId303">
+        <w:r>
+          <w:rPr>
+            <w:rStyle w:val="Hyperlink"/>
+          </w:rPr>
+          <w:t xml:space="preserve">https://github.com/Morrison-Lab/stats-allowlist/pull/6</w:t>
+        </w:r>
+      </w:hyperlink>
+      <w:r>
+        <w:t xml:space="preserve">.</w:t>
+      </w:r>
+    </w:p>
+    <w:bookmarkEnd w:id="304"/>
+    <w:bookmarkStart w:id="305" w:name="ref-stats_allowlist"/>
+    <w:p>
+      <w:pPr>
+        <w:pStyle w:val="Bibliography"/>
+      </w:pPr>
+      <w:r>
+        <w:t xml:space="preserve">Morrison Lab. 2026d.</w:t>
+      </w:r>
+      <w:r>
+        <w:t xml:space="preserve"> </w:t>
+      </w:r>
+      <w:r>
+        <w:rPr>
+          <w:i/>
+          <w:iCs/>
+        </w:rPr>
+        <w:t xml:space="preserve">Stats-Allowlist: Network Allowlists for AI Coding Agents</w:t>
+      </w:r>
+      <w:r>
+        <w:t xml:space="preserve">. GitHub repository.</w:t>
+      </w:r>
+      <w:r>
+        <w:t xml:space="preserve"> </w:t>
+      </w:r>
+      <w:hyperlink r:id="rId255">
+        <w:r>
+          <w:rPr>
+            <w:rStyle w:val="Hyperlink"/>
+          </w:rPr>
+          <w:t xml:space="preserve">https://github.com/Morrison-Lab/stats-allowlist</w:t>
+        </w:r>
+      </w:hyperlink>
+      <w:r>
+        <w:t xml:space="preserve">.</w:t>
+      </w:r>
+    </w:p>
+    <w:bookmarkEnd w:id="305"/>
+    <w:bookmarkStart w:id="306" w:name="ref-codex_plugin_cc"/>
     <w:p>
       <w:pPr>
         <w:pStyle w:val="Bibliography"/>
@@ -43737,8 +44713,8 @@
         <w:t xml:space="preserve">.</w:t>
       </w:r>
     </w:p>
-    <w:bookmarkEnd w:id="296"/>
-    <w:bookmarkStart w:id="298" w:name="ref-codex_pricing"/>
+    <w:bookmarkEnd w:id="306"/>
+    <w:bookmarkStart w:id="308" w:name="ref-codex_pricing"/>
     <w:p>
       <w:pPr>
         <w:pStyle w:val="Bibliography"/>
@@ -43762,7 +44738,7 @@
       <w:r>
         <w:t xml:space="preserve"> </w:t>
       </w:r>
-      <w:hyperlink r:id="rId297">
+      <w:hyperlink r:id="rId307">
         <w:r>
           <w:rPr>
             <w:rStyle w:val="Hyperlink"/>
@@ -43774,8 +44750,8 @@
         <w:t xml:space="preserve">.</w:t>
       </w:r>
     </w:p>
-    <w:bookmarkEnd w:id="298"/>
-    <w:bookmarkStart w:id="299" w:name="ref-posit_dev_ai_lib"/>
+    <w:bookmarkEnd w:id="308"/>
+    <w:bookmarkStart w:id="309" w:name="ref-posit_dev_ai_lib"/>
     <w:p>
       <w:pPr>
         <w:pStyle w:val="Bibliography"/>
@@ -43811,8 +44787,8 @@
         <w:t xml:space="preserve">.</w:t>
       </w:r>
     </w:p>
-    <w:bookmarkEnd w:id="299"/>
-    <w:bookmarkStart w:id="300" w:name="ref-posit_dev_assistant_feedback"/>
+    <w:bookmarkEnd w:id="309"/>
+    <w:bookmarkStart w:id="310" w:name="ref-posit_dev_assistant_feedback"/>
     <w:p>
       <w:pPr>
         <w:pStyle w:val="Bibliography"/>
@@ -43848,8 +44824,8 @@
         <w:t xml:space="preserve">.</w:t>
       </w:r>
     </w:p>
-    <w:bookmarkEnd w:id="300"/>
-    <w:bookmarkStart w:id="301" w:name="ref-posit_dev_bluffbench2"/>
+    <w:bookmarkEnd w:id="310"/>
+    <w:bookmarkStart w:id="311" w:name="ref-posit_dev_bluffbench2"/>
     <w:p>
       <w:pPr>
         <w:pStyle w:val="Bibliography"/>
@@ -43885,8 +44861,8 @@
         <w:t xml:space="preserve">.</w:t>
       </w:r>
     </w:p>
-    <w:bookmarkEnd w:id="301"/>
-    <w:bookmarkStart w:id="302" w:name="ref-posit_dev_btw"/>
+    <w:bookmarkEnd w:id="311"/>
+    <w:bookmarkStart w:id="312" w:name="ref-posit_dev_btw"/>
     <w:p>
       <w:pPr>
         <w:pStyle w:val="Bibliography"/>
@@ -43922,8 +44898,8 @@
         <w:t xml:space="preserve">.</w:t>
       </w:r>
     </w:p>
-    <w:bookmarkEnd w:id="302"/>
-    <w:bookmarkStart w:id="303" w:name="ref-posit_dev_chatlas"/>
+    <w:bookmarkEnd w:id="312"/>
+    <w:bookmarkStart w:id="313" w:name="ref-posit_dev_chatlas"/>
     <w:p>
       <w:pPr>
         <w:pStyle w:val="Bibliography"/>
@@ -43959,8 +44935,8 @@
         <w:t xml:space="preserve">.</w:t>
       </w:r>
     </w:p>
-    <w:bookmarkEnd w:id="303"/>
-    <w:bookmarkStart w:id="304" w:name="ref-posit_dev_code_index"/>
+    <w:bookmarkEnd w:id="313"/>
+    <w:bookmarkStart w:id="314" w:name="ref-posit_dev_code_index"/>
     <w:p>
       <w:pPr>
         <w:pStyle w:val="Bibliography"/>
@@ -43996,8 +44972,8 @@
         <w:t xml:space="preserve">.</w:t>
       </w:r>
     </w:p>
-    <w:bookmarkEnd w:id="304"/>
-    <w:bookmarkStart w:id="305" w:name="ref-posit_dev_commons"/>
+    <w:bookmarkEnd w:id="314"/>
+    <w:bookmarkStart w:id="315" w:name="ref-posit_dev_commons"/>
     <w:p>
       <w:pPr>
         <w:pStyle w:val="Bibliography"/>
@@ -44033,8 +45009,8 @@
         <w:t xml:space="preserve">.</w:t>
       </w:r>
     </w:p>
-    <w:bookmarkEnd w:id="305"/>
-    <w:bookmarkStart w:id="306" w:name="ref-posit_dev_mcp_repl"/>
+    <w:bookmarkEnd w:id="315"/>
+    <w:bookmarkStart w:id="316" w:name="ref-posit_dev_mcp_repl"/>
     <w:p>
       <w:pPr>
         <w:pStyle w:val="Bibliography"/>
@@ -44070,8 +45046,8 @@
         <w:t xml:space="preserve">.</w:t>
       </w:r>
     </w:p>
-    <w:bookmarkEnd w:id="306"/>
-    <w:bookmarkStart w:id="307" w:name="ref-posit_dev_mcptools"/>
+    <w:bookmarkEnd w:id="316"/>
+    <w:bookmarkStart w:id="317" w:name="ref-posit_dev_mcptools"/>
     <w:p>
       <w:pPr>
         <w:pStyle w:val="Bibliography"/>
@@ -44107,8 +45083,8 @@
         <w:t xml:space="preserve">.</w:t>
       </w:r>
     </w:p>
-    <w:bookmarkEnd w:id="307"/>
-    <w:bookmarkStart w:id="308" w:name="ref-posit_dev_nesevals"/>
+    <w:bookmarkEnd w:id="317"/>
+    <w:bookmarkStart w:id="318" w:name="ref-posit_dev_nesevals"/>
     <w:p>
       <w:pPr>
         <w:pStyle w:val="Bibliography"/>
@@ -44144,8 +45120,8 @@
         <w:t xml:space="preserve">.</w:t>
       </w:r>
     </w:p>
-    <w:bookmarkEnd w:id="308"/>
-    <w:bookmarkStart w:id="309" w:name="ref-posit_dev_positron"/>
+    <w:bookmarkEnd w:id="318"/>
+    <w:bookmarkStart w:id="319" w:name="ref-posit_dev_positron"/>
     <w:p>
       <w:pPr>
         <w:pStyle w:val="Bibliography"/>
@@ -44181,8 +45157,8 @@
         <w:t xml:space="preserve">.</w:t>
       </w:r>
     </w:p>
-    <w:bookmarkEnd w:id="309"/>
-    <w:bookmarkStart w:id="310" w:name="ref-posit_dev_positron_copilot_chat"/>
+    <w:bookmarkEnd w:id="319"/>
+    <w:bookmarkStart w:id="320" w:name="ref-posit_dev_positron_copilot_chat"/>
     <w:p>
       <w:pPr>
         <w:pStyle w:val="Bibliography"/>
@@ -44218,8 +45194,8 @@
         <w:t xml:space="preserve">.</w:t>
       </w:r>
     </w:p>
-    <w:bookmarkEnd w:id="310"/>
-    <w:bookmarkStart w:id="311" w:name="ref-posit_dev_querychat"/>
+    <w:bookmarkEnd w:id="320"/>
+    <w:bookmarkStart w:id="321" w:name="ref-posit_dev_querychat"/>
     <w:p>
       <w:pPr>
         <w:pStyle w:val="Bibliography"/>
@@ -44255,8 +45231,8 @@
         <w:t xml:space="preserve">.</w:t>
       </w:r>
     </w:p>
-    <w:bookmarkEnd w:id="311"/>
-    <w:bookmarkStart w:id="312" w:name="ref-posit_dev_raghilda"/>
+    <w:bookmarkEnd w:id="321"/>
+    <w:bookmarkStart w:id="322" w:name="ref-posit_dev_raghilda"/>
     <w:p>
       <w:pPr>
         <w:pStyle w:val="Bibliography"/>
@@ -44292,8 +45268,8 @@
         <w:t xml:space="preserve">.</w:t>
       </w:r>
     </w:p>
-    <w:bookmarkEnd w:id="312"/>
-    <w:bookmarkStart w:id="313" w:name="ref-posit_dev_shiny_assistant"/>
+    <w:bookmarkEnd w:id="322"/>
+    <w:bookmarkStart w:id="323" w:name="ref-posit_dev_shiny_assistant"/>
     <w:p>
       <w:pPr>
         <w:pStyle w:val="Bibliography"/>
@@ -44329,8 +45305,8 @@
         <w:t xml:space="preserve">.</w:t>
       </w:r>
     </w:p>
-    <w:bookmarkEnd w:id="313"/>
-    <w:bookmarkStart w:id="314" w:name="ref-posit_dev_shinychat"/>
+    <w:bookmarkEnd w:id="323"/>
+    <w:bookmarkStart w:id="324" w:name="ref-posit_dev_shinychat"/>
     <w:p>
       <w:pPr>
         <w:pStyle w:val="Bibliography"/>
@@ -44366,8 +45342,8 @@
         <w:t xml:space="preserve">.</w:t>
       </w:r>
     </w:p>
-    <w:bookmarkEnd w:id="314"/>
-    <w:bookmarkStart w:id="315" w:name="ref-posit_dev_shinyrealtime"/>
+    <w:bookmarkEnd w:id="324"/>
+    <w:bookmarkStart w:id="325" w:name="ref-posit_dev_shinyrealtime"/>
     <w:p>
       <w:pPr>
         <w:pStyle w:val="Bibliography"/>
@@ -44403,8 +45379,8 @@
         <w:t xml:space="preserve">.</w:t>
       </w:r>
     </w:p>
-    <w:bookmarkEnd w:id="315"/>
-    <w:bookmarkStart w:id="317" w:name="ref-tessl_docs_core_concepts"/>
+    <w:bookmarkEnd w:id="325"/>
+    <w:bookmarkStart w:id="327" w:name="ref-tessl_docs_core_concepts"/>
     <w:p>
       <w:pPr>
         <w:pStyle w:val="Bibliography"/>
@@ -44428,7 +45404,7 @@
       <w:r>
         <w:t xml:space="preserve"> </w:t>
       </w:r>
-      <w:hyperlink r:id="rId316">
+      <w:hyperlink r:id="rId326">
         <w:r>
           <w:rPr>
             <w:rStyle w:val="Hyperlink"/>
@@ -44440,8 +45416,8 @@
         <w:t xml:space="preserve">.</w:t>
       </w:r>
     </w:p>
-    <w:bookmarkEnd w:id="317"/>
-    <w:bookmarkStart w:id="319" w:name="ref-tessl_docs_installation"/>
+    <w:bookmarkEnd w:id="327"/>
+    <w:bookmarkStart w:id="329" w:name="ref-tessl_docs_installation"/>
     <w:p>
       <w:pPr>
         <w:pStyle w:val="Bibliography"/>
@@ -44465,7 +45441,7 @@
       <w:r>
         <w:t xml:space="preserve"> </w:t>
       </w:r>
-      <w:hyperlink r:id="rId318">
+      <w:hyperlink r:id="rId328">
         <w:r>
           <w:rPr>
             <w:rStyle w:val="Hyperlink"/>
@@ -44477,8 +45453,8 @@
         <w:t xml:space="preserve">.</w:t>
       </w:r>
     </w:p>
-    <w:bookmarkEnd w:id="319"/>
-    <w:bookmarkStart w:id="321" w:name="ref-tessl_docs_security"/>
+    <w:bookmarkEnd w:id="329"/>
+    <w:bookmarkStart w:id="331" w:name="ref-tessl_docs_security"/>
     <w:p>
       <w:pPr>
         <w:pStyle w:val="Bibliography"/>
@@ -44502,7 +45478,7 @@
       <w:r>
         <w:t xml:space="preserve"> </w:t>
       </w:r>
-      <w:hyperlink r:id="rId320">
+      <w:hyperlink r:id="rId330">
         <w:r>
           <w:rPr>
             <w:rStyle w:val="Hyperlink"/>
@@ -44514,8 +45490,8 @@
         <w:t xml:space="preserve">.</w:t>
       </w:r>
     </w:p>
-    <w:bookmarkEnd w:id="321"/>
-    <w:bookmarkStart w:id="323" w:name="ref-tessl_docs_usage_data"/>
+    <w:bookmarkEnd w:id="331"/>
+    <w:bookmarkStart w:id="333" w:name="ref-tessl_docs_usage_data"/>
     <w:p>
       <w:pPr>
         <w:pStyle w:val="Bibliography"/>
@@ -44539,7 +45515,7 @@
       <w:r>
         <w:t xml:space="preserve"> </w:t>
       </w:r>
-      <w:hyperlink r:id="rId322">
+      <w:hyperlink r:id="rId332">
         <w:r>
           <w:rPr>
             <w:rStyle w:val="Hyperlink"/>
@@ -44551,8 +45527,8 @@
         <w:t xml:space="preserve">.</w:t>
       </w:r>
     </w:p>
-    <w:bookmarkEnd w:id="323"/>
-    <w:bookmarkStart w:id="325" w:name="ref-tessl_docs_supported_platforms"/>
+    <w:bookmarkEnd w:id="333"/>
+    <w:bookmarkStart w:id="335" w:name="ref-tessl_docs_supported_platforms"/>
     <w:p>
       <w:pPr>
         <w:pStyle w:val="Bibliography"/>
@@ -44576,7 +45552,7 @@
       <w:r>
         <w:t xml:space="preserve"> </w:t>
       </w:r>
-      <w:hyperlink r:id="rId324">
+      <w:hyperlink r:id="rId334">
         <w:r>
           <w:rPr>
             <w:rStyle w:val="Hyperlink"/>
@@ -44588,8 +45564,8 @@
         <w:t xml:space="preserve">.</w:t>
       </w:r>
     </w:p>
-    <w:bookmarkEnd w:id="325"/>
-    <w:bookmarkStart w:id="327" w:name="ref-tessl_docs_faqs"/>
+    <w:bookmarkEnd w:id="335"/>
+    <w:bookmarkStart w:id="337" w:name="ref-tessl_docs_faqs"/>
     <w:p>
       <w:pPr>
         <w:pStyle w:val="Bibliography"/>
@@ -44613,7 +45589,7 @@
       <w:r>
         <w:t xml:space="preserve"> </w:t>
       </w:r>
-      <w:hyperlink r:id="rId326">
+      <w:hyperlink r:id="rId336">
         <w:r>
           <w:rPr>
             <w:rStyle w:val="Hyperlink"/>
@@ -44625,8 +45601,8 @@
         <w:t xml:space="preserve">.</w:t>
       </w:r>
     </w:p>
-    <w:bookmarkEnd w:id="327"/>
-    <w:bookmarkStart w:id="329" w:name="ref-tessl_pricing"/>
+    <w:bookmarkEnd w:id="337"/>
+    <w:bookmarkStart w:id="339" w:name="ref-tessl_pricing"/>
     <w:p>
       <w:pPr>
         <w:pStyle w:val="Bibliography"/>
@@ -44650,7 +45626,7 @@
       <w:r>
         <w:t xml:space="preserve"> </w:t>
       </w:r>
-      <w:hyperlink r:id="rId328">
+      <w:hyperlink r:id="rId338">
         <w:r>
           <w:rPr>
             <w:rStyle w:val="Hyperlink"/>
@@ -44662,8 +45638,8 @@
         <w:t xml:space="preserve">.</w:t>
       </w:r>
     </w:p>
-    <w:bookmarkEnd w:id="329"/>
-    <w:bookmarkStart w:id="331" w:name="ref-tessl_registry"/>
+    <w:bookmarkEnd w:id="339"/>
+    <w:bookmarkStart w:id="341" w:name="ref-tessl_registry"/>
     <w:p>
       <w:pPr>
         <w:pStyle w:val="Bibliography"/>
@@ -44687,7 +45663,7 @@
       <w:r>
         <w:t xml:space="preserve"> </w:t>
       </w:r>
-      <w:hyperlink r:id="rId330">
+      <w:hyperlink r:id="rId340">
         <w:r>
           <w:rPr>
             <w:rStyle w:val="Hyperlink"/>
@@ -44699,8 +45675,8 @@
         <w:t xml:space="preserve">.</w:t>
       </w:r>
     </w:p>
-    <w:bookmarkEnd w:id="331"/>
-    <w:bookmarkStart w:id="332" w:name="ref-tessl_home"/>
+    <w:bookmarkEnd w:id="341"/>
+    <w:bookmarkStart w:id="342" w:name="ref-tessl_home"/>
     <w:p>
       <w:pPr>
         <w:pStyle w:val="Bibliography"/>
@@ -44736,8 +45712,8 @@
         <w:t xml:space="preserve">.</w:t>
       </w:r>
     </w:p>
-    <w:bookmarkEnd w:id="332"/>
-    <w:bookmarkStart w:id="334" w:name="ref-tessl_docs_package_manager"/>
+    <w:bookmarkEnd w:id="342"/>
+    <w:bookmarkStart w:id="344" w:name="ref-tessl_docs_package_manager"/>
     <w:p>
       <w:pPr>
         <w:pStyle w:val="Bibliography"/>
@@ -44761,7 +45737,7 @@
       <w:r>
         <w:t xml:space="preserve"> </w:t>
       </w:r>
-      <w:hyperlink r:id="rId333">
+      <w:hyperlink r:id="rId343">
         <w:r>
           <w:rPr>
             <w:rStyle w:val="Hyperlink"/>
@@ -44773,8 +45749,8 @@
         <w:t xml:space="preserve">.</w:t>
       </w:r>
     </w:p>
-    <w:bookmarkEnd w:id="334"/>
-    <w:bookmarkStart w:id="336" w:name="ref-tessl_docs_overview"/>
+    <w:bookmarkEnd w:id="344"/>
+    <w:bookmarkStart w:id="346" w:name="ref-tessl_docs_overview"/>
     <w:p>
       <w:pPr>
         <w:pStyle w:val="Bibliography"/>
@@ -44798,7 +45774,7 @@
       <w:r>
         <w:t xml:space="preserve"> </w:t>
       </w:r>
-      <w:hyperlink r:id="rId335">
+      <w:hyperlink r:id="rId345">
         <w:r>
           <w:rPr>
             <w:rStyle w:val="Hyperlink"/>
@@ -44810,8 +45786,8 @@
         <w:t xml:space="preserve">.</w:t>
       </w:r>
     </w:p>
-    <w:bookmarkEnd w:id="336"/>
-    <w:bookmarkStart w:id="337" w:name="ref-obra_superpowers"/>
+    <w:bookmarkEnd w:id="346"/>
+    <w:bookmarkStart w:id="347" w:name="ref-obra_superpowers"/>
     <w:p>
       <w:pPr>
         <w:pStyle w:val="Bibliography"/>
@@ -44847,8 +45823,8 @@
         <w:t xml:space="preserve">.</w:t>
       </w:r>
     </w:p>
-    <w:bookmarkEnd w:id="337"/>
-    <w:bookmarkStart w:id="339" w:name="ref-herdr_yc"/>
+    <w:bookmarkEnd w:id="347"/>
+    <w:bookmarkStart w:id="349" w:name="ref-herdr_yc"/>
     <w:p>
       <w:pPr>
         <w:pStyle w:val="Bibliography"/>
@@ -44872,7 +45848,7 @@
       <w:r>
         <w:t xml:space="preserve"> </w:t>
       </w:r>
-      <w:hyperlink r:id="rId338">
+      <w:hyperlink r:id="rId348">
         <w:r>
           <w:rPr>
             <w:rStyle w:val="Hyperlink"/>
@@ -44884,9 +45860,9 @@
         <w:t xml:space="preserve">.</w:t>
       </w:r>
     </w:p>
-    <w:bookmarkEnd w:id="339"/>
-    <w:bookmarkEnd w:id="340"/>
-    <w:bookmarkEnd w:id="341"/>
+    <w:bookmarkEnd w:id="349"/>
+    <w:bookmarkEnd w:id="350"/>
+    <w:bookmarkEnd w:id="351"/>
     <w:sectPr>
       <w:footnotePr>
         <w:numRestart w:val="eachSect"/>
@@ -45717,6 +46693,42 @@
     <w:abstractNumId w:val="991"/>
   </w:num>
   <w:num w:numId="1096">
+    <w:abstractNumId w:val="991"/>
+  </w:num>
+  <w:num w:numId="1097">
+    <w:abstractNumId w:val="99411"/>
+    <w:lvlOverride w:ilvl="0">
+      <w:startOverride w:val="1"/>
+    </w:lvlOverride>
+    <w:lvlOverride w:ilvl="1">
+      <w:startOverride w:val="1"/>
+    </w:lvlOverride>
+    <w:lvlOverride w:ilvl="2">
+      <w:startOverride w:val="1"/>
+    </w:lvlOverride>
+    <w:lvlOverride w:ilvl="3">
+      <w:startOverride w:val="1"/>
+    </w:lvlOverride>
+    <w:lvlOverride w:ilvl="4">
+      <w:startOverride w:val="1"/>
+    </w:lvlOverride>
+    <w:lvlOverride w:ilvl="5">
+      <w:startOverride w:val="1"/>
+    </w:lvlOverride>
+    <w:lvlOverride w:ilvl="6">
+      <w:startOverride w:val="1"/>
+    </w:lvlOverride>
+    <w:lvlOverride w:ilvl="7">
+      <w:startOverride w:val="1"/>
+    </w:lvlOverride>
+    <w:lvlOverride w:ilvl="8">
+      <w:startOverride w:val="1"/>
+    </w:lvlOverride>
+  </w:num>
+  <w:num w:numId="1098">
+    <w:abstractNumId w:val="991"/>
+  </w:num>
+  <w:num w:numId="1099">
     <w:abstractNumId w:val="991"/>
   </w:num>
 </w:numbering>

</xml_diff>

<commit_message>
Deploying to gh-pages from @ Morrison-Lab/wai@27eea6e9b2bdb4d5d3e0eecf21d7c8fe9f7d7e25 🚀
</commit_message>
<xml_diff>
--- a/chapters/agent-customization.docx
+++ b/chapters/agent-customization.docx
@@ -15,7 +15,7 @@
         <w:pStyle w:val="Date"/>
       </w:pPr>
       <w:r>
-        <w:t xml:space="preserve">Last modified: 2026-10-05 03:10:24 (PDT)</w:t>
+        <w:t xml:space="preserve">Last modified: 2026-10-05 16:02:17 (PDT)</w:t>
       </w:r>
     </w:p>
     <w:p>
@@ -29609,7 +29609,7 @@
         <w:t xml:space="preserve"> </w:t>
       </w:r>
       <w:r>
-        <w:t xml:space="preserve">(Anthropic 2026e)</w:t>
+        <w:t xml:space="preserve">(Anthropic 2026g)</w:t>
       </w:r>
       <w:r>
         <w:t xml:space="preserve">:</w:t>
@@ -30527,7 +30527,7 @@
         <w:t xml:space="preserve"> </w:t>
       </w:r>
       <w:r>
-        <w:t xml:space="preserve">(Anthropic 2026e)</w:t>
+        <w:t xml:space="preserve">(Anthropic 2026g)</w:t>
       </w:r>
       <w:r>
         <w:t xml:space="preserve">.</w:t>
@@ -31781,7 +31781,7 @@
         <w:t xml:space="preserve"> </w:t>
       </w:r>
       <w:r>
-        <w:t xml:space="preserve">(Anthropic 2026e)</w:t>
+        <w:t xml:space="preserve">(Anthropic 2026g)</w:t>
       </w:r>
       <w:r>
         <w:t xml:space="preserve">.</w:t>
@@ -33243,7 +33243,7 @@
         <w:t xml:space="preserve"> </w:t>
       </w:r>
       <w:r>
-        <w:t xml:space="preserve">(Anthropic 2026f; Huntley 2025)</w:t>
+        <w:t xml:space="preserve">(Anthropic 2026h; Huntley 2025)</w:t>
       </w:r>
       <w:r>
         <w:t xml:space="preserve">.</w:t>
@@ -33519,7 +33519,7 @@
         <w:t xml:space="preserve"> </w:t>
       </w:r>
       <w:r>
-        <w:t xml:space="preserve">(Anthropic 2026f)</w:t>
+        <w:t xml:space="preserve">(Anthropic 2026h)</w:t>
       </w:r>
       <w:r>
         <w:t xml:space="preserve">.</w:t>
@@ -42137,7 +42137,7 @@
     </w:p>
     <w:bookmarkEnd w:id="250"/>
     <w:bookmarkEnd w:id="251"/>
-    <w:bookmarkStart w:id="263" w:name="sec-ai-claude-cloud-env"/>
+    <w:bookmarkStart w:id="265" w:name="sec-ai-claude-cloud-env"/>
     <w:p>
       <w:pPr>
         <w:pStyle w:val="Heading1"/>
@@ -43649,8 +43649,1044 @@
       </w:r>
     </w:p>
     <w:bookmarkEnd w:id="262"/>
-    <w:bookmarkEnd w:id="263"/>
-    <w:bookmarkStart w:id="351" w:name="references"/>
+    <w:bookmarkStart w:id="264" w:name="sec-claude-local-network"/>
+    <w:p>
+      <w:pPr>
+        <w:pStyle w:val="Heading4"/>
+      </w:pPr>
+      <w:r>
+        <w:t xml:space="preserve">Network access for local sessions</w:t>
+      </w:r>
+    </w:p>
+    <w:p>
+      <w:pPr>
+        <w:pStyle w:val="FirstParagraph"/>
+      </w:pPr>
+      <w:r>
+        <w:t xml:space="preserve">Unlike a cloud session,</w:t>
+      </w:r>
+      <w:r>
+        <w:t xml:space="preserve"> </w:t>
+      </w:r>
+      <w:r>
+        <w:t xml:space="preserve">a local Claude Code session has no network allowlist by default.</w:t>
+      </w:r>
+      <w:r>
+        <w:t xml:space="preserve"> </w:t>
+      </w:r>
+      <w:r>
+        <w:t xml:space="preserve">What protects it is you:</w:t>
+      </w:r>
+      <w:r>
+        <w:t xml:space="preserve"> </w:t>
+      </w:r>
+      <w:r>
+        <w:t xml:space="preserve">in the default permission mode,</w:t>
+      </w:r>
+      <w:r>
+        <w:t xml:space="preserve"> </w:t>
+      </w:r>
+      <w:r>
+        <w:t xml:space="preserve">Claude Code asks before each shell command,</w:t>
+      </w:r>
+      <w:r>
+        <w:t xml:space="preserve"> </w:t>
+      </w:r>
+      <w:r>
+        <w:t xml:space="preserve">apart from a built-in set of read-only commands,</w:t>
+      </w:r>
+      <w:r>
+        <w:t xml:space="preserve"> </w:t>
+      </w:r>
+      <w:r>
+        <w:t xml:space="preserve">and before each web fetch to a domain outside a built-in set of approved documentation sites</w:t>
+      </w:r>
+      <w:r>
+        <w:t xml:space="preserve"> </w:t>
+      </w:r>
+      <w:r>
+        <w:t xml:space="preserve">(Anthropic 2026e)</w:t>
+      </w:r>
+      <w:r>
+        <w:t xml:space="preserve">.</w:t>
+      </w:r>
+      <w:r>
+        <w:t xml:space="preserve"> </w:t>
+      </w:r>
+      <w:r>
+        <w:t xml:space="preserve">That protection lasts only while someone answers the prompts;</w:t>
+      </w:r>
+      <w:r>
+        <w:t xml:space="preserve"> </w:t>
+      </w:r>
+      <w:r>
+        <w:t xml:space="preserve">a cloud session, which can run with no one watching,</w:t>
+      </w:r>
+      <w:r>
+        <w:t xml:space="preserve"> </w:t>
+      </w:r>
+      <w:r>
+        <w:t xml:space="preserve">relies on its allowlist instead.</w:t>
+      </w:r>
+    </w:p>
+    <w:p>
+      <w:pPr>
+        <w:pStyle w:val="BodyText"/>
+      </w:pPr>
+      <w:r>
+        <w:t xml:space="preserve">A local session that runs without prompts,</w:t>
+      </w:r>
+      <w:r>
+        <w:t xml:space="preserve"> </w:t>
+      </w:r>
+      <w:r>
+        <w:t xml:space="preserve">such as in auto mode, where a classifier reviews actions instead of you</w:t>
+      </w:r>
+      <w:r>
+        <w:t xml:space="preserve"> </w:t>
+      </w:r>
+      <w:r>
+        <w:t xml:space="preserve">(Anthropic 2026e)</w:t>
+      </w:r>
+      <w:r>
+        <w:t xml:space="preserve">,</w:t>
+      </w:r>
+      <w:r>
+        <w:t xml:space="preserve"> </w:t>
+      </w:r>
+      <w:r>
+        <w:t xml:space="preserve">needs a network boundary of its own.</w:t>
+      </w:r>
+      <w:r>
+        <w:t xml:space="preserve"> </w:t>
+      </w:r>
+      <w:r>
+        <w:t xml:space="preserve">Claude Code’s sandbox provides one for shell commands,</w:t>
+      </w:r>
+      <w:r>
+        <w:t xml:space="preserve"> </w:t>
+      </w:r>
+      <w:r>
+        <w:t xml:space="preserve">but it is off by default</w:t>
+      </w:r>
+      <w:r>
+        <w:t xml:space="preserve"> </w:t>
+      </w:r>
+      <w:r>
+        <w:t xml:space="preserve">(Anthropic 2026f)</w:t>
+      </w:r>
+      <w:r>
+        <w:t xml:space="preserve">.</w:t>
+      </w:r>
+      <w:r>
+        <w:t xml:space="preserve"> </w:t>
+      </w:r>
+      <w:r>
+        <w:t xml:space="preserve">To turn it on for every project, with the lab’s list,</w:t>
+      </w:r>
+      <w:r>
+        <w:t xml:space="preserve"> </w:t>
+      </w:r>
+      <w:r>
+        <w:t xml:space="preserve">edit your user settings,</w:t>
+      </w:r>
+      <w:r>
+        <w:t xml:space="preserve"> </w:t>
+      </w:r>
+      <w:r>
+        <w:rPr>
+          <w:rStyle w:val="VerbatimChar"/>
+        </w:rPr>
+        <w:t xml:space="preserve">~/.claude/settings.json</w:t>
+      </w:r>
+      <w:r>
+        <w:t xml:space="preserve"> </w:t>
+      </w:r>
+      <w:r>
+        <w:t xml:space="preserve">(Anthropic 2026f)</w:t>
+      </w:r>
+      <w:r>
+        <w:t xml:space="preserve">:</w:t>
+      </w:r>
+    </w:p>
+    <w:p>
+      <w:pPr>
+        <w:pStyle w:val="Compact"/>
+        <w:numPr>
+          <w:ilvl w:val="0"/>
+          <w:numId w:val="1100"/>
+        </w:numPr>
+      </w:pPr>
+      <w:r>
+        <w:t xml:space="preserve">Set</w:t>
+      </w:r>
+      <w:r>
+        <w:t xml:space="preserve"> </w:t>
+      </w:r>
+      <w:r>
+        <w:rPr>
+          <w:rStyle w:val="VerbatimChar"/>
+        </w:rPr>
+        <w:t xml:space="preserve">sandbox.enabled</w:t>
+      </w:r>
+      <w:r>
+        <w:t xml:space="preserve"> </w:t>
+      </w:r>
+      <w:r>
+        <w:t xml:space="preserve">to</w:t>
+      </w:r>
+      <w:r>
+        <w:t xml:space="preserve"> </w:t>
+      </w:r>
+      <w:r>
+        <w:rPr>
+          <w:rStyle w:val="VerbatimChar"/>
+        </w:rPr>
+        <w:t xml:space="preserve">true</w:t>
+      </w:r>
+      <w:r>
+        <w:t xml:space="preserve">.</w:t>
+      </w:r>
+      <w:r>
+        <w:t xml:space="preserve"> </w:t>
+      </w:r>
+      <w:r>
+        <w:t xml:space="preserve">Running</w:t>
+      </w:r>
+      <w:r>
+        <w:t xml:space="preserve"> </w:t>
+      </w:r>
+      <w:r>
+        <w:rPr>
+          <w:rStyle w:val="VerbatimChar"/>
+        </w:rPr>
+        <w:t xml:space="preserve">/sandbox</w:t>
+      </w:r>
+      <w:r>
+        <w:t xml:space="preserve"> </w:t>
+      </w:r>
+      <w:r>
+        <w:t xml:space="preserve">in a session instead saves the setting</w:t>
+      </w:r>
+      <w:r>
+        <w:t xml:space="preserve"> </w:t>
+      </w:r>
+      <w:r>
+        <w:t xml:space="preserve">to that project’s</w:t>
+      </w:r>
+      <w:r>
+        <w:t xml:space="preserve"> </w:t>
+      </w:r>
+      <w:r>
+        <w:rPr>
+          <w:rStyle w:val="VerbatimChar"/>
+        </w:rPr>
+        <w:t xml:space="preserve">.claude/settings.local.json</w:t>
+      </w:r>
+      <w:r>
+        <w:t xml:space="preserve"> </w:t>
+      </w:r>
+      <w:r>
+        <w:t xml:space="preserve">only.</w:t>
+      </w:r>
+    </w:p>
+    <w:p>
+      <w:pPr>
+        <w:pStyle w:val="Compact"/>
+        <w:numPr>
+          <w:ilvl w:val="0"/>
+          <w:numId w:val="1100"/>
+        </w:numPr>
+      </w:pPr>
+      <w:r>
+        <w:t xml:space="preserve">Set</w:t>
+      </w:r>
+      <w:r>
+        <w:t xml:space="preserve"> </w:t>
+      </w:r>
+      <w:r>
+        <w:rPr>
+          <w:rStyle w:val="VerbatimChar"/>
+        </w:rPr>
+        <w:t xml:space="preserve">sandbox.network.allowedDomains</w:t>
+      </w:r>
+      <w:r>
+        <w:t xml:space="preserve"> </w:t>
+      </w:r>
+      <w:r>
+        <w:t xml:space="preserve">to the entries of</w:t>
+      </w:r>
+      <w:r>
+        <w:t xml:space="preserve"> </w:t>
+      </w:r>
+      <w:hyperlink r:id="rId254">
+        <w:r>
+          <w:rPr>
+            <w:rStyle w:val="VerbatimChar"/>
+          </w:rPr>
+          <w:t xml:space="preserve">claude-allowlist.txt</w:t>
+        </w:r>
+      </w:hyperlink>
+      <w:r>
+        <w:t xml:space="preserve">,</w:t>
+      </w:r>
+      <w:r>
+        <w:t xml:space="preserve"> </w:t>
+      </w:r>
+      <w:r>
+        <w:t xml:space="preserve">as a JSON array of strings.</w:t>
+      </w:r>
+      <w:r>
+        <w:t xml:space="preserve"> </w:t>
+      </w:r>
+      <w:r>
+        <w:t xml:space="preserve">The sandbox accepts the same leading</w:t>
+      </w:r>
+      <w:r>
+        <w:t xml:space="preserve"> </w:t>
+      </w:r>
+      <w:r>
+        <w:rPr>
+          <w:rStyle w:val="VerbatimChar"/>
+        </w:rPr>
+        <w:t xml:space="preserve">*.</w:t>
+      </w:r>
+      <w:r>
+        <w:t xml:space="preserve"> </w:t>
+      </w:r>
+      <w:r>
+        <w:t xml:space="preserve">wildcards.</w:t>
+      </w:r>
+    </w:p>
+    <w:p>
+      <w:pPr>
+        <w:pStyle w:val="Compact"/>
+        <w:numPr>
+          <w:ilvl w:val="0"/>
+          <w:numId w:val="1100"/>
+        </w:numPr>
+      </w:pPr>
+      <w:r>
+        <w:t xml:space="preserve">Set</w:t>
+      </w:r>
+      <w:r>
+        <w:t xml:space="preserve"> </w:t>
+      </w:r>
+      <w:r>
+        <w:rPr>
+          <w:rStyle w:val="VerbatimChar"/>
+        </w:rPr>
+        <w:t xml:space="preserve">sandbox.network.strictAllowlist</w:t>
+      </w:r>
+      <w:r>
+        <w:t xml:space="preserve"> </w:t>
+      </w:r>
+      <w:r>
+        <w:t xml:space="preserve">to</w:t>
+      </w:r>
+      <w:r>
+        <w:t xml:space="preserve"> </w:t>
+      </w:r>
+      <w:r>
+        <w:rPr>
+          <w:rStyle w:val="VerbatimChar"/>
+        </w:rPr>
+        <w:t xml:space="preserve">true</w:t>
+      </w:r>
+      <w:r>
+        <w:t xml:space="preserve"> </w:t>
+      </w:r>
+      <w:r>
+        <w:t xml:space="preserve">(Claude Code v2.1.219 or later).</w:t>
+      </w:r>
+      <w:r>
+        <w:t xml:space="preserve"> </w:t>
+      </w:r>
+      <w:r>
+        <w:t xml:space="preserve">Without it,</w:t>
+      </w:r>
+      <w:r>
+        <w:t xml:space="preserve"> </w:t>
+      </w:r>
+      <w:r>
+        <w:rPr>
+          <w:rStyle w:val="VerbatimChar"/>
+        </w:rPr>
+        <w:t xml:space="preserve">allowedDomains</w:t>
+      </w:r>
+      <w:r>
+        <w:t xml:space="preserve"> </w:t>
+      </w:r>
+      <w:r>
+        <w:t xml:space="preserve">only pre-approves hosts:</w:t>
+      </w:r>
+      <w:r>
+        <w:t xml:space="preserve"> </w:t>
+      </w:r>
+      <w:r>
+        <w:t xml:space="preserve">any other host gets a prompt in the default mode,</w:t>
+      </w:r>
+      <w:r>
+        <w:t xml:space="preserve"> </w:t>
+      </w:r>
+      <w:r>
+        <w:t xml:space="preserve">is refused in auto mode unless the command names it,</w:t>
+      </w:r>
+      <w:r>
+        <w:t xml:space="preserve"> </w:t>
+      </w:r>
+      <w:r>
+        <w:t xml:space="preserve">and is allowed without a prompt in</w:t>
+      </w:r>
+      <w:r>
+        <w:t xml:space="preserve"> </w:t>
+      </w:r>
+      <w:r>
+        <w:rPr>
+          <w:rStyle w:val="VerbatimChar"/>
+        </w:rPr>
+        <w:t xml:space="preserve">bypassPermissions</w:t>
+      </w:r>
+      <w:r>
+        <w:t xml:space="preserve"> </w:t>
+      </w:r>
+      <w:r>
+        <w:t xml:space="preserve">mode.</w:t>
+      </w:r>
+    </w:p>
+    <w:p>
+      <w:pPr>
+        <w:pStyle w:val="Compact"/>
+        <w:numPr>
+          <w:ilvl w:val="0"/>
+          <w:numId w:val="1100"/>
+        </w:numPr>
+      </w:pPr>
+      <w:r>
+        <w:t xml:space="preserve">Set</w:t>
+      </w:r>
+      <w:r>
+        <w:t xml:space="preserve"> </w:t>
+      </w:r>
+      <w:r>
+        <w:rPr>
+          <w:rStyle w:val="VerbatimChar"/>
+        </w:rPr>
+        <w:t xml:space="preserve">sandbox.allowUnsandboxedCommands</w:t>
+      </w:r>
+      <w:r>
+        <w:t xml:space="preserve"> </w:t>
+      </w:r>
+      <w:r>
+        <w:t xml:space="preserve">to</w:t>
+      </w:r>
+      <w:r>
+        <w:t xml:space="preserve"> </w:t>
+      </w:r>
+      <w:r>
+        <w:rPr>
+          <w:rStyle w:val="VerbatimChar"/>
+        </w:rPr>
+        <w:t xml:space="preserve">false</w:t>
+      </w:r>
+      <w:r>
+        <w:t xml:space="preserve">,</w:t>
+      </w:r>
+      <w:r>
+        <w:t xml:space="preserve"> </w:t>
+      </w:r>
+      <w:r>
+        <w:t xml:space="preserve">so that a blocked command cannot retry outside the sandbox.</w:t>
+      </w:r>
+    </w:p>
+    <w:p>
+      <w:pPr>
+        <w:pStyle w:val="Compact"/>
+        <w:numPr>
+          <w:ilvl w:val="0"/>
+          <w:numId w:val="1100"/>
+        </w:numPr>
+      </w:pPr>
+      <w:r>
+        <w:t xml:space="preserve">Set</w:t>
+      </w:r>
+      <w:r>
+        <w:t xml:space="preserve"> </w:t>
+      </w:r>
+      <w:r>
+        <w:rPr>
+          <w:rStyle w:val="VerbatimChar"/>
+        </w:rPr>
+        <w:t xml:space="preserve">sandbox.failIfUnavailable</w:t>
+      </w:r>
+      <w:r>
+        <w:t xml:space="preserve"> </w:t>
+      </w:r>
+      <w:r>
+        <w:t xml:space="preserve">to</w:t>
+      </w:r>
+      <w:r>
+        <w:t xml:space="preserve"> </w:t>
+      </w:r>
+      <w:r>
+        <w:rPr>
+          <w:rStyle w:val="VerbatimChar"/>
+        </w:rPr>
+        <w:t xml:space="preserve">true</w:t>
+      </w:r>
+      <w:r>
+        <w:t xml:space="preserve">.</w:t>
+      </w:r>
+      <w:r>
+        <w:t xml:space="preserve"> </w:t>
+      </w:r>
+      <w:r>
+        <w:t xml:space="preserve">By default, when the sandbox cannot start,</w:t>
+      </w:r>
+      <w:r>
+        <w:t xml:space="preserve"> </w:t>
+      </w:r>
+      <w:r>
+        <w:t xml:space="preserve">Claude Code runs commands without it.</w:t>
+      </w:r>
+    </w:p>
+    <w:p>
+      <w:pPr>
+        <w:pStyle w:val="FirstParagraph"/>
+      </w:pPr>
+      <w:r>
+        <w:t xml:space="preserve">These are user-level defaults,</w:t>
+      </w:r>
+      <w:r>
+        <w:t xml:space="preserve"> </w:t>
+      </w:r>
+      <w:r>
+        <w:t xml:space="preserve">and a project’s own</w:t>
+      </w:r>
+      <w:r>
+        <w:t xml:space="preserve"> </w:t>
+      </w:r>
+      <w:r>
+        <w:rPr>
+          <w:rStyle w:val="VerbatimChar"/>
+        </w:rPr>
+        <w:t xml:space="preserve">.claude/settings.json</w:t>
+      </w:r>
+      <w:r>
+        <w:t xml:space="preserve"> </w:t>
+      </w:r>
+      <w:r>
+        <w:t xml:space="preserve">or</w:t>
+      </w:r>
+      <w:r>
+        <w:t xml:space="preserve"> </w:t>
+      </w:r>
+      <w:r>
+        <w:rPr>
+          <w:rStyle w:val="VerbatimChar"/>
+        </w:rPr>
+        <w:t xml:space="preserve">.claude/settings.local.json</w:t>
+      </w:r>
+      <w:r>
+        <w:t xml:space="preserve"> </w:t>
+      </w:r>
+      <w:r>
+        <w:t xml:space="preserve">can change them</w:t>
+      </w:r>
+      <w:r>
+        <w:t xml:space="preserve"> </w:t>
+      </w:r>
+      <w:r>
+        <w:t xml:space="preserve">(Anthropic 2026i)</w:t>
+      </w:r>
+      <w:r>
+        <w:t xml:space="preserve">:</w:t>
+      </w:r>
+    </w:p>
+    <w:p>
+      <w:pPr>
+        <w:pStyle w:val="Compact"/>
+        <w:numPr>
+          <w:ilvl w:val="0"/>
+          <w:numId w:val="1101"/>
+        </w:numPr>
+      </w:pPr>
+      <w:r>
+        <w:t xml:space="preserve">A single value set there, such as</w:t>
+      </w:r>
+      <w:r>
+        <w:t xml:space="preserve"> </w:t>
+      </w:r>
+      <w:r>
+        <w:rPr>
+          <w:rStyle w:val="VerbatimChar"/>
+        </w:rPr>
+        <w:t xml:space="preserve">sandbox.enabled</w:t>
+      </w:r>
+      <w:r>
+        <w:t xml:space="preserve">, overrides yours,</w:t>
+      </w:r>
+      <w:r>
+        <w:t xml:space="preserve"> </w:t>
+      </w:r>
+      <w:r>
+        <w:t xml:space="preserve">so an old</w:t>
+      </w:r>
+      <w:r>
+        <w:t xml:space="preserve"> </w:t>
+      </w:r>
+      <w:r>
+        <w:rPr>
+          <w:rStyle w:val="VerbatimChar"/>
+        </w:rPr>
+        <w:t xml:space="preserve">sandbox.enabled: false</w:t>
+      </w:r>
+      <w:r>
+        <w:t xml:space="preserve"> </w:t>
+      </w:r>
+      <w:r>
+        <w:t xml:space="preserve">in a project turns the sandbox off for it.</w:t>
+      </w:r>
+    </w:p>
+    <w:p>
+      <w:pPr>
+        <w:pStyle w:val="Compact"/>
+        <w:numPr>
+          <w:ilvl w:val="0"/>
+          <w:numId w:val="1101"/>
+        </w:numPr>
+      </w:pPr>
+      <w:r>
+        <w:t xml:space="preserve">A list set there, such as</w:t>
+      </w:r>
+      <w:r>
+        <w:t xml:space="preserve"> </w:t>
+      </w:r>
+      <w:r>
+        <w:rPr>
+          <w:rStyle w:val="VerbatimChar"/>
+        </w:rPr>
+        <w:t xml:space="preserve">allowedDomains</w:t>
+      </w:r>
+      <w:r>
+        <w:t xml:space="preserve">, is combined with yours.</w:t>
+      </w:r>
+      <w:r>
+        <w:t xml:space="preserve"> </w:t>
+      </w:r>
+      <w:r>
+        <w:t xml:space="preserve">With</w:t>
+      </w:r>
+      <w:r>
+        <w:t xml:space="preserve"> </w:t>
+      </w:r>
+      <w:r>
+        <w:rPr>
+          <w:rStyle w:val="VerbatimChar"/>
+        </w:rPr>
+        <w:t xml:space="preserve">strictAllowlist</w:t>
+      </w:r>
+      <w:r>
+        <w:t xml:space="preserve"> </w:t>
+      </w:r>
+      <w:r>
+        <w:t xml:space="preserve">in your user settings,</w:t>
+      </w:r>
+      <w:r>
+        <w:t xml:space="preserve"> </w:t>
+      </w:r>
+      <w:r>
+        <w:t xml:space="preserve">Claude Code v2.1.285 or later ignores a project’s</w:t>
+      </w:r>
+      <w:r>
+        <w:t xml:space="preserve"> </w:t>
+      </w:r>
+      <w:r>
+        <w:rPr>
+          <w:rStyle w:val="VerbatimChar"/>
+        </w:rPr>
+        <w:t xml:space="preserve">allowedDomains</w:t>
+      </w:r>
+      <w:r>
+        <w:t xml:space="preserve"> </w:t>
+      </w:r>
+      <w:r>
+        <w:t xml:space="preserve">entries</w:t>
+      </w:r>
+      <w:r>
+        <w:t xml:space="preserve"> </w:t>
+      </w:r>
+      <w:r>
+        <w:t xml:space="preserve">(Anthropic 2026f)</w:t>
+      </w:r>
+      <w:r>
+        <w:t xml:space="preserve">.</w:t>
+      </w:r>
+    </w:p>
+    <w:p>
+      <w:pPr>
+        <w:pStyle w:val="FirstParagraph"/>
+      </w:pPr>
+      <w:r>
+        <w:t xml:space="preserve">Check a project’s settings before relying on this for an unattended run.</w:t>
+      </w:r>
+      <w:r>
+        <w:t xml:space="preserve"> </w:t>
+      </w:r>
+      <w:r>
+        <w:t xml:space="preserve">The minimum versions named here come from the sandboxing documentation</w:t>
+      </w:r>
+      <w:r>
+        <w:t xml:space="preserve"> </w:t>
+      </w:r>
+      <w:r>
+        <w:t xml:space="preserve">as read on 2026-10-05</w:t>
+      </w:r>
+      <w:r>
+        <w:t xml:space="preserve"> </w:t>
+      </w:r>
+      <w:r>
+        <w:t xml:space="preserve">(Anthropic 2026f)</w:t>
+      </w:r>
+      <w:r>
+        <w:t xml:space="preserve">;</w:t>
+      </w:r>
+      <w:r>
+        <w:t xml:space="preserve"> </w:t>
+      </w:r>
+      <w:r>
+        <w:t xml:space="preserve">run</w:t>
+      </w:r>
+      <w:r>
+        <w:t xml:space="preserve"> </w:t>
+      </w:r>
+      <w:r>
+        <w:rPr>
+          <w:rStyle w:val="VerbatimChar"/>
+        </w:rPr>
+        <w:t xml:space="preserve">claude --version</w:t>
+      </w:r>
+      <w:r>
+        <w:t xml:space="preserve"> </w:t>
+      </w:r>
+      <w:r>
+        <w:t xml:space="preserve">and check the current documentation</w:t>
+      </w:r>
+      <w:r>
+        <w:t xml:space="preserve"> </w:t>
+      </w:r>
+      <w:r>
+        <w:t xml:space="preserve">before relying on them.</w:t>
+      </w:r>
+    </w:p>
+    <w:p>
+      <w:pPr>
+        <w:pStyle w:val="BodyText"/>
+      </w:pPr>
+      <w:r>
+        <w:rPr>
+          <w:rStyle w:val="VerbatimChar"/>
+        </w:rPr>
+        <w:t xml:space="preserve">jq</w:t>
+      </w:r>
+      <w:r>
+        <w:t xml:space="preserve"> </w:t>
+      </w:r>
+      <w:r>
+        <w:t xml:space="preserve">turns a downloaded copy of the</w:t>
+      </w:r>
+      <w:r>
+        <w:t xml:space="preserve"> </w:t>
+      </w:r>
+      <w:hyperlink r:id="rId263">
+        <w:r>
+          <w:rPr>
+            <w:rStyle w:val="Hyperlink"/>
+          </w:rPr>
+          <w:t xml:space="preserve">raw file</w:t>
+        </w:r>
+      </w:hyperlink>
+      <w:r>
+        <w:t xml:space="preserve"> </w:t>
+      </w:r>
+      <w:r>
+        <w:t xml:space="preserve">into the array for step 2:</w:t>
+      </w:r>
+    </w:p>
+    <w:p>
+      <w:pPr>
+        <w:pStyle w:val="SourceCode"/>
+      </w:pPr>
+      <w:r>
+        <w:rPr>
+          <w:rStyle w:val="ExtensionTok"/>
+        </w:rPr>
+        <w:t xml:space="preserve">jq</w:t>
+      </w:r>
+      <w:r>
+        <w:rPr>
+          <w:rStyle w:val="NormalTok"/>
+        </w:rPr>
+        <w:t xml:space="preserve"> </w:t>
+      </w:r>
+      <w:r>
+        <w:rPr>
+          <w:rStyle w:val="AttributeTok"/>
+        </w:rPr>
+        <w:t xml:space="preserve">-R</w:t>
+      </w:r>
+      <w:r>
+        <w:rPr>
+          <w:rStyle w:val="NormalTok"/>
+        </w:rPr>
+        <w:t xml:space="preserve"> . claude-allowlist.txt </w:t>
+      </w:r>
+      <w:r>
+        <w:rPr>
+          <w:rStyle w:val="KeywordTok"/>
+        </w:rPr>
+        <w:t xml:space="preserve">|</w:t>
+      </w:r>
+      <w:r>
+        <w:rPr>
+          <w:rStyle w:val="NormalTok"/>
+        </w:rPr>
+        <w:t xml:space="preserve"> </w:t>
+      </w:r>
+      <w:r>
+        <w:rPr>
+          <w:rStyle w:val="ExtensionTok"/>
+        </w:rPr>
+        <w:t xml:space="preserve">jq</w:t>
+      </w:r>
+      <w:r>
+        <w:rPr>
+          <w:rStyle w:val="NormalTok"/>
+        </w:rPr>
+        <w:t xml:space="preserve"> </w:t>
+      </w:r>
+      <w:r>
+        <w:rPr>
+          <w:rStyle w:val="AttributeTok"/>
+        </w:rPr>
+        <w:t xml:space="preserve">-s</w:t>
+      </w:r>
+      <w:r>
+        <w:rPr>
+          <w:rStyle w:val="NormalTok"/>
+        </w:rPr>
+        <w:t xml:space="preserve"> .</w:t>
+      </w:r>
+    </w:p>
+    <w:p>
+      <w:pPr>
+        <w:pStyle w:val="FirstParagraph"/>
+      </w:pPr>
+      <w:r>
+        <w:t xml:space="preserve">The sandbox runs on macOS, Linux, and WSL2.</w:t>
+      </w:r>
+      <w:r>
+        <w:t xml:space="preserve"> </w:t>
+      </w:r>
+      <w:r>
+        <w:t xml:space="preserve">On native Windows, Claude Code runs shell commands without the sandbox,</w:t>
+      </w:r>
+      <w:r>
+        <w:t xml:space="preserve"> </w:t>
+      </w:r>
+      <w:r>
+        <w:t xml:space="preserve">and with step 5 set it refuses to start instead,</w:t>
+      </w:r>
+      <w:r>
+        <w:t xml:space="preserve"> </w:t>
+      </w:r>
+      <w:r>
+        <w:t xml:space="preserve">so run Claude Code inside WSL2 to use these settings</w:t>
+      </w:r>
+      <w:r>
+        <w:t xml:space="preserve"> </w:t>
+      </w:r>
+      <w:r>
+        <w:t xml:space="preserve">(see</w:t>
+      </w:r>
+      <w:r>
+        <w:t xml:space="preserve"> </w:t>
+      </w:r>
+      <w:hyperlink w:anchor="sec-ai-claude-code-windows">
+        <w:r>
+          <w:rPr>
+            <w:rStyle w:val="Hyperlink"/>
+          </w:rPr>
+          <w:t xml:space="preserve">Section 5</w:t>
+        </w:r>
+      </w:hyperlink>
+      <w:r>
+        <w:t xml:space="preserve">)</w:t>
+      </w:r>
+      <w:r>
+        <w:t xml:space="preserve"> </w:t>
+      </w:r>
+      <w:r>
+        <w:t xml:space="preserve">(Anthropic 2026f)</w:t>
+      </w:r>
+      <w:r>
+        <w:t xml:space="preserve">.</w:t>
+      </w:r>
+      <w:r>
+        <w:t xml:space="preserve"> </w:t>
+      </w:r>
+      <w:r>
+        <w:t xml:space="preserve">The sandbox covers shell commands only.</w:t>
+      </w:r>
+      <w:r>
+        <w:t xml:space="preserve"> </w:t>
+      </w:r>
+      <w:r>
+        <w:t xml:space="preserve">Built-in tools such as</w:t>
+      </w:r>
+      <w:r>
+        <w:t xml:space="preserve"> </w:t>
+      </w:r>
+      <w:r>
+        <w:rPr>
+          <w:rStyle w:val="VerbatimChar"/>
+        </w:rPr>
+        <w:t xml:space="preserve">WebFetch</w:t>
+      </w:r>
+      <w:r>
+        <w:t xml:space="preserve"> </w:t>
+      </w:r>
+      <w:r>
+        <w:t xml:space="preserve">follow permission rules instead,</w:t>
+      </w:r>
+      <w:r>
+        <w:t xml:space="preserve"> </w:t>
+      </w:r>
+      <w:r>
+        <w:t xml:space="preserve">so neither</w:t>
+      </w:r>
+      <w:r>
+        <w:t xml:space="preserve"> </w:t>
+      </w:r>
+      <w:r>
+        <w:rPr>
+          <w:rStyle w:val="VerbatimChar"/>
+        </w:rPr>
+        <w:t xml:space="preserve">allowedDomains</w:t>
+      </w:r>
+      <w:r>
+        <w:t xml:space="preserve"> </w:t>
+      </w:r>
+      <w:r>
+        <w:t xml:space="preserve">nor</w:t>
+      </w:r>
+      <w:r>
+        <w:t xml:space="preserve"> </w:t>
+      </w:r>
+      <w:r>
+        <w:rPr>
+          <w:rStyle w:val="VerbatimChar"/>
+        </w:rPr>
+        <w:t xml:space="preserve">strictAllowlist</w:t>
+      </w:r>
+      <w:r>
+        <w:t xml:space="preserve"> </w:t>
+      </w:r>
+      <w:r>
+        <w:t xml:space="preserve">limits them</w:t>
+      </w:r>
+      <w:r>
+        <w:t xml:space="preserve"> </w:t>
+      </w:r>
+      <w:r>
+        <w:t xml:space="preserve">(Anthropic 2026f)</w:t>
+      </w:r>
+      <w:r>
+        <w:t xml:space="preserve">.</w:t>
+      </w:r>
+    </w:p>
+    <w:p>
+      <w:pPr>
+        <w:pStyle w:val="BodyText"/>
+      </w:pPr>
+      <w:r>
+        <w:t xml:space="preserve">To read a site left off the lab’s list,</w:t>
+      </w:r>
+      <w:r>
+        <w:t xml:space="preserve"> </w:t>
+      </w:r>
+      <w:r>
+        <w:t xml:space="preserve">such as a Reddit thread,</w:t>
+      </w:r>
+      <w:r>
+        <w:t xml:space="preserve"> </w:t>
+      </w:r>
+      <w:r>
+        <w:t xml:space="preserve">use a local session where you approve the fetch,</w:t>
+      </w:r>
+      <w:r>
+        <w:t xml:space="preserve"> </w:t>
+      </w:r>
+      <w:r>
+        <w:t xml:space="preserve">rather than a cloud environment where every session could reach the site.</w:t>
+      </w:r>
+      <w:r>
+        <w:t xml:space="preserve"> </w:t>
+      </w:r>
+      <w:r>
+        <w:t xml:space="preserve">Answer the prompt with</w:t>
+      </w:r>
+      <w:r>
+        <w:t xml:space="preserve"> </w:t>
+      </w:r>
+      <w:r>
+        <w:rPr>
+          <w:b/>
+          <w:bCs/>
+        </w:rPr>
+        <w:t xml:space="preserve">Yes</w:t>
+      </w:r>
+      <w:r>
+        <w:t xml:space="preserve">, not</w:t>
+      </w:r>
+      <w:r>
+        <w:t xml:space="preserve"> </w:t>
+      </w:r>
+      <w:r>
+        <w:rPr>
+          <w:b/>
+          <w:bCs/>
+        </w:rPr>
+        <w:t xml:space="preserve">Yes, and don’t ask again</w:t>
+      </w:r>
+      <w:r>
+        <w:t xml:space="preserve">:</w:t>
+      </w:r>
+      <w:r>
+        <w:t xml:space="preserve"> </w:t>
+      </w:r>
+      <w:r>
+        <w:t xml:space="preserve">the second saves a permanent allow rule for that domain,</w:t>
+      </w:r>
+      <w:r>
+        <w:t xml:space="preserve"> </w:t>
+      </w:r>
+      <w:r>
+        <w:t xml:space="preserve">which the sandbox also honors</w:t>
+      </w:r>
+      <w:r>
+        <w:t xml:space="preserve"> </w:t>
+      </w:r>
+      <w:r>
+        <w:t xml:space="preserve">(Anthropic 2026e, 2026f)</w:t>
+      </w:r>
+      <w:r>
+        <w:t xml:space="preserve">.</w:t>
+      </w:r>
+    </w:p>
+    <w:bookmarkEnd w:id="264"/>
+    <w:bookmarkEnd w:id="265"/>
+    <w:bookmarkStart w:id="358" w:name="references"/>
     <w:p>
       <w:pPr>
         <w:pStyle w:val="Heading1"/>
@@ -43659,8 +44695,8 @@
         <w:t xml:space="preserve">References</w:t>
       </w:r>
     </w:p>
-    <w:bookmarkStart w:id="350" w:name="refs"/>
-    <w:bookmarkStart w:id="264" w:name="ref-claude_code_demo_plugins"/>
+    <w:bookmarkStart w:id="357" w:name="refs"/>
+    <w:bookmarkStart w:id="266" w:name="ref-claude_code_demo_plugins"/>
     <w:p>
       <w:pPr>
         <w:pStyle w:val="Bibliography"/>
@@ -43696,8 +44732,8 @@
         <w:t xml:space="preserve">.</w:t>
       </w:r>
     </w:p>
-    <w:bookmarkEnd w:id="264"/>
-    <w:bookmarkStart w:id="265" w:name="ref-claude_plugins_official"/>
+    <w:bookmarkEnd w:id="266"/>
+    <w:bookmarkStart w:id="267" w:name="ref-claude_plugins_official"/>
     <w:p>
       <w:pPr>
         <w:pStyle w:val="Bibliography"/>
@@ -43733,8 +44769,8 @@
         <w:t xml:space="preserve">.</w:t>
       </w:r>
     </w:p>
-    <w:bookmarkEnd w:id="265"/>
-    <w:bookmarkStart w:id="266" w:name="ref-claude_plugins_community"/>
+    <w:bookmarkEnd w:id="267"/>
+    <w:bookmarkStart w:id="268" w:name="ref-claude_plugins_community"/>
     <w:p>
       <w:pPr>
         <w:pStyle w:val="Bibliography"/>
@@ -43770,8 +44806,8 @@
         <w:t xml:space="preserve">.</w:t>
       </w:r>
     </w:p>
-    <w:bookmarkEnd w:id="266"/>
-    <w:bookmarkStart w:id="268" w:name="ref-claude_code_cloud_environments"/>
+    <w:bookmarkEnd w:id="268"/>
+    <w:bookmarkStart w:id="270" w:name="ref-claude_code_cloud_environments"/>
     <w:p>
       <w:pPr>
         <w:pStyle w:val="Bibliography"/>
@@ -43795,7 +44831,7 @@
       <w:r>
         <w:t xml:space="preserve"> </w:t>
       </w:r>
-      <w:hyperlink r:id="rId267">
+      <w:hyperlink r:id="rId269">
         <w:r>
           <w:rPr>
             <w:rStyle w:val="Hyperlink"/>
@@ -43807,8 +44843,8 @@
         <w:t xml:space="preserve">.</w:t>
       </w:r>
     </w:p>
-    <w:bookmarkEnd w:id="268"/>
-    <w:bookmarkStart w:id="270" w:name="ref-claude_code_discover_plugins"/>
+    <w:bookmarkEnd w:id="270"/>
+    <w:bookmarkStart w:id="272" w:name="ref-claude_code_permissions"/>
     <w:p>
       <w:pPr>
         <w:pStyle w:val="Bibliography"/>
@@ -43824,6 +44860,108 @@
           <w:i/>
           <w:iCs/>
         </w:rPr>
+        <w:t xml:space="preserve">Configure Permissions</w:t>
+      </w:r>
+      <w:r>
+        <w:t xml:space="preserve">. Documentation.</w:t>
+      </w:r>
+      <w:r>
+        <w:t xml:space="preserve"> </w:t>
+      </w:r>
+      <w:hyperlink r:id="rId271">
+        <w:r>
+          <w:rPr>
+            <w:rStyle w:val="Hyperlink"/>
+          </w:rPr>
+          <w:t xml:space="preserve">https://code.claude.com/docs/en/permissions</w:t>
+        </w:r>
+      </w:hyperlink>
+      <w:r>
+        <w:t xml:space="preserve">.</w:t>
+      </w:r>
+    </w:p>
+    <w:bookmarkEnd w:id="272"/>
+    <w:bookmarkStart w:id="274" w:name="ref-claude_code_sandboxing"/>
+    <w:p>
+      <w:pPr>
+        <w:pStyle w:val="Bibliography"/>
+      </w:pPr>
+      <w:r>
+        <w:t xml:space="preserve">Anthropic. 2026f.</w:t>
+      </w:r>
+      <w:r>
+        <w:t xml:space="preserve"> </w:t>
+      </w:r>
+      <w:r>
+        <w:rPr>
+          <w:i/>
+          <w:iCs/>
+        </w:rPr>
+        <w:t xml:space="preserve">Configure the Sandboxed</w:t>
+      </w:r>
+      <w:r>
+        <w:rPr>
+          <w:i/>
+          <w:iCs/>
+        </w:rPr>
+        <w:t xml:space="preserve"> </w:t>
+      </w:r>
+      <w:r>
+        <w:rPr>
+          <w:i/>
+          <w:iCs/>
+        </w:rPr>
+        <w:t xml:space="preserve">Bash</w:t>
+      </w:r>
+      <w:r>
+        <w:rPr>
+          <w:i/>
+          <w:iCs/>
+        </w:rPr>
+        <w:t xml:space="preserve"> </w:t>
+      </w:r>
+      <w:r>
+        <w:rPr>
+          <w:i/>
+          <w:iCs/>
+        </w:rPr>
+        <w:t xml:space="preserve">Tool</w:t>
+      </w:r>
+      <w:r>
+        <w:t xml:space="preserve">. Documentation.</w:t>
+      </w:r>
+      <w:r>
+        <w:t xml:space="preserve"> </w:t>
+      </w:r>
+      <w:hyperlink r:id="rId273">
+        <w:r>
+          <w:rPr>
+            <w:rStyle w:val="Hyperlink"/>
+          </w:rPr>
+          <w:t xml:space="preserve">https://code.claude.com/docs/en/sandboxing</w:t>
+        </w:r>
+      </w:hyperlink>
+      <w:r>
+        <w:t xml:space="preserve">.</w:t>
+      </w:r>
+    </w:p>
+    <w:bookmarkEnd w:id="274"/>
+    <w:bookmarkStart w:id="276" w:name="ref-claude_code_discover_plugins"/>
+    <w:p>
+      <w:pPr>
+        <w:pStyle w:val="Bibliography"/>
+      </w:pPr>
+      <w:r>
+        <w:t xml:space="preserve">Anthropic. 2026g.</w:t>
+      </w:r>
+      <w:r>
+        <w:t xml:space="preserve"> </w:t>
+      </w:r>
+      <w:r>
+        <w:rPr>
+          <w:i/>
+          <w:iCs/>
+        </w:rPr>
         <w:t xml:space="preserve">Discover and Install Prebuilt Plugins Through Marketplaces</w:t>
       </w:r>
       <w:r>
@@ -43832,7 +44970,7 @@
       <w:r>
         <w:t xml:space="preserve"> </w:t>
       </w:r>
-      <w:hyperlink r:id="rId269">
+      <w:hyperlink r:id="rId275">
         <w:r>
           <w:rPr>
             <w:rStyle w:val="Hyperlink"/>
@@ -43844,14 +44982,14 @@
         <w:t xml:space="preserve">.</w:t>
       </w:r>
     </w:p>
-    <w:bookmarkEnd w:id="270"/>
-    <w:bookmarkStart w:id="272" w:name="ref-ralph_loop_plugin"/>
+    <w:bookmarkEnd w:id="276"/>
+    <w:bookmarkStart w:id="278" w:name="ref-ralph_loop_plugin"/>
     <w:p>
       <w:pPr>
         <w:pStyle w:val="Bibliography"/>
       </w:pPr>
       <w:r>
-        <w:t xml:space="preserve">Anthropic. 2026f.</w:t>
+        <w:t xml:space="preserve">Anthropic. 2026h.</w:t>
       </w:r>
       <w:r>
         <w:t xml:space="preserve"> </w:t>
@@ -43869,7 +45007,7 @@
       <w:r>
         <w:t xml:space="preserve"> </w:t>
       </w:r>
-      <w:hyperlink r:id="rId271">
+      <w:hyperlink r:id="rId277">
         <w:r>
           <w:rPr>
             <w:rStyle w:val="Hyperlink"/>
@@ -43881,14 +45019,14 @@
         <w:t xml:space="preserve">.</w:t>
       </w:r>
     </w:p>
-    <w:bookmarkEnd w:id="272"/>
-    <w:bookmarkStart w:id="274" w:name="ref-coles_herdr"/>
+    <w:bookmarkEnd w:id="278"/>
+    <w:bookmarkStart w:id="279" w:name="ref-claude_code_settings"/>
     <w:p>
       <w:pPr>
         <w:pStyle w:val="Bibliography"/>
       </w:pPr>
       <w:r>
-        <w:t xml:space="preserve">Coles, Matt. 2026.</w:t>
+        <w:t xml:space="preserve">Anthropic. 2026i.</w:t>
       </w:r>
       <w:r>
         <w:t xml:space="preserve"> </w:t>
@@ -43898,6 +45036,43 @@
           <w:i/>
           <w:iCs/>
         </w:rPr>
+        <w:t xml:space="preserve">Settings Files and Precedence</w:t>
+      </w:r>
+      <w:r>
+        <w:t xml:space="preserve">. Documentation.</w:t>
+      </w:r>
+      <w:r>
+        <w:t xml:space="preserve"> </w:t>
+      </w:r>
+      <w:hyperlink r:id="rId114">
+        <w:r>
+          <w:rPr>
+            <w:rStyle w:val="Hyperlink"/>
+          </w:rPr>
+          <w:t xml:space="preserve">https://code.claude.com/docs/en/settings</w:t>
+        </w:r>
+      </w:hyperlink>
+      <w:r>
+        <w:t xml:space="preserve">.</w:t>
+      </w:r>
+    </w:p>
+    <w:bookmarkEnd w:id="279"/>
+    <w:bookmarkStart w:id="281" w:name="ref-coles_herdr"/>
+    <w:p>
+      <w:pPr>
+        <w:pStyle w:val="Bibliography"/>
+      </w:pPr>
+      <w:r>
+        <w:t xml:space="preserve">Coles, Matt. 2026.</w:t>
+      </w:r>
+      <w:r>
+        <w:t xml:space="preserve"> </w:t>
+      </w:r>
+      <w:r>
+        <w:rPr>
+          <w:i/>
+          <w:iCs/>
+        </w:rPr>
         <w:t xml:space="preserve">Herding Parallel Agents on a Remote Box with Herdr</w:t>
       </w:r>
       <w:r>
@@ -43906,7 +45081,7 @@
       <w:r>
         <w:t xml:space="preserve"> </w:t>
       </w:r>
-      <w:hyperlink r:id="rId273">
+      <w:hyperlink r:id="rId280">
         <w:r>
           <w:rPr>
             <w:rStyle w:val="Hyperlink"/>
@@ -43918,8 +45093,8 @@
         <w:t xml:space="preserve">.</w:t>
       </w:r>
     </w:p>
-    <w:bookmarkEnd w:id="274"/>
-    <w:bookmarkStart w:id="276" w:name="ref-flaviocopes_herdr"/>
+    <w:bookmarkEnd w:id="281"/>
+    <w:bookmarkStart w:id="283" w:name="ref-flaviocopes_herdr"/>
     <w:p>
       <w:pPr>
         <w:pStyle w:val="Bibliography"/>
@@ -43943,7 +45118,7 @@
       <w:r>
         <w:t xml:space="preserve"> </w:t>
       </w:r>
-      <w:hyperlink r:id="rId275">
+      <w:hyperlink r:id="rId282">
         <w:r>
           <w:rPr>
             <w:rStyle w:val="Hyperlink"/>
@@ -43955,8 +45130,8 @@
         <w:t xml:space="preserve">.</w:t>
       </w:r>
     </w:p>
-    <w:bookmarkEnd w:id="276"/>
-    <w:bookmarkStart w:id="277" w:name="ref-databricks_fmapi_limits"/>
+    <w:bookmarkEnd w:id="283"/>
+    <w:bookmarkStart w:id="284" w:name="ref-databricks_fmapi_limits"/>
     <w:p>
       <w:pPr>
         <w:pStyle w:val="Bibliography"/>
@@ -43992,8 +45167,8 @@
         <w:t xml:space="preserve">.</w:t>
       </w:r>
     </w:p>
-    <w:bookmarkEnd w:id="277"/>
-    <w:bookmarkStart w:id="278" w:name="ref-databricks_supported_models"/>
+    <w:bookmarkEnd w:id="284"/>
+    <w:bookmarkStart w:id="285" w:name="ref-databricks_supported_models"/>
     <w:p>
       <w:pPr>
         <w:pStyle w:val="Bibliography"/>
@@ -44029,8 +45204,8 @@
         <w:t xml:space="preserve">.</w:t>
       </w:r>
     </w:p>
-    <w:bookmarkEnd w:id="278"/>
-    <w:bookmarkStart w:id="280" w:name="ref-herdr_hn"/>
+    <w:bookmarkEnd w:id="285"/>
+    <w:bookmarkStart w:id="287" w:name="ref-herdr_hn"/>
     <w:p>
       <w:pPr>
         <w:pStyle w:val="Bibliography"/>
@@ -44054,7 +45229,7 @@
       <w:r>
         <w:t xml:space="preserve"> </w:t>
       </w:r>
-      <w:hyperlink r:id="rId279">
+      <w:hyperlink r:id="rId286">
         <w:r>
           <w:rPr>
             <w:rStyle w:val="Hyperlink"/>
@@ -44066,8 +45241,8 @@
         <w:t xml:space="preserve">.</w:t>
       </w:r>
     </w:p>
-    <w:bookmarkEnd w:id="280"/>
-    <w:bookmarkStart w:id="282" w:name="ref-herdr_agents"/>
+    <w:bookmarkEnd w:id="287"/>
+    <w:bookmarkStart w:id="289" w:name="ref-herdr_agents"/>
     <w:p>
       <w:pPr>
         <w:pStyle w:val="Bibliography"/>
@@ -44094,7 +45269,7 @@
       <w:r>
         <w:t xml:space="preserve"> </w:t>
       </w:r>
-      <w:hyperlink r:id="rId281">
+      <w:hyperlink r:id="rId288">
         <w:r>
           <w:rPr>
             <w:rStyle w:val="Hyperlink"/>
@@ -44106,8 +45281,8 @@
         <w:t xml:space="preserve">.</w:t>
       </w:r>
     </w:p>
-    <w:bookmarkEnd w:id="282"/>
-    <w:bookmarkStart w:id="284" w:name="ref-herdr_concepts"/>
+    <w:bookmarkEnd w:id="289"/>
+    <w:bookmarkStart w:id="291" w:name="ref-herdr_concepts"/>
     <w:p>
       <w:pPr>
         <w:pStyle w:val="Bibliography"/>
@@ -44134,7 +45309,7 @@
       <w:r>
         <w:t xml:space="preserve"> </w:t>
       </w:r>
-      <w:hyperlink r:id="rId283">
+      <w:hyperlink r:id="rId290">
         <w:r>
           <w:rPr>
             <w:rStyle w:val="Hyperlink"/>
@@ -44146,8 +45321,8 @@
         <w:t xml:space="preserve">.</w:t>
       </w:r>
     </w:p>
-    <w:bookmarkEnd w:id="284"/>
-    <w:bookmarkStart w:id="286" w:name="ref-herdr_machines"/>
+    <w:bookmarkEnd w:id="291"/>
+    <w:bookmarkStart w:id="293" w:name="ref-herdr_machines"/>
     <w:p>
       <w:pPr>
         <w:pStyle w:val="Bibliography"/>
@@ -44174,7 +45349,7 @@
       <w:r>
         <w:t xml:space="preserve"> </w:t>
       </w:r>
-      <w:hyperlink r:id="rId285">
+      <w:hyperlink r:id="rId292">
         <w:r>
           <w:rPr>
             <w:rStyle w:val="Hyperlink"/>
@@ -44186,8 +45361,8 @@
         <w:t xml:space="preserve">.</w:t>
       </w:r>
     </w:p>
-    <w:bookmarkEnd w:id="286"/>
-    <w:bookmarkStart w:id="287" w:name="ref-herdr_agent_guide"/>
+    <w:bookmarkEnd w:id="293"/>
+    <w:bookmarkStart w:id="294" w:name="ref-herdr_agent_guide"/>
     <w:p>
       <w:pPr>
         <w:pStyle w:val="Bibliography"/>
@@ -44226,8 +45401,8 @@
         <w:t xml:space="preserve">.</w:t>
       </w:r>
     </w:p>
-    <w:bookmarkEnd w:id="287"/>
-    <w:bookmarkStart w:id="288" w:name="ref-herdr"/>
+    <w:bookmarkEnd w:id="294"/>
+    <w:bookmarkStart w:id="295" w:name="ref-herdr"/>
     <w:p>
       <w:pPr>
         <w:pStyle w:val="Bibliography"/>
@@ -44266,8 +45441,8 @@
         <w:t xml:space="preserve">.</w:t>
       </w:r>
     </w:p>
-    <w:bookmarkEnd w:id="288"/>
-    <w:bookmarkStart w:id="289" w:name="ref-herdr_github"/>
+    <w:bookmarkEnd w:id="295"/>
+    <w:bookmarkStart w:id="296" w:name="ref-herdr_github"/>
     <w:p>
       <w:pPr>
         <w:pStyle w:val="Bibliography"/>
@@ -44306,8 +45481,8 @@
         <w:t xml:space="preserve">.</w:t>
       </w:r>
     </w:p>
-    <w:bookmarkEnd w:id="289"/>
-    <w:bookmarkStart w:id="291" w:name="ref-herdr_install"/>
+    <w:bookmarkEnd w:id="296"/>
+    <w:bookmarkStart w:id="298" w:name="ref-herdr_install"/>
     <w:p>
       <w:pPr>
         <w:pStyle w:val="Bibliography"/>
@@ -44334,7 +45509,7 @@
       <w:r>
         <w:t xml:space="preserve"> </w:t>
       </w:r>
-      <w:hyperlink r:id="rId290">
+      <w:hyperlink r:id="rId297">
         <w:r>
           <w:rPr>
             <w:rStyle w:val="Hyperlink"/>
@@ -44346,8 +45521,8 @@
         <w:t xml:space="preserve">.</w:t>
       </w:r>
     </w:p>
-    <w:bookmarkEnd w:id="291"/>
-    <w:bookmarkStart w:id="293" w:name="ref-herdr_session_state"/>
+    <w:bookmarkEnd w:id="298"/>
+    <w:bookmarkStart w:id="300" w:name="ref-herdr_session_state"/>
     <w:p>
       <w:pPr>
         <w:pStyle w:val="Bibliography"/>
@@ -44374,7 +45549,7 @@
       <w:r>
         <w:t xml:space="preserve"> </w:t>
       </w:r>
-      <w:hyperlink r:id="rId292">
+      <w:hyperlink r:id="rId299">
         <w:r>
           <w:rPr>
             <w:rStyle w:val="Hyperlink"/>
@@ -44386,8 +45561,8 @@
         <w:t xml:space="preserve">.</w:t>
       </w:r>
     </w:p>
-    <w:bookmarkEnd w:id="293"/>
-    <w:bookmarkStart w:id="295" w:name="ref-herdr_socket_api"/>
+    <w:bookmarkEnd w:id="300"/>
+    <w:bookmarkStart w:id="302" w:name="ref-herdr_socket_api"/>
     <w:p>
       <w:pPr>
         <w:pStyle w:val="Bibliography"/>
@@ -44414,7 +45589,7 @@
       <w:r>
         <w:t xml:space="preserve"> </w:t>
       </w:r>
-      <w:hyperlink r:id="rId294">
+      <w:hyperlink r:id="rId301">
         <w:r>
           <w:rPr>
             <w:rStyle w:val="Hyperlink"/>
@@ -44426,8 +45601,8 @@
         <w:t xml:space="preserve">.</w:t>
       </w:r>
     </w:p>
-    <w:bookmarkEnd w:id="295"/>
-    <w:bookmarkStart w:id="297" w:name="ref-ghuntley_ralph"/>
+    <w:bookmarkEnd w:id="302"/>
+    <w:bookmarkStart w:id="304" w:name="ref-ghuntley_ralph"/>
     <w:p>
       <w:pPr>
         <w:pStyle w:val="Bibliography"/>
@@ -44451,7 +45626,7 @@
       <w:r>
         <w:t xml:space="preserve"> </w:t>
       </w:r>
-      <w:hyperlink r:id="rId296">
+      <w:hyperlink r:id="rId303">
         <w:r>
           <w:rPr>
             <w:rStyle w:val="Hyperlink"/>
@@ -44463,8 +45638,8 @@
         <w:t xml:space="preserve">.</w:t>
       </w:r>
     </w:p>
-    <w:bookmarkEnd w:id="297"/>
-    <w:bookmarkStart w:id="299" w:name="ref-awesome_herdr"/>
+    <w:bookmarkEnd w:id="304"/>
+    <w:bookmarkStart w:id="306" w:name="ref-awesome_herdr"/>
     <w:p>
       <w:pPr>
         <w:pStyle w:val="Bibliography"/>
@@ -44488,7 +45663,7 @@
       <w:r>
         <w:t xml:space="preserve"> </w:t>
       </w:r>
-      <w:hyperlink r:id="rId298">
+      <w:hyperlink r:id="rId305">
         <w:r>
           <w:rPr>
             <w:rStyle w:val="Hyperlink"/>
@@ -44500,8 +45675,8 @@
         <w:t xml:space="preserve">.</w:t>
       </w:r>
     </w:p>
-    <w:bookmarkEnd w:id="299"/>
-    <w:bookmarkStart w:id="300" w:name="ref-ai_config_readme"/>
+    <w:bookmarkEnd w:id="306"/>
+    <w:bookmarkStart w:id="307" w:name="ref-ai_config_readme"/>
     <w:p>
       <w:pPr>
         <w:pStyle w:val="Bibliography"/>
@@ -44537,8 +45712,8 @@
         <w:t xml:space="preserve">.</w:t>
       </w:r>
     </w:p>
-    <w:bookmarkEnd w:id="300"/>
-    <w:bookmarkStart w:id="302" w:name="ref-ai_config_delegate_to_codex"/>
+    <w:bookmarkEnd w:id="307"/>
+    <w:bookmarkStart w:id="309" w:name="ref-ai_config_delegate_to_codex"/>
     <w:p>
       <w:pPr>
         <w:pStyle w:val="Bibliography"/>
@@ -44576,7 +45751,7 @@
       <w:r>
         <w:t xml:space="preserve"> </w:t>
       </w:r>
-      <w:hyperlink r:id="rId301">
+      <w:hyperlink r:id="rId308">
         <w:r>
           <w:rPr>
             <w:rStyle w:val="Hyperlink"/>
@@ -44588,8 +45763,8 @@
         <w:t xml:space="preserve">.</w:t>
       </w:r>
     </w:p>
-    <w:bookmarkEnd w:id="302"/>
-    <w:bookmarkStart w:id="304" w:name="ref-stats_allowlist_pr6"/>
+    <w:bookmarkEnd w:id="309"/>
+    <w:bookmarkStart w:id="311" w:name="ref-stats_allowlist_pr6"/>
     <w:p>
       <w:pPr>
         <w:pStyle w:val="Bibliography"/>
@@ -44613,7 +45788,7 @@
       <w:r>
         <w:t xml:space="preserve"> </w:t>
       </w:r>
-      <w:hyperlink r:id="rId303">
+      <w:hyperlink r:id="rId310">
         <w:r>
           <w:rPr>
             <w:rStyle w:val="Hyperlink"/>
@@ -44625,8 +45800,8 @@
         <w:t xml:space="preserve">.</w:t>
       </w:r>
     </w:p>
-    <w:bookmarkEnd w:id="304"/>
-    <w:bookmarkStart w:id="305" w:name="ref-stats_allowlist"/>
+    <w:bookmarkEnd w:id="311"/>
+    <w:bookmarkStart w:id="312" w:name="ref-stats_allowlist"/>
     <w:p>
       <w:pPr>
         <w:pStyle w:val="Bibliography"/>
@@ -44662,8 +45837,8 @@
         <w:t xml:space="preserve">.</w:t>
       </w:r>
     </w:p>
-    <w:bookmarkEnd w:id="305"/>
-    <w:bookmarkStart w:id="306" w:name="ref-codex_plugin_cc"/>
+    <w:bookmarkEnd w:id="312"/>
+    <w:bookmarkStart w:id="313" w:name="ref-codex_plugin_cc"/>
     <w:p>
       <w:pPr>
         <w:pStyle w:val="Bibliography"/>
@@ -44713,8 +45888,8 @@
         <w:t xml:space="preserve">.</w:t>
       </w:r>
     </w:p>
-    <w:bookmarkEnd w:id="306"/>
-    <w:bookmarkStart w:id="308" w:name="ref-codex_pricing"/>
+    <w:bookmarkEnd w:id="313"/>
+    <w:bookmarkStart w:id="315" w:name="ref-codex_pricing"/>
     <w:p>
       <w:pPr>
         <w:pStyle w:val="Bibliography"/>
@@ -44738,7 +45913,7 @@
       <w:r>
         <w:t xml:space="preserve"> </w:t>
       </w:r>
-      <w:hyperlink r:id="rId307">
+      <w:hyperlink r:id="rId314">
         <w:r>
           <w:rPr>
             <w:rStyle w:val="Hyperlink"/>
@@ -44750,8 +45925,8 @@
         <w:t xml:space="preserve">.</w:t>
       </w:r>
     </w:p>
-    <w:bookmarkEnd w:id="308"/>
-    <w:bookmarkStart w:id="309" w:name="ref-posit_dev_ai_lib"/>
+    <w:bookmarkEnd w:id="315"/>
+    <w:bookmarkStart w:id="316" w:name="ref-posit_dev_ai_lib"/>
     <w:p>
       <w:pPr>
         <w:pStyle w:val="Bibliography"/>
@@ -44787,8 +45962,8 @@
         <w:t xml:space="preserve">.</w:t>
       </w:r>
     </w:p>
-    <w:bookmarkEnd w:id="309"/>
-    <w:bookmarkStart w:id="310" w:name="ref-posit_dev_assistant_feedback"/>
+    <w:bookmarkEnd w:id="316"/>
+    <w:bookmarkStart w:id="317" w:name="ref-posit_dev_assistant_feedback"/>
     <w:p>
       <w:pPr>
         <w:pStyle w:val="Bibliography"/>
@@ -44824,8 +45999,8 @@
         <w:t xml:space="preserve">.</w:t>
       </w:r>
     </w:p>
-    <w:bookmarkEnd w:id="310"/>
-    <w:bookmarkStart w:id="311" w:name="ref-posit_dev_bluffbench2"/>
+    <w:bookmarkEnd w:id="317"/>
+    <w:bookmarkStart w:id="318" w:name="ref-posit_dev_bluffbench2"/>
     <w:p>
       <w:pPr>
         <w:pStyle w:val="Bibliography"/>
@@ -44861,8 +46036,8 @@
         <w:t xml:space="preserve">.</w:t>
       </w:r>
     </w:p>
-    <w:bookmarkEnd w:id="311"/>
-    <w:bookmarkStart w:id="312" w:name="ref-posit_dev_btw"/>
+    <w:bookmarkEnd w:id="318"/>
+    <w:bookmarkStart w:id="319" w:name="ref-posit_dev_btw"/>
     <w:p>
       <w:pPr>
         <w:pStyle w:val="Bibliography"/>
@@ -44898,8 +46073,8 @@
         <w:t xml:space="preserve">.</w:t>
       </w:r>
     </w:p>
-    <w:bookmarkEnd w:id="312"/>
-    <w:bookmarkStart w:id="313" w:name="ref-posit_dev_chatlas"/>
+    <w:bookmarkEnd w:id="319"/>
+    <w:bookmarkStart w:id="320" w:name="ref-posit_dev_chatlas"/>
     <w:p>
       <w:pPr>
         <w:pStyle w:val="Bibliography"/>
@@ -44935,8 +46110,8 @@
         <w:t xml:space="preserve">.</w:t>
       </w:r>
     </w:p>
-    <w:bookmarkEnd w:id="313"/>
-    <w:bookmarkStart w:id="314" w:name="ref-posit_dev_code_index"/>
+    <w:bookmarkEnd w:id="320"/>
+    <w:bookmarkStart w:id="321" w:name="ref-posit_dev_code_index"/>
     <w:p>
       <w:pPr>
         <w:pStyle w:val="Bibliography"/>
@@ -44972,8 +46147,8 @@
         <w:t xml:space="preserve">.</w:t>
       </w:r>
     </w:p>
-    <w:bookmarkEnd w:id="314"/>
-    <w:bookmarkStart w:id="315" w:name="ref-posit_dev_commons"/>
+    <w:bookmarkEnd w:id="321"/>
+    <w:bookmarkStart w:id="322" w:name="ref-posit_dev_commons"/>
     <w:p>
       <w:pPr>
         <w:pStyle w:val="Bibliography"/>
@@ -45009,8 +46184,8 @@
         <w:t xml:space="preserve">.</w:t>
       </w:r>
     </w:p>
-    <w:bookmarkEnd w:id="315"/>
-    <w:bookmarkStart w:id="316" w:name="ref-posit_dev_mcp_repl"/>
+    <w:bookmarkEnd w:id="322"/>
+    <w:bookmarkStart w:id="323" w:name="ref-posit_dev_mcp_repl"/>
     <w:p>
       <w:pPr>
         <w:pStyle w:val="Bibliography"/>
@@ -45046,8 +46221,8 @@
         <w:t xml:space="preserve">.</w:t>
       </w:r>
     </w:p>
-    <w:bookmarkEnd w:id="316"/>
-    <w:bookmarkStart w:id="317" w:name="ref-posit_dev_mcptools"/>
+    <w:bookmarkEnd w:id="323"/>
+    <w:bookmarkStart w:id="324" w:name="ref-posit_dev_mcptools"/>
     <w:p>
       <w:pPr>
         <w:pStyle w:val="Bibliography"/>
@@ -45083,8 +46258,8 @@
         <w:t xml:space="preserve">.</w:t>
       </w:r>
     </w:p>
-    <w:bookmarkEnd w:id="317"/>
-    <w:bookmarkStart w:id="318" w:name="ref-posit_dev_nesevals"/>
+    <w:bookmarkEnd w:id="324"/>
+    <w:bookmarkStart w:id="325" w:name="ref-posit_dev_nesevals"/>
     <w:p>
       <w:pPr>
         <w:pStyle w:val="Bibliography"/>
@@ -45120,8 +46295,8 @@
         <w:t xml:space="preserve">.</w:t>
       </w:r>
     </w:p>
-    <w:bookmarkEnd w:id="318"/>
-    <w:bookmarkStart w:id="319" w:name="ref-posit_dev_positron"/>
+    <w:bookmarkEnd w:id="325"/>
+    <w:bookmarkStart w:id="326" w:name="ref-posit_dev_positron"/>
     <w:p>
       <w:pPr>
         <w:pStyle w:val="Bibliography"/>
@@ -45157,8 +46332,8 @@
         <w:t xml:space="preserve">.</w:t>
       </w:r>
     </w:p>
-    <w:bookmarkEnd w:id="319"/>
-    <w:bookmarkStart w:id="320" w:name="ref-posit_dev_positron_copilot_chat"/>
+    <w:bookmarkEnd w:id="326"/>
+    <w:bookmarkStart w:id="327" w:name="ref-posit_dev_positron_copilot_chat"/>
     <w:p>
       <w:pPr>
         <w:pStyle w:val="Bibliography"/>
@@ -45194,8 +46369,8 @@
         <w:t xml:space="preserve">.</w:t>
       </w:r>
     </w:p>
-    <w:bookmarkEnd w:id="320"/>
-    <w:bookmarkStart w:id="321" w:name="ref-posit_dev_querychat"/>
+    <w:bookmarkEnd w:id="327"/>
+    <w:bookmarkStart w:id="328" w:name="ref-posit_dev_querychat"/>
     <w:p>
       <w:pPr>
         <w:pStyle w:val="Bibliography"/>
@@ -45231,8 +46406,8 @@
         <w:t xml:space="preserve">.</w:t>
       </w:r>
     </w:p>
-    <w:bookmarkEnd w:id="321"/>
-    <w:bookmarkStart w:id="322" w:name="ref-posit_dev_raghilda"/>
+    <w:bookmarkEnd w:id="328"/>
+    <w:bookmarkStart w:id="329" w:name="ref-posit_dev_raghilda"/>
     <w:p>
       <w:pPr>
         <w:pStyle w:val="Bibliography"/>
@@ -45268,8 +46443,8 @@
         <w:t xml:space="preserve">.</w:t>
       </w:r>
     </w:p>
-    <w:bookmarkEnd w:id="322"/>
-    <w:bookmarkStart w:id="323" w:name="ref-posit_dev_shiny_assistant"/>
+    <w:bookmarkEnd w:id="329"/>
+    <w:bookmarkStart w:id="330" w:name="ref-posit_dev_shiny_assistant"/>
     <w:p>
       <w:pPr>
         <w:pStyle w:val="Bibliography"/>
@@ -45305,8 +46480,8 @@
         <w:t xml:space="preserve">.</w:t>
       </w:r>
     </w:p>
-    <w:bookmarkEnd w:id="323"/>
-    <w:bookmarkStart w:id="324" w:name="ref-posit_dev_shinychat"/>
+    <w:bookmarkEnd w:id="330"/>
+    <w:bookmarkStart w:id="331" w:name="ref-posit_dev_shinychat"/>
     <w:p>
       <w:pPr>
         <w:pStyle w:val="Bibliography"/>
@@ -45342,8 +46517,8 @@
         <w:t xml:space="preserve">.</w:t>
       </w:r>
     </w:p>
-    <w:bookmarkEnd w:id="324"/>
-    <w:bookmarkStart w:id="325" w:name="ref-posit_dev_shinyrealtime"/>
+    <w:bookmarkEnd w:id="331"/>
+    <w:bookmarkStart w:id="332" w:name="ref-posit_dev_shinyrealtime"/>
     <w:p>
       <w:pPr>
         <w:pStyle w:val="Bibliography"/>
@@ -45379,8 +46554,8 @@
         <w:t xml:space="preserve">.</w:t>
       </w:r>
     </w:p>
-    <w:bookmarkEnd w:id="325"/>
-    <w:bookmarkStart w:id="327" w:name="ref-tessl_docs_core_concepts"/>
+    <w:bookmarkEnd w:id="332"/>
+    <w:bookmarkStart w:id="334" w:name="ref-tessl_docs_core_concepts"/>
     <w:p>
       <w:pPr>
         <w:pStyle w:val="Bibliography"/>
@@ -45404,7 +46579,7 @@
       <w:r>
         <w:t xml:space="preserve"> </w:t>
       </w:r>
-      <w:hyperlink r:id="rId326">
+      <w:hyperlink r:id="rId333">
         <w:r>
           <w:rPr>
             <w:rStyle w:val="Hyperlink"/>
@@ -45416,8 +46591,8 @@
         <w:t xml:space="preserve">.</w:t>
       </w:r>
     </w:p>
-    <w:bookmarkEnd w:id="327"/>
-    <w:bookmarkStart w:id="329" w:name="ref-tessl_docs_installation"/>
+    <w:bookmarkEnd w:id="334"/>
+    <w:bookmarkStart w:id="336" w:name="ref-tessl_docs_installation"/>
     <w:p>
       <w:pPr>
         <w:pStyle w:val="Bibliography"/>
@@ -45441,7 +46616,7 @@
       <w:r>
         <w:t xml:space="preserve"> </w:t>
       </w:r>
-      <w:hyperlink r:id="rId328">
+      <w:hyperlink r:id="rId335">
         <w:r>
           <w:rPr>
             <w:rStyle w:val="Hyperlink"/>
@@ -45453,8 +46628,8 @@
         <w:t xml:space="preserve">.</w:t>
       </w:r>
     </w:p>
-    <w:bookmarkEnd w:id="329"/>
-    <w:bookmarkStart w:id="331" w:name="ref-tessl_docs_security"/>
+    <w:bookmarkEnd w:id="336"/>
+    <w:bookmarkStart w:id="338" w:name="ref-tessl_docs_security"/>
     <w:p>
       <w:pPr>
         <w:pStyle w:val="Bibliography"/>
@@ -45478,7 +46653,7 @@
       <w:r>
         <w:t xml:space="preserve"> </w:t>
       </w:r>
-      <w:hyperlink r:id="rId330">
+      <w:hyperlink r:id="rId337">
         <w:r>
           <w:rPr>
             <w:rStyle w:val="Hyperlink"/>
@@ -45490,8 +46665,8 @@
         <w:t xml:space="preserve">.</w:t>
       </w:r>
     </w:p>
-    <w:bookmarkEnd w:id="331"/>
-    <w:bookmarkStart w:id="333" w:name="ref-tessl_docs_usage_data"/>
+    <w:bookmarkEnd w:id="338"/>
+    <w:bookmarkStart w:id="340" w:name="ref-tessl_docs_usage_data"/>
     <w:p>
       <w:pPr>
         <w:pStyle w:val="Bibliography"/>
@@ -45515,7 +46690,7 @@
       <w:r>
         <w:t xml:space="preserve"> </w:t>
       </w:r>
-      <w:hyperlink r:id="rId332">
+      <w:hyperlink r:id="rId339">
         <w:r>
           <w:rPr>
             <w:rStyle w:val="Hyperlink"/>
@@ -45527,8 +46702,8 @@
         <w:t xml:space="preserve">.</w:t>
       </w:r>
     </w:p>
-    <w:bookmarkEnd w:id="333"/>
-    <w:bookmarkStart w:id="335" w:name="ref-tessl_docs_supported_platforms"/>
+    <w:bookmarkEnd w:id="340"/>
+    <w:bookmarkStart w:id="342" w:name="ref-tessl_docs_supported_platforms"/>
     <w:p>
       <w:pPr>
         <w:pStyle w:val="Bibliography"/>
@@ -45552,7 +46727,7 @@
       <w:r>
         <w:t xml:space="preserve"> </w:t>
       </w:r>
-      <w:hyperlink r:id="rId334">
+      <w:hyperlink r:id="rId341">
         <w:r>
           <w:rPr>
             <w:rStyle w:val="Hyperlink"/>
@@ -45564,8 +46739,8 @@
         <w:t xml:space="preserve">.</w:t>
       </w:r>
     </w:p>
-    <w:bookmarkEnd w:id="335"/>
-    <w:bookmarkStart w:id="337" w:name="ref-tessl_docs_faqs"/>
+    <w:bookmarkEnd w:id="342"/>
+    <w:bookmarkStart w:id="344" w:name="ref-tessl_docs_faqs"/>
     <w:p>
       <w:pPr>
         <w:pStyle w:val="Bibliography"/>
@@ -45589,7 +46764,7 @@
       <w:r>
         <w:t xml:space="preserve"> </w:t>
       </w:r>
-      <w:hyperlink r:id="rId336">
+      <w:hyperlink r:id="rId343">
         <w:r>
           <w:rPr>
             <w:rStyle w:val="Hyperlink"/>
@@ -45601,8 +46776,8 @@
         <w:t xml:space="preserve">.</w:t>
       </w:r>
     </w:p>
-    <w:bookmarkEnd w:id="337"/>
-    <w:bookmarkStart w:id="339" w:name="ref-tessl_pricing"/>
+    <w:bookmarkEnd w:id="344"/>
+    <w:bookmarkStart w:id="346" w:name="ref-tessl_pricing"/>
     <w:p>
       <w:pPr>
         <w:pStyle w:val="Bibliography"/>
@@ -45626,7 +46801,7 @@
       <w:r>
         <w:t xml:space="preserve"> </w:t>
       </w:r>
-      <w:hyperlink r:id="rId338">
+      <w:hyperlink r:id="rId345">
         <w:r>
           <w:rPr>
             <w:rStyle w:val="Hyperlink"/>
@@ -45638,8 +46813,8 @@
         <w:t xml:space="preserve">.</w:t>
       </w:r>
     </w:p>
-    <w:bookmarkEnd w:id="339"/>
-    <w:bookmarkStart w:id="341" w:name="ref-tessl_registry"/>
+    <w:bookmarkEnd w:id="346"/>
+    <w:bookmarkStart w:id="348" w:name="ref-tessl_registry"/>
     <w:p>
       <w:pPr>
         <w:pStyle w:val="Bibliography"/>
@@ -45663,7 +46838,7 @@
       <w:r>
         <w:t xml:space="preserve"> </w:t>
       </w:r>
-      <w:hyperlink r:id="rId340">
+      <w:hyperlink r:id="rId347">
         <w:r>
           <w:rPr>
             <w:rStyle w:val="Hyperlink"/>
@@ -45675,8 +46850,8 @@
         <w:t xml:space="preserve">.</w:t>
       </w:r>
     </w:p>
-    <w:bookmarkEnd w:id="341"/>
-    <w:bookmarkStart w:id="342" w:name="ref-tessl_home"/>
+    <w:bookmarkEnd w:id="348"/>
+    <w:bookmarkStart w:id="349" w:name="ref-tessl_home"/>
     <w:p>
       <w:pPr>
         <w:pStyle w:val="Bibliography"/>
@@ -45712,8 +46887,8 @@
         <w:t xml:space="preserve">.</w:t>
       </w:r>
     </w:p>
-    <w:bookmarkEnd w:id="342"/>
-    <w:bookmarkStart w:id="344" w:name="ref-tessl_docs_package_manager"/>
+    <w:bookmarkEnd w:id="349"/>
+    <w:bookmarkStart w:id="351" w:name="ref-tessl_docs_package_manager"/>
     <w:p>
       <w:pPr>
         <w:pStyle w:val="Bibliography"/>
@@ -45737,7 +46912,7 @@
       <w:r>
         <w:t xml:space="preserve"> </w:t>
       </w:r>
-      <w:hyperlink r:id="rId343">
+      <w:hyperlink r:id="rId350">
         <w:r>
           <w:rPr>
             <w:rStyle w:val="Hyperlink"/>
@@ -45749,8 +46924,8 @@
         <w:t xml:space="preserve">.</w:t>
       </w:r>
     </w:p>
-    <w:bookmarkEnd w:id="344"/>
-    <w:bookmarkStart w:id="346" w:name="ref-tessl_docs_overview"/>
+    <w:bookmarkEnd w:id="351"/>
+    <w:bookmarkStart w:id="353" w:name="ref-tessl_docs_overview"/>
     <w:p>
       <w:pPr>
         <w:pStyle w:val="Bibliography"/>
@@ -45774,7 +46949,7 @@
       <w:r>
         <w:t xml:space="preserve"> </w:t>
       </w:r>
-      <w:hyperlink r:id="rId345">
+      <w:hyperlink r:id="rId352">
         <w:r>
           <w:rPr>
             <w:rStyle w:val="Hyperlink"/>
@@ -45786,8 +46961,8 @@
         <w:t xml:space="preserve">.</w:t>
       </w:r>
     </w:p>
-    <w:bookmarkEnd w:id="346"/>
-    <w:bookmarkStart w:id="347" w:name="ref-obra_superpowers"/>
+    <w:bookmarkEnd w:id="353"/>
+    <w:bookmarkStart w:id="354" w:name="ref-obra_superpowers"/>
     <w:p>
       <w:pPr>
         <w:pStyle w:val="Bibliography"/>
@@ -45823,8 +46998,8 @@
         <w:t xml:space="preserve">.</w:t>
       </w:r>
     </w:p>
-    <w:bookmarkEnd w:id="347"/>
-    <w:bookmarkStart w:id="349" w:name="ref-herdr_yc"/>
+    <w:bookmarkEnd w:id="354"/>
+    <w:bookmarkStart w:id="356" w:name="ref-herdr_yc"/>
     <w:p>
       <w:pPr>
         <w:pStyle w:val="Bibliography"/>
@@ -45848,7 +47023,7 @@
       <w:r>
         <w:t xml:space="preserve"> </w:t>
       </w:r>
-      <w:hyperlink r:id="rId348">
+      <w:hyperlink r:id="rId355">
         <w:r>
           <w:rPr>
             <w:rStyle w:val="Hyperlink"/>
@@ -45860,9 +47035,9 @@
         <w:t xml:space="preserve">.</w:t>
       </w:r>
     </w:p>
-    <w:bookmarkEnd w:id="349"/>
-    <w:bookmarkEnd w:id="350"/>
-    <w:bookmarkEnd w:id="351"/>
+    <w:bookmarkEnd w:id="356"/>
+    <w:bookmarkEnd w:id="357"/>
+    <w:bookmarkEnd w:id="358"/>
     <w:sectPr>
       <w:footnotePr>
         <w:numRestart w:val="eachSect"/>
@@ -46729,6 +47904,39 @@
     <w:abstractNumId w:val="991"/>
   </w:num>
   <w:num w:numId="1099">
+    <w:abstractNumId w:val="991"/>
+  </w:num>
+  <w:num w:numId="1100">
+    <w:abstractNumId w:val="99411"/>
+    <w:lvlOverride w:ilvl="0">
+      <w:startOverride w:val="1"/>
+    </w:lvlOverride>
+    <w:lvlOverride w:ilvl="1">
+      <w:startOverride w:val="1"/>
+    </w:lvlOverride>
+    <w:lvlOverride w:ilvl="2">
+      <w:startOverride w:val="1"/>
+    </w:lvlOverride>
+    <w:lvlOverride w:ilvl="3">
+      <w:startOverride w:val="1"/>
+    </w:lvlOverride>
+    <w:lvlOverride w:ilvl="4">
+      <w:startOverride w:val="1"/>
+    </w:lvlOverride>
+    <w:lvlOverride w:ilvl="5">
+      <w:startOverride w:val="1"/>
+    </w:lvlOverride>
+    <w:lvlOverride w:ilvl="6">
+      <w:startOverride w:val="1"/>
+    </w:lvlOverride>
+    <w:lvlOverride w:ilvl="7">
+      <w:startOverride w:val="1"/>
+    </w:lvlOverride>
+    <w:lvlOverride w:ilvl="8">
+      <w:startOverride w:val="1"/>
+    </w:lvlOverride>
+  </w:num>
+  <w:num w:numId="1101">
     <w:abstractNumId w:val="991"/>
   </w:num>
 </w:numbering>

</xml_diff>

<commit_message>
Deploying to gh-pages from @ Morrison-Lab/wai@8da859b87859762c5d7b2965a0b683bae3eb7480 🚀
</commit_message>
<xml_diff>
--- a/chapters/agent-customization.docx
+++ b/chapters/agent-customization.docx
@@ -15,7 +15,7 @@
         <w:pStyle w:val="Date"/>
       </w:pPr>
       <w:r>
-        <w:t xml:space="preserve">Last modified: 2026-10-11 00:50:44 (PDT)</w:t>
+        <w:t xml:space="preserve">Last modified: 2026-10-12 00:37:16 (PDT)</w:t>
       </w:r>
     </w:p>
     <w:p>
@@ -42137,7 +42137,7 @@
     </w:p>
     <w:bookmarkEnd w:id="250"/>
     <w:bookmarkEnd w:id="251"/>
-    <w:bookmarkStart w:id="265" w:name="sec-ai-claude-cloud-env"/>
+    <w:bookmarkStart w:id="266" w:name="sec-ai-claude-cloud-env"/>
     <w:p>
       <w:pPr>
         <w:pStyle w:val="Heading1"/>
@@ -42593,7 +42593,7 @@
       </w:r>
     </w:p>
     <w:bookmarkEnd w:id="253"/>
-    <w:bookmarkStart w:id="262" w:name="sec-claude-network-access"/>
+    <w:bookmarkStart w:id="263" w:name="sec-claude-network-access"/>
     <w:p>
       <w:pPr>
         <w:pStyle w:val="Heading4"/>
@@ -43647,9 +43647,47 @@
       <w:r>
         <w:t xml:space="preserve">.</w:t>
       </w:r>
-    </w:p>
-    <w:bookmarkEnd w:id="262"/>
-    <w:bookmarkStart w:id="264" w:name="sec-claude-local-network"/>
+      <w:r>
+        <w:t xml:space="preserve"> </w:t>
+      </w:r>
+      <w:r>
+        <w:t xml:space="preserve">The same documentation covers</w:t>
+      </w:r>
+      <w:r>
+        <w:t xml:space="preserve"> </w:t>
+      </w:r>
+      <w:hyperlink r:id="rId262">
+        <w:r>
+          <w:rPr>
+            <w:rStyle w:val="Hyperlink"/>
+          </w:rPr>
+          <w:t xml:space="preserve">auto-fixing pull requests</w:t>
+        </w:r>
+      </w:hyperlink>
+      <w:r>
+        <w:t xml:space="preserve">,</w:t>
+      </w:r>
+      <w:r>
+        <w:t xml:space="preserve"> </w:t>
+      </w:r>
+      <w:r>
+        <w:t xml:space="preserve">where a cloud session watches a pull request’s failing checks and review comments,</w:t>
+      </w:r>
+      <w:r>
+        <w:t xml:space="preserve"> </w:t>
+      </w:r>
+      <w:r>
+        <w:t xml:space="preserve">pushes the fixes it is confident in,</w:t>
+      </w:r>
+      <w:r>
+        <w:t xml:space="preserve"> </w:t>
+      </w:r>
+      <w:r>
+        <w:t xml:space="preserve">and asks before acting on ambiguous requests.</w:t>
+      </w:r>
+    </w:p>
+    <w:bookmarkEnd w:id="263"/>
+    <w:bookmarkStart w:id="265" w:name="sec-claude-local-network"/>
     <w:p>
       <w:pPr>
         <w:pStyle w:val="Heading4"/>
@@ -44398,7 +44436,7 @@
       <w:r>
         <w:t xml:space="preserve"> </w:t>
       </w:r>
-      <w:hyperlink r:id="rId263">
+      <w:hyperlink r:id="rId264">
         <w:r>
           <w:rPr>
             <w:rStyle w:val="Hyperlink"/>
@@ -44684,9 +44722,9 @@
         <w:t xml:space="preserve">.</w:t>
       </w:r>
     </w:p>
-    <w:bookmarkEnd w:id="264"/>
     <w:bookmarkEnd w:id="265"/>
-    <w:bookmarkStart w:id="358" w:name="references"/>
+    <w:bookmarkEnd w:id="266"/>
+    <w:bookmarkStart w:id="359" w:name="references"/>
     <w:p>
       <w:pPr>
         <w:pStyle w:val="Heading1"/>
@@ -44695,8 +44733,8 @@
         <w:t xml:space="preserve">References</w:t>
       </w:r>
     </w:p>
-    <w:bookmarkStart w:id="357" w:name="refs"/>
-    <w:bookmarkStart w:id="266" w:name="ref-claude_code_demo_plugins"/>
+    <w:bookmarkStart w:id="358" w:name="refs"/>
+    <w:bookmarkStart w:id="267" w:name="ref-claude_code_demo_plugins"/>
     <w:p>
       <w:pPr>
         <w:pStyle w:val="Bibliography"/>
@@ -44732,8 +44770,8 @@
         <w:t xml:space="preserve">.</w:t>
       </w:r>
     </w:p>
-    <w:bookmarkEnd w:id="266"/>
-    <w:bookmarkStart w:id="267" w:name="ref-claude_plugins_official"/>
+    <w:bookmarkEnd w:id="267"/>
+    <w:bookmarkStart w:id="268" w:name="ref-claude_plugins_official"/>
     <w:p>
       <w:pPr>
         <w:pStyle w:val="Bibliography"/>
@@ -44769,8 +44807,8 @@
         <w:t xml:space="preserve">.</w:t>
       </w:r>
     </w:p>
-    <w:bookmarkEnd w:id="267"/>
-    <w:bookmarkStart w:id="268" w:name="ref-claude_plugins_community"/>
+    <w:bookmarkEnd w:id="268"/>
+    <w:bookmarkStart w:id="269" w:name="ref-claude_plugins_community"/>
     <w:p>
       <w:pPr>
         <w:pStyle w:val="Bibliography"/>
@@ -44806,8 +44844,8 @@
         <w:t xml:space="preserve">.</w:t>
       </w:r>
     </w:p>
-    <w:bookmarkEnd w:id="268"/>
-    <w:bookmarkStart w:id="270" w:name="ref-claude_code_cloud_environments"/>
+    <w:bookmarkEnd w:id="269"/>
+    <w:bookmarkStart w:id="271" w:name="ref-claude_code_cloud_environments"/>
     <w:p>
       <w:pPr>
         <w:pStyle w:val="Bibliography"/>
@@ -44831,7 +44869,7 @@
       <w:r>
         <w:t xml:space="preserve"> </w:t>
       </w:r>
-      <w:hyperlink r:id="rId269">
+      <w:hyperlink r:id="rId270">
         <w:r>
           <w:rPr>
             <w:rStyle w:val="Hyperlink"/>
@@ -44843,8 +44881,8 @@
         <w:t xml:space="preserve">.</w:t>
       </w:r>
     </w:p>
-    <w:bookmarkEnd w:id="270"/>
-    <w:bookmarkStart w:id="272" w:name="ref-claude_code_permissions"/>
+    <w:bookmarkEnd w:id="271"/>
+    <w:bookmarkStart w:id="273" w:name="ref-claude_code_permissions"/>
     <w:p>
       <w:pPr>
         <w:pStyle w:val="Bibliography"/>
@@ -44868,7 +44906,7 @@
       <w:r>
         <w:t xml:space="preserve"> </w:t>
       </w:r>
-      <w:hyperlink r:id="rId271">
+      <w:hyperlink r:id="rId272">
         <w:r>
           <w:rPr>
             <w:rStyle w:val="Hyperlink"/>
@@ -44880,8 +44918,8 @@
         <w:t xml:space="preserve">.</w:t>
       </w:r>
     </w:p>
-    <w:bookmarkEnd w:id="272"/>
-    <w:bookmarkStart w:id="274" w:name="ref-claude_code_sandboxing"/>
+    <w:bookmarkEnd w:id="273"/>
+    <w:bookmarkStart w:id="275" w:name="ref-claude_code_sandboxing"/>
     <w:p>
       <w:pPr>
         <w:pStyle w:val="Bibliography"/>
@@ -44933,7 +44971,7 @@
       <w:r>
         <w:t xml:space="preserve"> </w:t>
       </w:r>
-      <w:hyperlink r:id="rId273">
+      <w:hyperlink r:id="rId274">
         <w:r>
           <w:rPr>
             <w:rStyle w:val="Hyperlink"/>
@@ -44945,8 +44983,8 @@
         <w:t xml:space="preserve">.</w:t>
       </w:r>
     </w:p>
-    <w:bookmarkEnd w:id="274"/>
-    <w:bookmarkStart w:id="276" w:name="ref-claude_code_discover_plugins"/>
+    <w:bookmarkEnd w:id="275"/>
+    <w:bookmarkStart w:id="277" w:name="ref-claude_code_discover_plugins"/>
     <w:p>
       <w:pPr>
         <w:pStyle w:val="Bibliography"/>
@@ -44970,7 +45008,7 @@
       <w:r>
         <w:t xml:space="preserve"> </w:t>
       </w:r>
-      <w:hyperlink r:id="rId275">
+      <w:hyperlink r:id="rId276">
         <w:r>
           <w:rPr>
             <w:rStyle w:val="Hyperlink"/>
@@ -44982,8 +45020,8 @@
         <w:t xml:space="preserve">.</w:t>
       </w:r>
     </w:p>
-    <w:bookmarkEnd w:id="276"/>
-    <w:bookmarkStart w:id="278" w:name="ref-ralph_loop_plugin"/>
+    <w:bookmarkEnd w:id="277"/>
+    <w:bookmarkStart w:id="279" w:name="ref-ralph_loop_plugin"/>
     <w:p>
       <w:pPr>
         <w:pStyle w:val="Bibliography"/>
@@ -45007,7 +45045,7 @@
       <w:r>
         <w:t xml:space="preserve"> </w:t>
       </w:r>
-      <w:hyperlink r:id="rId277">
+      <w:hyperlink r:id="rId278">
         <w:r>
           <w:rPr>
             <w:rStyle w:val="Hyperlink"/>
@@ -45019,8 +45057,8 @@
         <w:t xml:space="preserve">.</w:t>
       </w:r>
     </w:p>
-    <w:bookmarkEnd w:id="278"/>
-    <w:bookmarkStart w:id="279" w:name="ref-claude_code_settings"/>
+    <w:bookmarkEnd w:id="279"/>
+    <w:bookmarkStart w:id="280" w:name="ref-claude_code_settings"/>
     <w:p>
       <w:pPr>
         <w:pStyle w:val="Bibliography"/>
@@ -45056,8 +45094,8 @@
         <w:t xml:space="preserve">.</w:t>
       </w:r>
     </w:p>
-    <w:bookmarkEnd w:id="279"/>
-    <w:bookmarkStart w:id="281" w:name="ref-coles_herdr"/>
+    <w:bookmarkEnd w:id="280"/>
+    <w:bookmarkStart w:id="282" w:name="ref-coles_herdr"/>
     <w:p>
       <w:pPr>
         <w:pStyle w:val="Bibliography"/>
@@ -45081,7 +45119,7 @@
       <w:r>
         <w:t xml:space="preserve"> </w:t>
       </w:r>
-      <w:hyperlink r:id="rId280">
+      <w:hyperlink r:id="rId281">
         <w:r>
           <w:rPr>
             <w:rStyle w:val="Hyperlink"/>
@@ -45093,8 +45131,8 @@
         <w:t xml:space="preserve">.</w:t>
       </w:r>
     </w:p>
-    <w:bookmarkEnd w:id="281"/>
-    <w:bookmarkStart w:id="283" w:name="ref-flaviocopes_herdr"/>
+    <w:bookmarkEnd w:id="282"/>
+    <w:bookmarkStart w:id="284" w:name="ref-flaviocopes_herdr"/>
     <w:p>
       <w:pPr>
         <w:pStyle w:val="Bibliography"/>
@@ -45118,7 +45156,7 @@
       <w:r>
         <w:t xml:space="preserve"> </w:t>
       </w:r>
-      <w:hyperlink r:id="rId282">
+      <w:hyperlink r:id="rId283">
         <w:r>
           <w:rPr>
             <w:rStyle w:val="Hyperlink"/>
@@ -45130,8 +45168,8 @@
         <w:t xml:space="preserve">.</w:t>
       </w:r>
     </w:p>
-    <w:bookmarkEnd w:id="283"/>
-    <w:bookmarkStart w:id="284" w:name="ref-databricks_fmapi_limits"/>
+    <w:bookmarkEnd w:id="284"/>
+    <w:bookmarkStart w:id="285" w:name="ref-databricks_fmapi_limits"/>
     <w:p>
       <w:pPr>
         <w:pStyle w:val="Bibliography"/>
@@ -45167,8 +45205,8 @@
         <w:t xml:space="preserve">.</w:t>
       </w:r>
     </w:p>
-    <w:bookmarkEnd w:id="284"/>
-    <w:bookmarkStart w:id="285" w:name="ref-databricks_supported_models"/>
+    <w:bookmarkEnd w:id="285"/>
+    <w:bookmarkStart w:id="286" w:name="ref-databricks_supported_models"/>
     <w:p>
       <w:pPr>
         <w:pStyle w:val="Bibliography"/>
@@ -45204,8 +45242,8 @@
         <w:t xml:space="preserve">.</w:t>
       </w:r>
     </w:p>
-    <w:bookmarkEnd w:id="285"/>
-    <w:bookmarkStart w:id="287" w:name="ref-herdr_hn"/>
+    <w:bookmarkEnd w:id="286"/>
+    <w:bookmarkStart w:id="288" w:name="ref-herdr_hn"/>
     <w:p>
       <w:pPr>
         <w:pStyle w:val="Bibliography"/>
@@ -45229,7 +45267,7 @@
       <w:r>
         <w:t xml:space="preserve"> </w:t>
       </w:r>
-      <w:hyperlink r:id="rId286">
+      <w:hyperlink r:id="rId287">
         <w:r>
           <w:rPr>
             <w:rStyle w:val="Hyperlink"/>
@@ -45241,8 +45279,8 @@
         <w:t xml:space="preserve">.</w:t>
       </w:r>
     </w:p>
-    <w:bookmarkEnd w:id="287"/>
-    <w:bookmarkStart w:id="289" w:name="ref-herdr_agents"/>
+    <w:bookmarkEnd w:id="288"/>
+    <w:bookmarkStart w:id="290" w:name="ref-herdr_agents"/>
     <w:p>
       <w:pPr>
         <w:pStyle w:val="Bibliography"/>
@@ -45269,7 +45307,7 @@
       <w:r>
         <w:t xml:space="preserve"> </w:t>
       </w:r>
-      <w:hyperlink r:id="rId288">
+      <w:hyperlink r:id="rId289">
         <w:r>
           <w:rPr>
             <w:rStyle w:val="Hyperlink"/>
@@ -45281,8 +45319,8 @@
         <w:t xml:space="preserve">.</w:t>
       </w:r>
     </w:p>
-    <w:bookmarkEnd w:id="289"/>
-    <w:bookmarkStart w:id="291" w:name="ref-herdr_concepts"/>
+    <w:bookmarkEnd w:id="290"/>
+    <w:bookmarkStart w:id="292" w:name="ref-herdr_concepts"/>
     <w:p>
       <w:pPr>
         <w:pStyle w:val="Bibliography"/>
@@ -45309,7 +45347,7 @@
       <w:r>
         <w:t xml:space="preserve"> </w:t>
       </w:r>
-      <w:hyperlink r:id="rId290">
+      <w:hyperlink r:id="rId291">
         <w:r>
           <w:rPr>
             <w:rStyle w:val="Hyperlink"/>
@@ -45321,8 +45359,8 @@
         <w:t xml:space="preserve">.</w:t>
       </w:r>
     </w:p>
-    <w:bookmarkEnd w:id="291"/>
-    <w:bookmarkStart w:id="293" w:name="ref-herdr_machines"/>
+    <w:bookmarkEnd w:id="292"/>
+    <w:bookmarkStart w:id="294" w:name="ref-herdr_machines"/>
     <w:p>
       <w:pPr>
         <w:pStyle w:val="Bibliography"/>
@@ -45349,7 +45387,7 @@
       <w:r>
         <w:t xml:space="preserve"> </w:t>
       </w:r>
-      <w:hyperlink r:id="rId292">
+      <w:hyperlink r:id="rId293">
         <w:r>
           <w:rPr>
             <w:rStyle w:val="Hyperlink"/>
@@ -45361,8 +45399,8 @@
         <w:t xml:space="preserve">.</w:t>
       </w:r>
     </w:p>
-    <w:bookmarkEnd w:id="293"/>
-    <w:bookmarkStart w:id="294" w:name="ref-herdr_agent_guide"/>
+    <w:bookmarkEnd w:id="294"/>
+    <w:bookmarkStart w:id="295" w:name="ref-herdr_agent_guide"/>
     <w:p>
       <w:pPr>
         <w:pStyle w:val="Bibliography"/>
@@ -45401,8 +45439,8 @@
         <w:t xml:space="preserve">.</w:t>
       </w:r>
     </w:p>
-    <w:bookmarkEnd w:id="294"/>
-    <w:bookmarkStart w:id="295" w:name="ref-herdr"/>
+    <w:bookmarkEnd w:id="295"/>
+    <w:bookmarkStart w:id="296" w:name="ref-herdr"/>
     <w:p>
       <w:pPr>
         <w:pStyle w:val="Bibliography"/>
@@ -45441,8 +45479,8 @@
         <w:t xml:space="preserve">.</w:t>
       </w:r>
     </w:p>
-    <w:bookmarkEnd w:id="295"/>
-    <w:bookmarkStart w:id="296" w:name="ref-herdr_github"/>
+    <w:bookmarkEnd w:id="296"/>
+    <w:bookmarkStart w:id="297" w:name="ref-herdr_github"/>
     <w:p>
       <w:pPr>
         <w:pStyle w:val="Bibliography"/>
@@ -45481,8 +45519,8 @@
         <w:t xml:space="preserve">.</w:t>
       </w:r>
     </w:p>
-    <w:bookmarkEnd w:id="296"/>
-    <w:bookmarkStart w:id="298" w:name="ref-herdr_install"/>
+    <w:bookmarkEnd w:id="297"/>
+    <w:bookmarkStart w:id="299" w:name="ref-herdr_install"/>
     <w:p>
       <w:pPr>
         <w:pStyle w:val="Bibliography"/>
@@ -45509,7 +45547,7 @@
       <w:r>
         <w:t xml:space="preserve"> </w:t>
       </w:r>
-      <w:hyperlink r:id="rId297">
+      <w:hyperlink r:id="rId298">
         <w:r>
           <w:rPr>
             <w:rStyle w:val="Hyperlink"/>
@@ -45521,8 +45559,8 @@
         <w:t xml:space="preserve">.</w:t>
       </w:r>
     </w:p>
-    <w:bookmarkEnd w:id="298"/>
-    <w:bookmarkStart w:id="300" w:name="ref-herdr_session_state"/>
+    <w:bookmarkEnd w:id="299"/>
+    <w:bookmarkStart w:id="301" w:name="ref-herdr_session_state"/>
     <w:p>
       <w:pPr>
         <w:pStyle w:val="Bibliography"/>
@@ -45549,7 +45587,7 @@
       <w:r>
         <w:t xml:space="preserve"> </w:t>
       </w:r>
-      <w:hyperlink r:id="rId299">
+      <w:hyperlink r:id="rId300">
         <w:r>
           <w:rPr>
             <w:rStyle w:val="Hyperlink"/>
@@ -45561,8 +45599,8 @@
         <w:t xml:space="preserve">.</w:t>
       </w:r>
     </w:p>
-    <w:bookmarkEnd w:id="300"/>
-    <w:bookmarkStart w:id="302" w:name="ref-herdr_socket_api"/>
+    <w:bookmarkEnd w:id="301"/>
+    <w:bookmarkStart w:id="303" w:name="ref-herdr_socket_api"/>
     <w:p>
       <w:pPr>
         <w:pStyle w:val="Bibliography"/>
@@ -45589,7 +45627,7 @@
       <w:r>
         <w:t xml:space="preserve"> </w:t>
       </w:r>
-      <w:hyperlink r:id="rId301">
+      <w:hyperlink r:id="rId302">
         <w:r>
           <w:rPr>
             <w:rStyle w:val="Hyperlink"/>
@@ -45601,8 +45639,8 @@
         <w:t xml:space="preserve">.</w:t>
       </w:r>
     </w:p>
-    <w:bookmarkEnd w:id="302"/>
-    <w:bookmarkStart w:id="304" w:name="ref-ghuntley_ralph"/>
+    <w:bookmarkEnd w:id="303"/>
+    <w:bookmarkStart w:id="305" w:name="ref-ghuntley_ralph"/>
     <w:p>
       <w:pPr>
         <w:pStyle w:val="Bibliography"/>
@@ -45626,7 +45664,7 @@
       <w:r>
         <w:t xml:space="preserve"> </w:t>
       </w:r>
-      <w:hyperlink r:id="rId303">
+      <w:hyperlink r:id="rId304">
         <w:r>
           <w:rPr>
             <w:rStyle w:val="Hyperlink"/>
@@ -45638,8 +45676,8 @@
         <w:t xml:space="preserve">.</w:t>
       </w:r>
     </w:p>
-    <w:bookmarkEnd w:id="304"/>
-    <w:bookmarkStart w:id="306" w:name="ref-awesome_herdr"/>
+    <w:bookmarkEnd w:id="305"/>
+    <w:bookmarkStart w:id="307" w:name="ref-awesome_herdr"/>
     <w:p>
       <w:pPr>
         <w:pStyle w:val="Bibliography"/>
@@ -45663,7 +45701,7 @@
       <w:r>
         <w:t xml:space="preserve"> </w:t>
       </w:r>
-      <w:hyperlink r:id="rId305">
+      <w:hyperlink r:id="rId306">
         <w:r>
           <w:rPr>
             <w:rStyle w:val="Hyperlink"/>
@@ -45675,8 +45713,8 @@
         <w:t xml:space="preserve">.</w:t>
       </w:r>
     </w:p>
-    <w:bookmarkEnd w:id="306"/>
-    <w:bookmarkStart w:id="307" w:name="ref-ai_config_readme"/>
+    <w:bookmarkEnd w:id="307"/>
+    <w:bookmarkStart w:id="308" w:name="ref-ai_config_readme"/>
     <w:p>
       <w:pPr>
         <w:pStyle w:val="Bibliography"/>
@@ -45712,8 +45750,8 @@
         <w:t xml:space="preserve">.</w:t>
       </w:r>
     </w:p>
-    <w:bookmarkEnd w:id="307"/>
-    <w:bookmarkStart w:id="309" w:name="ref-ai_config_delegate_to_codex"/>
+    <w:bookmarkEnd w:id="308"/>
+    <w:bookmarkStart w:id="310" w:name="ref-ai_config_delegate_to_codex"/>
     <w:p>
       <w:pPr>
         <w:pStyle w:val="Bibliography"/>
@@ -45751,7 +45789,7 @@
       <w:r>
         <w:t xml:space="preserve"> </w:t>
       </w:r>
-      <w:hyperlink r:id="rId308">
+      <w:hyperlink r:id="rId309">
         <w:r>
           <w:rPr>
             <w:rStyle w:val="Hyperlink"/>
@@ -45763,8 +45801,8 @@
         <w:t xml:space="preserve">.</w:t>
       </w:r>
     </w:p>
-    <w:bookmarkEnd w:id="309"/>
-    <w:bookmarkStart w:id="311" w:name="ref-stats_allowlist_pr6"/>
+    <w:bookmarkEnd w:id="310"/>
+    <w:bookmarkStart w:id="312" w:name="ref-stats_allowlist_pr6"/>
     <w:p>
       <w:pPr>
         <w:pStyle w:val="Bibliography"/>
@@ -45788,7 +45826,7 @@
       <w:r>
         <w:t xml:space="preserve"> </w:t>
       </w:r>
-      <w:hyperlink r:id="rId310">
+      <w:hyperlink r:id="rId311">
         <w:r>
           <w:rPr>
             <w:rStyle w:val="Hyperlink"/>
@@ -45800,8 +45838,8 @@
         <w:t xml:space="preserve">.</w:t>
       </w:r>
     </w:p>
-    <w:bookmarkEnd w:id="311"/>
-    <w:bookmarkStart w:id="312" w:name="ref-stats_allowlist"/>
+    <w:bookmarkEnd w:id="312"/>
+    <w:bookmarkStart w:id="313" w:name="ref-stats_allowlist"/>
     <w:p>
       <w:pPr>
         <w:pStyle w:val="Bibliography"/>
@@ -45837,8 +45875,8 @@
         <w:t xml:space="preserve">.</w:t>
       </w:r>
     </w:p>
-    <w:bookmarkEnd w:id="312"/>
-    <w:bookmarkStart w:id="313" w:name="ref-codex_plugin_cc"/>
+    <w:bookmarkEnd w:id="313"/>
+    <w:bookmarkStart w:id="314" w:name="ref-codex_plugin_cc"/>
     <w:p>
       <w:pPr>
         <w:pStyle w:val="Bibliography"/>
@@ -45888,8 +45926,8 @@
         <w:t xml:space="preserve">.</w:t>
       </w:r>
     </w:p>
-    <w:bookmarkEnd w:id="313"/>
-    <w:bookmarkStart w:id="315" w:name="ref-codex_pricing"/>
+    <w:bookmarkEnd w:id="314"/>
+    <w:bookmarkStart w:id="316" w:name="ref-codex_pricing"/>
     <w:p>
       <w:pPr>
         <w:pStyle w:val="Bibliography"/>
@@ -45913,7 +45951,7 @@
       <w:r>
         <w:t xml:space="preserve"> </w:t>
       </w:r>
-      <w:hyperlink r:id="rId314">
+      <w:hyperlink r:id="rId315">
         <w:r>
           <w:rPr>
             <w:rStyle w:val="Hyperlink"/>
@@ -45925,8 +45963,8 @@
         <w:t xml:space="preserve">.</w:t>
       </w:r>
     </w:p>
-    <w:bookmarkEnd w:id="315"/>
-    <w:bookmarkStart w:id="316" w:name="ref-posit_dev_ai_lib"/>
+    <w:bookmarkEnd w:id="316"/>
+    <w:bookmarkStart w:id="317" w:name="ref-posit_dev_ai_lib"/>
     <w:p>
       <w:pPr>
         <w:pStyle w:val="Bibliography"/>
@@ -45962,8 +46000,8 @@
         <w:t xml:space="preserve">.</w:t>
       </w:r>
     </w:p>
-    <w:bookmarkEnd w:id="316"/>
-    <w:bookmarkStart w:id="317" w:name="ref-posit_dev_assistant_feedback"/>
+    <w:bookmarkEnd w:id="317"/>
+    <w:bookmarkStart w:id="318" w:name="ref-posit_dev_assistant_feedback"/>
     <w:p>
       <w:pPr>
         <w:pStyle w:val="Bibliography"/>
@@ -45999,8 +46037,8 @@
         <w:t xml:space="preserve">.</w:t>
       </w:r>
     </w:p>
-    <w:bookmarkEnd w:id="317"/>
-    <w:bookmarkStart w:id="318" w:name="ref-posit_dev_bluffbench2"/>
+    <w:bookmarkEnd w:id="318"/>
+    <w:bookmarkStart w:id="319" w:name="ref-posit_dev_bluffbench2"/>
     <w:p>
       <w:pPr>
         <w:pStyle w:val="Bibliography"/>
@@ -46036,8 +46074,8 @@
         <w:t xml:space="preserve">.</w:t>
       </w:r>
     </w:p>
-    <w:bookmarkEnd w:id="318"/>
-    <w:bookmarkStart w:id="319" w:name="ref-posit_dev_btw"/>
+    <w:bookmarkEnd w:id="319"/>
+    <w:bookmarkStart w:id="320" w:name="ref-posit_dev_btw"/>
     <w:p>
       <w:pPr>
         <w:pStyle w:val="Bibliography"/>
@@ -46073,8 +46111,8 @@
         <w:t xml:space="preserve">.</w:t>
       </w:r>
     </w:p>
-    <w:bookmarkEnd w:id="319"/>
-    <w:bookmarkStart w:id="320" w:name="ref-posit_dev_chatlas"/>
+    <w:bookmarkEnd w:id="320"/>
+    <w:bookmarkStart w:id="321" w:name="ref-posit_dev_chatlas"/>
     <w:p>
       <w:pPr>
         <w:pStyle w:val="Bibliography"/>
@@ -46110,8 +46148,8 @@
         <w:t xml:space="preserve">.</w:t>
       </w:r>
     </w:p>
-    <w:bookmarkEnd w:id="320"/>
-    <w:bookmarkStart w:id="321" w:name="ref-posit_dev_code_index"/>
+    <w:bookmarkEnd w:id="321"/>
+    <w:bookmarkStart w:id="322" w:name="ref-posit_dev_code_index"/>
     <w:p>
       <w:pPr>
         <w:pStyle w:val="Bibliography"/>
@@ -46147,8 +46185,8 @@
         <w:t xml:space="preserve">.</w:t>
       </w:r>
     </w:p>
-    <w:bookmarkEnd w:id="321"/>
-    <w:bookmarkStart w:id="322" w:name="ref-posit_dev_commons"/>
+    <w:bookmarkEnd w:id="322"/>
+    <w:bookmarkStart w:id="323" w:name="ref-posit_dev_commons"/>
     <w:p>
       <w:pPr>
         <w:pStyle w:val="Bibliography"/>
@@ -46184,8 +46222,8 @@
         <w:t xml:space="preserve">.</w:t>
       </w:r>
     </w:p>
-    <w:bookmarkEnd w:id="322"/>
-    <w:bookmarkStart w:id="323" w:name="ref-posit_dev_mcp_repl"/>
+    <w:bookmarkEnd w:id="323"/>
+    <w:bookmarkStart w:id="324" w:name="ref-posit_dev_mcp_repl"/>
     <w:p>
       <w:pPr>
         <w:pStyle w:val="Bibliography"/>
@@ -46221,8 +46259,8 @@
         <w:t xml:space="preserve">.</w:t>
       </w:r>
     </w:p>
-    <w:bookmarkEnd w:id="323"/>
-    <w:bookmarkStart w:id="324" w:name="ref-posit_dev_mcptools"/>
+    <w:bookmarkEnd w:id="324"/>
+    <w:bookmarkStart w:id="325" w:name="ref-posit_dev_mcptools"/>
     <w:p>
       <w:pPr>
         <w:pStyle w:val="Bibliography"/>
@@ -46258,8 +46296,8 @@
         <w:t xml:space="preserve">.</w:t>
       </w:r>
     </w:p>
-    <w:bookmarkEnd w:id="324"/>
-    <w:bookmarkStart w:id="325" w:name="ref-posit_dev_nesevals"/>
+    <w:bookmarkEnd w:id="325"/>
+    <w:bookmarkStart w:id="326" w:name="ref-posit_dev_nesevals"/>
     <w:p>
       <w:pPr>
         <w:pStyle w:val="Bibliography"/>
@@ -46295,8 +46333,8 @@
         <w:t xml:space="preserve">.</w:t>
       </w:r>
     </w:p>
-    <w:bookmarkEnd w:id="325"/>
-    <w:bookmarkStart w:id="326" w:name="ref-posit_dev_positron"/>
+    <w:bookmarkEnd w:id="326"/>
+    <w:bookmarkStart w:id="327" w:name="ref-posit_dev_positron"/>
     <w:p>
       <w:pPr>
         <w:pStyle w:val="Bibliography"/>
@@ -46332,8 +46370,8 @@
         <w:t xml:space="preserve">.</w:t>
       </w:r>
     </w:p>
-    <w:bookmarkEnd w:id="326"/>
-    <w:bookmarkStart w:id="327" w:name="ref-posit_dev_positron_copilot_chat"/>
+    <w:bookmarkEnd w:id="327"/>
+    <w:bookmarkStart w:id="328" w:name="ref-posit_dev_positron_copilot_chat"/>
     <w:p>
       <w:pPr>
         <w:pStyle w:val="Bibliography"/>
@@ -46369,8 +46407,8 @@
         <w:t xml:space="preserve">.</w:t>
       </w:r>
     </w:p>
-    <w:bookmarkEnd w:id="327"/>
-    <w:bookmarkStart w:id="328" w:name="ref-posit_dev_querychat"/>
+    <w:bookmarkEnd w:id="328"/>
+    <w:bookmarkStart w:id="329" w:name="ref-posit_dev_querychat"/>
     <w:p>
       <w:pPr>
         <w:pStyle w:val="Bibliography"/>
@@ -46406,8 +46444,8 @@
         <w:t xml:space="preserve">.</w:t>
       </w:r>
     </w:p>
-    <w:bookmarkEnd w:id="328"/>
-    <w:bookmarkStart w:id="329" w:name="ref-posit_dev_raghilda"/>
+    <w:bookmarkEnd w:id="329"/>
+    <w:bookmarkStart w:id="330" w:name="ref-posit_dev_raghilda"/>
     <w:p>
       <w:pPr>
         <w:pStyle w:val="Bibliography"/>
@@ -46443,8 +46481,8 @@
         <w:t xml:space="preserve">.</w:t>
       </w:r>
     </w:p>
-    <w:bookmarkEnd w:id="329"/>
-    <w:bookmarkStart w:id="330" w:name="ref-posit_dev_shiny_assistant"/>
+    <w:bookmarkEnd w:id="330"/>
+    <w:bookmarkStart w:id="331" w:name="ref-posit_dev_shiny_assistant"/>
     <w:p>
       <w:pPr>
         <w:pStyle w:val="Bibliography"/>
@@ -46480,8 +46518,8 @@
         <w:t xml:space="preserve">.</w:t>
       </w:r>
     </w:p>
-    <w:bookmarkEnd w:id="330"/>
-    <w:bookmarkStart w:id="331" w:name="ref-posit_dev_shinychat"/>
+    <w:bookmarkEnd w:id="331"/>
+    <w:bookmarkStart w:id="332" w:name="ref-posit_dev_shinychat"/>
     <w:p>
       <w:pPr>
         <w:pStyle w:val="Bibliography"/>
@@ -46517,8 +46555,8 @@
         <w:t xml:space="preserve">.</w:t>
       </w:r>
     </w:p>
-    <w:bookmarkEnd w:id="331"/>
-    <w:bookmarkStart w:id="332" w:name="ref-posit_dev_shinyrealtime"/>
+    <w:bookmarkEnd w:id="332"/>
+    <w:bookmarkStart w:id="333" w:name="ref-posit_dev_shinyrealtime"/>
     <w:p>
       <w:pPr>
         <w:pStyle w:val="Bibliography"/>
@@ -46554,8 +46592,8 @@
         <w:t xml:space="preserve">.</w:t>
       </w:r>
     </w:p>
-    <w:bookmarkEnd w:id="332"/>
-    <w:bookmarkStart w:id="334" w:name="ref-tessl_docs_core_concepts"/>
+    <w:bookmarkEnd w:id="333"/>
+    <w:bookmarkStart w:id="335" w:name="ref-tessl_docs_core_concepts"/>
     <w:p>
       <w:pPr>
         <w:pStyle w:val="Bibliography"/>
@@ -46579,7 +46617,7 @@
       <w:r>
         <w:t xml:space="preserve"> </w:t>
       </w:r>
-      <w:hyperlink r:id="rId333">
+      <w:hyperlink r:id="rId334">
         <w:r>
           <w:rPr>
             <w:rStyle w:val="Hyperlink"/>
@@ -46591,8 +46629,8 @@
         <w:t xml:space="preserve">.</w:t>
       </w:r>
     </w:p>
-    <w:bookmarkEnd w:id="334"/>
-    <w:bookmarkStart w:id="336" w:name="ref-tessl_docs_installation"/>
+    <w:bookmarkEnd w:id="335"/>
+    <w:bookmarkStart w:id="337" w:name="ref-tessl_docs_installation"/>
     <w:p>
       <w:pPr>
         <w:pStyle w:val="Bibliography"/>
@@ -46616,7 +46654,7 @@
       <w:r>
         <w:t xml:space="preserve"> </w:t>
       </w:r>
-      <w:hyperlink r:id="rId335">
+      <w:hyperlink r:id="rId336">
         <w:r>
           <w:rPr>
             <w:rStyle w:val="Hyperlink"/>
@@ -46628,8 +46666,8 @@
         <w:t xml:space="preserve">.</w:t>
       </w:r>
     </w:p>
-    <w:bookmarkEnd w:id="336"/>
-    <w:bookmarkStart w:id="338" w:name="ref-tessl_docs_security"/>
+    <w:bookmarkEnd w:id="337"/>
+    <w:bookmarkStart w:id="339" w:name="ref-tessl_docs_security"/>
     <w:p>
       <w:pPr>
         <w:pStyle w:val="Bibliography"/>
@@ -46653,7 +46691,7 @@
       <w:r>
         <w:t xml:space="preserve"> </w:t>
       </w:r>
-      <w:hyperlink r:id="rId337">
+      <w:hyperlink r:id="rId338">
         <w:r>
           <w:rPr>
             <w:rStyle w:val="Hyperlink"/>
@@ -46665,8 +46703,8 @@
         <w:t xml:space="preserve">.</w:t>
       </w:r>
     </w:p>
-    <w:bookmarkEnd w:id="338"/>
-    <w:bookmarkStart w:id="340" w:name="ref-tessl_docs_usage_data"/>
+    <w:bookmarkEnd w:id="339"/>
+    <w:bookmarkStart w:id="341" w:name="ref-tessl_docs_usage_data"/>
     <w:p>
       <w:pPr>
         <w:pStyle w:val="Bibliography"/>
@@ -46690,7 +46728,7 @@
       <w:r>
         <w:t xml:space="preserve"> </w:t>
       </w:r>
-      <w:hyperlink r:id="rId339">
+      <w:hyperlink r:id="rId340">
         <w:r>
           <w:rPr>
             <w:rStyle w:val="Hyperlink"/>
@@ -46702,8 +46740,8 @@
         <w:t xml:space="preserve">.</w:t>
       </w:r>
     </w:p>
-    <w:bookmarkEnd w:id="340"/>
-    <w:bookmarkStart w:id="342" w:name="ref-tessl_docs_supported_platforms"/>
+    <w:bookmarkEnd w:id="341"/>
+    <w:bookmarkStart w:id="343" w:name="ref-tessl_docs_supported_platforms"/>
     <w:p>
       <w:pPr>
         <w:pStyle w:val="Bibliography"/>
@@ -46727,7 +46765,7 @@
       <w:r>
         <w:t xml:space="preserve"> </w:t>
       </w:r>
-      <w:hyperlink r:id="rId341">
+      <w:hyperlink r:id="rId342">
         <w:r>
           <w:rPr>
             <w:rStyle w:val="Hyperlink"/>
@@ -46739,8 +46777,8 @@
         <w:t xml:space="preserve">.</w:t>
       </w:r>
     </w:p>
-    <w:bookmarkEnd w:id="342"/>
-    <w:bookmarkStart w:id="344" w:name="ref-tessl_docs_faqs"/>
+    <w:bookmarkEnd w:id="343"/>
+    <w:bookmarkStart w:id="345" w:name="ref-tessl_docs_faqs"/>
     <w:p>
       <w:pPr>
         <w:pStyle w:val="Bibliography"/>
@@ -46764,7 +46802,7 @@
       <w:r>
         <w:t xml:space="preserve"> </w:t>
       </w:r>
-      <w:hyperlink r:id="rId343">
+      <w:hyperlink r:id="rId344">
         <w:r>
           <w:rPr>
             <w:rStyle w:val="Hyperlink"/>
@@ -46776,8 +46814,8 @@
         <w:t xml:space="preserve">.</w:t>
       </w:r>
     </w:p>
-    <w:bookmarkEnd w:id="344"/>
-    <w:bookmarkStart w:id="346" w:name="ref-tessl_pricing"/>
+    <w:bookmarkEnd w:id="345"/>
+    <w:bookmarkStart w:id="347" w:name="ref-tessl_pricing"/>
     <w:p>
       <w:pPr>
         <w:pStyle w:val="Bibliography"/>
@@ -46801,7 +46839,7 @@
       <w:r>
         <w:t xml:space="preserve"> </w:t>
       </w:r>
-      <w:hyperlink r:id="rId345">
+      <w:hyperlink r:id="rId346">
         <w:r>
           <w:rPr>
             <w:rStyle w:val="Hyperlink"/>
@@ -46813,8 +46851,8 @@
         <w:t xml:space="preserve">.</w:t>
       </w:r>
     </w:p>
-    <w:bookmarkEnd w:id="346"/>
-    <w:bookmarkStart w:id="348" w:name="ref-tessl_registry"/>
+    <w:bookmarkEnd w:id="347"/>
+    <w:bookmarkStart w:id="349" w:name="ref-tessl_registry"/>
     <w:p>
       <w:pPr>
         <w:pStyle w:val="Bibliography"/>
@@ -46838,7 +46876,7 @@
       <w:r>
         <w:t xml:space="preserve"> </w:t>
       </w:r>
-      <w:hyperlink r:id="rId347">
+      <w:hyperlink r:id="rId348">
         <w:r>
           <w:rPr>
             <w:rStyle w:val="Hyperlink"/>
@@ -46850,8 +46888,8 @@
         <w:t xml:space="preserve">.</w:t>
       </w:r>
     </w:p>
-    <w:bookmarkEnd w:id="348"/>
-    <w:bookmarkStart w:id="349" w:name="ref-tessl_home"/>
+    <w:bookmarkEnd w:id="349"/>
+    <w:bookmarkStart w:id="350" w:name="ref-tessl_home"/>
     <w:p>
       <w:pPr>
         <w:pStyle w:val="Bibliography"/>
@@ -46887,8 +46925,8 @@
         <w:t xml:space="preserve">.</w:t>
       </w:r>
     </w:p>
-    <w:bookmarkEnd w:id="349"/>
-    <w:bookmarkStart w:id="351" w:name="ref-tessl_docs_package_manager"/>
+    <w:bookmarkEnd w:id="350"/>
+    <w:bookmarkStart w:id="352" w:name="ref-tessl_docs_package_manager"/>
     <w:p>
       <w:pPr>
         <w:pStyle w:val="Bibliography"/>
@@ -46912,7 +46950,7 @@
       <w:r>
         <w:t xml:space="preserve"> </w:t>
       </w:r>
-      <w:hyperlink r:id="rId350">
+      <w:hyperlink r:id="rId351">
         <w:r>
           <w:rPr>
             <w:rStyle w:val="Hyperlink"/>
@@ -46924,8 +46962,8 @@
         <w:t xml:space="preserve">.</w:t>
       </w:r>
     </w:p>
-    <w:bookmarkEnd w:id="351"/>
-    <w:bookmarkStart w:id="353" w:name="ref-tessl_docs_overview"/>
+    <w:bookmarkEnd w:id="352"/>
+    <w:bookmarkStart w:id="354" w:name="ref-tessl_docs_overview"/>
     <w:p>
       <w:pPr>
         <w:pStyle w:val="Bibliography"/>
@@ -46949,7 +46987,7 @@
       <w:r>
         <w:t xml:space="preserve"> </w:t>
       </w:r>
-      <w:hyperlink r:id="rId352">
+      <w:hyperlink r:id="rId353">
         <w:r>
           <w:rPr>
             <w:rStyle w:val="Hyperlink"/>
@@ -46961,8 +46999,8 @@
         <w:t xml:space="preserve">.</w:t>
       </w:r>
     </w:p>
-    <w:bookmarkEnd w:id="353"/>
-    <w:bookmarkStart w:id="354" w:name="ref-obra_superpowers"/>
+    <w:bookmarkEnd w:id="354"/>
+    <w:bookmarkStart w:id="355" w:name="ref-obra_superpowers"/>
     <w:p>
       <w:pPr>
         <w:pStyle w:val="Bibliography"/>
@@ -46998,8 +47036,8 @@
         <w:t xml:space="preserve">.</w:t>
       </w:r>
     </w:p>
-    <w:bookmarkEnd w:id="354"/>
-    <w:bookmarkStart w:id="356" w:name="ref-herdr_yc"/>
+    <w:bookmarkEnd w:id="355"/>
+    <w:bookmarkStart w:id="357" w:name="ref-herdr_yc"/>
     <w:p>
       <w:pPr>
         <w:pStyle w:val="Bibliography"/>
@@ -47023,7 +47061,7 @@
       <w:r>
         <w:t xml:space="preserve"> </w:t>
       </w:r>
-      <w:hyperlink r:id="rId355">
+      <w:hyperlink r:id="rId356">
         <w:r>
           <w:rPr>
             <w:rStyle w:val="Hyperlink"/>
@@ -47035,9 +47073,9 @@
         <w:t xml:space="preserve">.</w:t>
       </w:r>
     </w:p>
-    <w:bookmarkEnd w:id="356"/>
     <w:bookmarkEnd w:id="357"/>
     <w:bookmarkEnd w:id="358"/>
+    <w:bookmarkEnd w:id="359"/>
     <w:sectPr>
       <w:footnotePr>
         <w:numRestart w:val="eachSect"/>

</xml_diff>